<commit_message>
docs(business-questions): no woreda or town singled out as a demo site
Co-Authored-By: Claude Opus 5.5 <noreply@anthropic.com>
Claude-Session: https://claude.ai/code/session_015s8K9PXZTrFfQKCLVZhoeJ
</commit_message>
<xml_diff>
--- a/docs/business-questions/ITRMS-business-questions-am.docx
+++ b/docs/business-questions/ITRMS-business-questions-am.docx
@@ -669,7 +669,7 @@
         <w:rPr>
           <w:rFonts w:ascii="Nyala" w:cs="Nyala" w:eastAsia="Nyala" w:hAnsi="Nyala"/>
         </w:rPr>
-        <w:t xml:space="preserve">የመጀመሪያው ማሳያ (Demo) የአዲስ መንጃ ፈቃድና የመንጃ ፈቃድ ዕድሳት አገልግሎቶችን በዳሞት ጋሌ ወረዳ፣ በቦዲቲ ከተማ አስተዳደርና በዞኑ መምሪያ መካከል ያሳያል። "ከፍተኛ" ቅድሚያ የተሰጣቸው ጥያቄዎች ለዚህ ማሳያ አስፈላጊ ናቸው።</w:t>
+        <w:t xml:space="preserve">የመጀመሪያው ማሳያ (Demo) የአዲስ መንጃ ፈቃድና የመንጃ ፈቃድ ዕድሳት አገልግሎቶችን በዞኑ መምሪያ፣ በከተማ አስተዳደርና በወረዳ ጽ/ቤት መካከል ያሳያል። "ከፍተኛ" ቅድሚያ የተሰጣቸው ጥያቄዎች ለዚህ ማሳያ አስፈላጊ ናቸው።</w:t>
       </w:r>
     </w:p>
     <w:p>
@@ -5122,7 +5122,7 @@
         <w:rPr>
           <w:rFonts w:ascii="Nyala" w:cs="Nyala" w:eastAsia="Nyala" w:hAnsi="Nyala"/>
         </w:rPr>
-        <w:t xml:space="preserve">ከፎርም ቁጥር 15 ሰነዶች እንደተረዳነው፦ የዞኑ መምሪያና የቦዲቲ ከተማ አስተዳደር (ፈርጅ 1) የራሳቸው የአሽከርካሪና ተሽከርካሪ ብቃት ማረጋገጫ ቡድን (ቡድን መሪ፣ የፈቃድ አሰጣጥና ቁጥጥር ባለሙያዎች፣ የተሽከርካሪ ምርመራ ባለሙያ) አላቸው፤ የቦዲቲ ከተማ የዕለት ገንዘብ ሰብሳቢዎችም አሏት። የዳሞት ጋሌ ወረዳ ጽ/ቤት (ምድብ 1) ግን የብቃት ማረጋገጫ ባለሙያ የለውም። ስለዚህ እንደሚከተለው ገምተናል፦ የመንጃ ፈቃድና የተሽከርካሪ አገልግሎቶችን የዞኑ መምሪያና የብቃት ማረጋገጫ ቡድን ያላቸው ከተሞች ይሰጣሉ፤ ወረዳዎች አይሰጡም፤ ክልሉ መንጃ ፈቃዱን ያትማል።</w:t>
+        <w:t xml:space="preserve">ከፎርም ቁጥር 15 ሰነዶች እንደተረዳነው፦ የዞኑ መምሪያና ፈርጅ 1 የከተማ አስተዳደሮች የራሳቸው የአሽከርካሪና ተሽከርካሪ ብቃት ማረጋገጫ ቡድን (ቡድን መሪ፣ የፈቃድ አሰጣጥና ቁጥጥር ባለሙያዎች፣ የተሽከርካሪ ምርመራ ባለሙያ) አላቸው፤ የዕለት ገንዘብ ሰብሳቢዎችም አሏቸው። የምድብ 1 ወረዳ ጽ/ቤቶች ግን የብቃት ማረጋገጫ ባለሙያ የላቸውም። ስለዚህ እንደሚከተለው ገምተናል፦ የመንጃ ፈቃድና የተሽከርካሪ አገልግሎቶችን የዞኑ መምሪያና የብቃት ማረጋገጫ ቡድን ያላቸው ከተሞች ይሰጣሉ፤ ወረዳዎች አይሰጡም፤ ክልሉ መንጃ ፈቃዱን ያትማል።</w:t>
       </w:r>
     </w:p>
     <w:p>
@@ -10607,7 +10607,7 @@
         <w:rPr>
           <w:rFonts w:ascii="Nyala" w:cs="Nyala" w:eastAsia="Nyala" w:hAnsi="Nyala"/>
         </w:rPr>
-        <w:t xml:space="preserve">ከዞኑ መምሪያ፣ ከቦዲቲ ከተማና ከዳሞት ጋሌ ወረዳ በተጨማሪ የሙከራ ትግበራ የሚጀመርባቸው ጽ/ቤቶች የትኞቹ ይሁኑ?</w:t>
+        <w:t xml:space="preserve">ከዞኑ መምሪያ በተጨማሪ የሙከራ ትግበራ የሚጀመርባቸው ጽ/ቤቶች (ከተማ አስተዳደሮችና ወረዳዎች) የትኞቹ ይሁኑ?</w:t>
       </w:r>
     </w:p>
     <w:p>
@@ -12717,7 +12717,7 @@
                 <w:b w:val="false"/>
                 <w:bCs w:val="false"/>
               </w:rPr>
-              <w:t xml:space="preserve">ምድብ 1 *</w:t>
+              <w:t xml:space="preserve"/>
             </w:r>
           </w:p>
         </w:tc>
@@ -14509,7 +14509,7 @@
                 <w:b w:val="false"/>
                 <w:bCs w:val="false"/>
               </w:rPr>
-              <w:t xml:space="preserve">ፈርጅ 1 *</w:t>
+              <w:t xml:space="preserve"/>
             </w:r>
           </w:p>
         </w:tc>

</xml_diff>

<commit_message>
docs(business-questions): on the company letterhead; the Wolaytta translation and ICT questions left out
24 questions, numbered by their place so every reference follows; the
annexes re-lettered (the Wolaytta months and days annex went with its
question); the letterhead on the title page and the cover letter, the
logo mark in the other pages' header.

Co-Authored-By: Claude Opus 5.5 <noreply@anthropic.com>
Claude-Session: https://claude.ai/code/session_015s8K9PXZTrFfQKCLVZhoeJ
</commit_message>
<xml_diff>
--- a/docs/business-questions/ITRMS-business-questions-am.docx
+++ b/docs/business-questions/ITRMS-business-questions-am.docx
@@ -518,7 +518,7 @@
         <w:rPr>
           <w:rFonts w:ascii="Nyala" w:cs="Nyala" w:eastAsia="Nyala" w:hAnsi="Nyala"/>
         </w:rPr>
-        <w:t xml:space="preserve">በመሆኑም ጥያቄዎቹ ለሚመለከታቸው የሥራ ክፍሎች ተመርተው፣ ምላሹ ከተጠየቁት ቅጾችና ሰነዶች ጋር በሰነዱ ፊት ለፊት በተጠቀሰው ቀን እንዲላክልን በአክብሮት እንጠይቃለን። "ከፍተኛ" ቅድሚያ የተሰጣቸው ጥያቄዎች (በማጠቃለያ ሠንጠረዡ ይመልከቱ) ቀድመው ቢመለሱ የመጀመሪያው ማሳያ በጊዜ እንዲዘጋጅ ያግዛል። እንዲሁም ፕሮጀክቱን ከመምሪያው በኩል የሚያስተባብር ባለሙያ እንዲሰየምልን እንጠይቃለን (ጥያቄ 24)።</w:t>
+        <w:t xml:space="preserve">በመሆኑም ጥያቄዎቹ ለሚመለከታቸው የሥራ ክፍሎች ተመርተው፣ ምላሹ ከተጠየቁት ቅጾችና ሰነዶች ጋር በሰነዱ ፊት ለፊት በተጠቀሰው ቀን እንዲላክልን በአክብሮት እንጠይቃለን። "ከፍተኛ" ቅድሚያ የተሰጣቸው ጥያቄዎች (በማጠቃለያ ሠንጠረዡ ይመልከቱ) ቀድመው ቢመለሱ የመጀመሪያው ማሳያ በጊዜ እንዲዘጋጅ ያግዛል። እንዲሁም ፕሮጀክቱን ከመምሪያው በኩል የሚያስተባብር ባለሙያ እንዲሰየምልን እንጠይቃለን (ጥያቄ 22)።</w:t>
       </w:r>
     </w:p>
     <w:p>
@@ -625,7 +625,14 @@
     </w:p>
     <w:p>
       <w:pPr>
-        <w:pageBreakBefore/>
+        <w:sectPr>
+          <w:headerReference w:type="default" r:id="rId6"/>
+          <w:footerReference w:type="default" r:id="rId7"/>
+          <w:pgSz w:w="11906" w:h="16838" w:orient="portrait"/>
+          <w:pgMar w:top="1134" w:right="1134" w:bottom="1134" w:left="1134" w:header="708" w:footer="708" w:gutter="0"/>
+          <w:pgNumType/>
+          <w:docGrid w:linePitch="360"/>
+        </w:sectPr>
       </w:pPr>
     </w:p>
     <w:p>
@@ -658,7 +665,7 @@
         <w:rPr>
           <w:rFonts w:ascii="Nyala" w:cs="Nyala" w:eastAsia="Nyala" w:hAnsi="Nyala"/>
         </w:rPr>
-        <w:t xml:space="preserve">ጥያቄ 1–12 በእትም 1.0 የቀረቡ ናቸው። ጥያቄ 13–26 በደብዳቤው የተዘረዘሩትን ሌሎች አገልግሎቶች (የተሽከርካሪ ምዝገባ፣ ቦሎ፣ የማሰልጠኛ ተቋማት ክትትል፣ የህዝብና የጭነት ትራንስፖርት፣ የትራፊክ ደህንነት፣ የመንገድ ግንባታ፣ ጥገና፣ ዲዛይንና ውል አስተዳደር) እና ባለድርሻ አካላትን እንዲሁም የፕሮጀክቱን አፈጻጸም ይሸፍናሉ።</w:t>
+        <w:t xml:space="preserve">ጥያቄ 1–10 ከእትም 1.0 የተወሰዱ ናቸው። ጥያቄ 11–24 በደብዳቤው የተዘረዘሩትን ሌሎች አገልግሎቶች (የተሽከርካሪ ምዝገባ፣ ቦሎ፣ የማሰልጠኛ ተቋማት ክትትል፣ የህዝብና የጭነት ትራንስፖርት፣ የትራፊክ ደህንነት፣ የመንገድ ግንባታ፣ ጥገና፣ ዲዛይንና ውል አስተዳደር) እና ባለድርሻ አካላትን እንዲሁም የፕሮጀክቱን አፈጻጸም ይሸፍናሉ።</w:t>
       </w:r>
     </w:p>
     <w:p>
@@ -1354,7 +1361,7 @@
                 <w:b w:val="false"/>
                 <w:bCs w:val="false"/>
               </w:rPr>
-              <w:t xml:space="preserve">የወላይትኛ ቋንቋ ትርጉም</w:t>
+              <w:t xml:space="preserve">ከፌዴራልና ከክልል ሥርዓቶች ጋር ያለው ግንኙነት</w:t>
             </w:r>
           </w:p>
         </w:tc>
@@ -1375,7 +1382,7 @@
                 <w:b w:val="false"/>
                 <w:bCs w:val="false"/>
               </w:rPr>
-              <w:t xml:space="preserve">ከፍተኛ</w:t>
+              <w:t xml:space="preserve">መካከለኛ</w:t>
             </w:r>
           </w:p>
         </w:tc>
@@ -1396,7 +1403,7 @@
                 <w:b w:val="false"/>
                 <w:bCs w:val="false"/>
               </w:rPr>
-              <w:t xml:space="preserve">የመምሪያው ኃላፊና የቋንቋ ባለሙያ</w:t>
+              <w:t xml:space="preserve">የብቃት ማረጋገጫ ዳይሬክቶሬት (ከክልሉ ቢሮ ጋር)</w:t>
             </w:r>
           </w:p>
         </w:tc>
@@ -1440,7 +1447,7 @@
                 <w:b w:val="false"/>
                 <w:bCs w:val="false"/>
               </w:rPr>
-              <w:t xml:space="preserve">ከፌዴራልና ከክልል ሥርዓቶች ጋር ያለው ግንኙነት</w:t>
+              <w:t xml:space="preserve">በሌላ ጽ/ቤት የተስተናገደ መረጃን ማየት</w:t>
             </w:r>
           </w:p>
         </w:tc>
@@ -1482,7 +1489,7 @@
                 <w:b w:val="false"/>
                 <w:bCs w:val="false"/>
               </w:rPr>
-              <w:t xml:space="preserve">የብቃት ማረጋገጫ ዳይሬክቶሬት (ከክልሉ ቢሮ ጋር)</w:t>
+              <w:t xml:space="preserve">የመምሪያው ኃላፊ</w:t>
             </w:r>
           </w:p>
         </w:tc>
@@ -1526,7 +1533,7 @@
                 <w:b w:val="false"/>
                 <w:bCs w:val="false"/>
               </w:rPr>
-              <w:t xml:space="preserve">በሌላ ጽ/ቤት የተስተናገደ መረጃን ማየት</w:t>
+              <w:t xml:space="preserve">የውጭ ተቋማት ተሳትፎ</w:t>
             </w:r>
           </w:p>
         </w:tc>
@@ -1547,7 +1554,7 @@
                 <w:b w:val="false"/>
                 <w:bCs w:val="false"/>
               </w:rPr>
-              <w:t xml:space="preserve">መካከለኛ</w:t>
+              <w:t xml:space="preserve">ዝቅተኛ</w:t>
             </w:r>
           </w:p>
         </w:tc>
@@ -1568,7 +1575,7 @@
                 <w:b w:val="false"/>
                 <w:bCs w:val="false"/>
               </w:rPr>
-              <w:t xml:space="preserve">የመምሪያው ኃላፊ</w:t>
+              <w:t xml:space="preserve">የብቃት ማረጋገጫና የህዝብ ትራንስፖርት ዳይሬክቶሬቶች</w:t>
             </w:r>
           </w:p>
         </w:tc>
@@ -1612,7 +1619,7 @@
                 <w:b w:val="false"/>
                 <w:bCs w:val="false"/>
               </w:rPr>
-              <w:t xml:space="preserve">የውጭ ተቋማት ተሳትፎ</w:t>
+              <w:t xml:space="preserve">የሠራተኞች ወርሃዊ የደመወዝ ዝርዝር ለፋይናንስ</w:t>
             </w:r>
           </w:p>
         </w:tc>
@@ -1654,7 +1661,7 @@
                 <w:b w:val="false"/>
                 <w:bCs w:val="false"/>
               </w:rPr>
-              <w:t xml:space="preserve">የብቃት ማረጋገጫና የህዝብ ትራንስፖርት ዳይሬክቶሬቶች</w:t>
+              <w:t xml:space="preserve">የሰው ሀብትና ፋይናንስ</w:t>
             </w:r>
           </w:p>
         </w:tc>
@@ -1698,7 +1705,7 @@
                 <w:b w:val="false"/>
                 <w:bCs w:val="false"/>
               </w:rPr>
-              <w:t xml:space="preserve">የሠራተኞች ወርሃዊ የደመወዝ ዝርዝር ለፋይናንስ</w:t>
+              <w:t xml:space="preserve">በዓላትና የቁጥር አሰጣጥ</w:t>
             </w:r>
           </w:p>
         </w:tc>
@@ -1719,7 +1726,7 @@
                 <w:b w:val="false"/>
                 <w:bCs w:val="false"/>
               </w:rPr>
-              <w:t xml:space="preserve">ዝቅተኛ</w:t>
+              <w:t xml:space="preserve">ከፍተኛ</w:t>
             </w:r>
           </w:p>
         </w:tc>
@@ -1740,7 +1747,7 @@
                 <w:b w:val="false"/>
                 <w:bCs w:val="false"/>
               </w:rPr>
-              <w:t xml:space="preserve">የሰው ሀብትና ፋይናንስ</w:t>
+              <w:t xml:space="preserve">የሰው ሀብትና የብቃት ማረጋገጫ ዳይሬክቶሬት</w:t>
             </w:r>
           </w:p>
         </w:tc>
@@ -1784,7 +1791,7 @@
                 <w:b w:val="false"/>
                 <w:bCs w:val="false"/>
               </w:rPr>
-              <w:t xml:space="preserve">የኢንተርኔት፣ የኮምፒውተርና የኤሌክትሪክ ሁኔታ</w:t>
+              <w:t xml:space="preserve">የተሽከርካሪ ምዝገባ፣ ሰሌዳና ዝውውር</w:t>
             </w:r>
           </w:p>
         </w:tc>
@@ -1826,7 +1833,7 @@
                 <w:b w:val="false"/>
                 <w:bCs w:val="false"/>
               </w:rPr>
-              <w:t xml:space="preserve">የአይሲቲ ባለሙያ / አስተዳደር</w:t>
+              <w:t xml:space="preserve">የአሽከርካሪና ተሽከርካሪ ብቃት ማረጋገጫ ዳይሬክቶሬት</w:t>
             </w:r>
           </w:p>
         </w:tc>
@@ -1870,7 +1877,7 @@
                 <w:b w:val="false"/>
                 <w:bCs w:val="false"/>
               </w:rPr>
-              <w:t xml:space="preserve">በዓላትና የቁጥር አሰጣጥ</w:t>
+              <w:t xml:space="preserve">የቴክኒክ ምርመራና ቦሎ</w:t>
             </w:r>
           </w:p>
         </w:tc>
@@ -1891,7 +1898,7 @@
                 <w:b w:val="false"/>
                 <w:bCs w:val="false"/>
               </w:rPr>
-              <w:t xml:space="preserve">ከፍተኛ</w:t>
+              <w:t xml:space="preserve">መካከለኛ</w:t>
             </w:r>
           </w:p>
         </w:tc>
@@ -1912,7 +1919,7 @@
                 <w:b w:val="false"/>
                 <w:bCs w:val="false"/>
               </w:rPr>
-              <w:t xml:space="preserve">የሰው ሀብትና የብቃት ማረጋገጫ ዳይሬክቶሬት</w:t>
+              <w:t xml:space="preserve">የአሽከርካሪና ተሽከርካሪ ብቃት ማረጋገጫ ዳይሬክቶሬት</w:t>
             </w:r>
           </w:p>
         </w:tc>
@@ -1956,7 +1963,7 @@
                 <w:b w:val="false"/>
                 <w:bCs w:val="false"/>
               </w:rPr>
-              <w:t xml:space="preserve">የተሽከርካሪ ምዝገባ፣ ሰሌዳና ዝውውር</w:t>
+              <w:t xml:space="preserve">የአሽከርካሪ ማሰልጠኛ ተቋማት ክትትል</w:t>
             </w:r>
           </w:p>
         </w:tc>
@@ -2042,7 +2049,7 @@
                 <w:b w:val="false"/>
                 <w:bCs w:val="false"/>
               </w:rPr>
-              <w:t xml:space="preserve">የቴክኒክ ምርመራና ቦሎ</w:t>
+              <w:t xml:space="preserve">የህዝብ ትራንስፖርት፦ የስምሪት መስመሮች፣ መርሃ ግብርና ደረጃ</w:t>
             </w:r>
           </w:p>
         </w:tc>
@@ -2084,7 +2091,7 @@
                 <w:b w:val="false"/>
                 <w:bCs w:val="false"/>
               </w:rPr>
-              <w:t xml:space="preserve">የአሽከርካሪና ተሽከርካሪ ብቃት ማረጋገጫ ዳይሬክቶሬት</w:t>
+              <w:t xml:space="preserve">የህዝብ ትራንስፖርት ዳይሬክቶሬት</w:t>
             </w:r>
           </w:p>
         </w:tc>
@@ -2128,7 +2135,7 @@
                 <w:b w:val="false"/>
                 <w:bCs w:val="false"/>
               </w:rPr>
-              <w:t xml:space="preserve">የአሽከርካሪ ማሰልጠኛ ተቋማት ክትትል</w:t>
+              <w:t xml:space="preserve">የጭነት ትራንስፖርት ብቃት ማረጋገጫ</w:t>
             </w:r>
           </w:p>
         </w:tc>
@@ -2170,7 +2177,7 @@
                 <w:b w:val="false"/>
                 <w:bCs w:val="false"/>
               </w:rPr>
-              <w:t xml:space="preserve">የአሽከርካሪና ተሽከርካሪ ብቃት ማረጋገጫ ዳይሬክቶሬት</w:t>
+              <w:t xml:space="preserve">የጭነት ትራንስፖርት ብቃት ማረጋገጫ ዳይሬክቶሬት</w:t>
             </w:r>
           </w:p>
         </w:tc>
@@ -2214,7 +2221,7 @@
                 <w:b w:val="false"/>
                 <w:bCs w:val="false"/>
               </w:rPr>
-              <w:t xml:space="preserve">የህዝብ ትራንስፖርት፦ የስምሪት መስመሮች፣ መርሃ ግብርና ደረጃ</w:t>
+              <w:t xml:space="preserve">የመንገድ ትራፊክ ደህንነትና ቁጥጥር</w:t>
             </w:r>
           </w:p>
         </w:tc>
@@ -2256,7 +2263,7 @@
                 <w:b w:val="false"/>
                 <w:bCs w:val="false"/>
               </w:rPr>
-              <w:t xml:space="preserve">የህዝብ ትራንስፖርት ዳይሬክቶሬት</w:t>
+              <w:t xml:space="preserve">የመንገድ ትራፊክ ደህንነት ዳይሬክቶሬት</w:t>
             </w:r>
           </w:p>
         </w:tc>
@@ -2300,7 +2307,7 @@
                 <w:b w:val="false"/>
                 <w:bCs w:val="false"/>
               </w:rPr>
-              <w:t xml:space="preserve">የጭነት ትራንስፖርት ብቃት ማረጋገጫ</w:t>
+              <w:t xml:space="preserve">የመንገድ ግንባታና የጥገና ቁጥጥር</w:t>
             </w:r>
           </w:p>
         </w:tc>
@@ -2342,7 +2349,7 @@
                 <w:b w:val="false"/>
                 <w:bCs w:val="false"/>
               </w:rPr>
-              <w:t xml:space="preserve">የጭነት ትራንስፖርት ብቃት ማረጋገጫ ዳይሬክቶሬት</w:t>
+              <w:t xml:space="preserve">የመንገድ ዘርፍ ሥራ ክፍሎች (ግንባታና ጥገና)</w:t>
             </w:r>
           </w:p>
         </w:tc>
@@ -2386,7 +2393,7 @@
                 <w:b w:val="false"/>
                 <w:bCs w:val="false"/>
               </w:rPr>
-              <w:t xml:space="preserve">የመንገድ ትራፊክ ደህንነትና ቁጥጥር</w:t>
+              <w:t xml:space="preserve">የመንገድ ዲዛይንና የውል አስተዳደር</w:t>
             </w:r>
           </w:p>
         </w:tc>
@@ -2428,7 +2435,7 @@
                 <w:b w:val="false"/>
                 <w:bCs w:val="false"/>
               </w:rPr>
-              <w:t xml:space="preserve">የመንገድ ትራፊክ ደህንነት ዳይሬክቶሬት</w:t>
+              <w:t xml:space="preserve">የዲዛይንና የውል አስተዳደር ዳይሬክቶሬት</w:t>
             </w:r>
           </w:p>
         </w:tc>
@@ -2472,7 +2479,7 @@
                 <w:b w:val="false"/>
                 <w:bCs w:val="false"/>
               </w:rPr>
-              <w:t xml:space="preserve">የመንገድ ግንባታና የጥገና ቁጥጥር</w:t>
+              <w:t xml:space="preserve">የባለድርሻ አካላት ትስስር</w:t>
             </w:r>
           </w:p>
         </w:tc>
@@ -2514,7 +2521,7 @@
                 <w:b w:val="false"/>
                 <w:bCs w:val="false"/>
               </w:rPr>
-              <w:t xml:space="preserve">የመንገድ ዘርፍ ሥራ ክፍሎች (ግንባታና ጥገና)</w:t>
+              <w:t xml:space="preserve">የመምሪያው ኃላፊና ዳይሬክቶሬቶች</w:t>
             </w:r>
           </w:p>
         </w:tc>
@@ -2558,7 +2565,7 @@
                 <w:b w:val="false"/>
                 <w:bCs w:val="false"/>
               </w:rPr>
-              <w:t xml:space="preserve">የመንገድ ዲዛይንና የውል አስተዳደር</w:t>
+              <w:t xml:space="preserve">የአገልግሎቶቹ ቅደም ተከተልና የትግበራ ምዕራፎች</w:t>
             </w:r>
           </w:p>
         </w:tc>
@@ -2579,7 +2586,7 @@
                 <w:b w:val="false"/>
                 <w:bCs w:val="false"/>
               </w:rPr>
-              <w:t xml:space="preserve">መካከለኛ</w:t>
+              <w:t xml:space="preserve">ከፍተኛ</w:t>
             </w:r>
           </w:p>
         </w:tc>
@@ -2600,7 +2607,7 @@
                 <w:b w:val="false"/>
                 <w:bCs w:val="false"/>
               </w:rPr>
-              <w:t xml:space="preserve">የዲዛይንና የውል አስተዳደር ዳይሬክቶሬት</w:t>
+              <w:t xml:space="preserve">የመምሪያው ኃላፊ</w:t>
             </w:r>
           </w:p>
         </w:tc>
@@ -2644,7 +2651,7 @@
                 <w:b w:val="false"/>
                 <w:bCs w:val="false"/>
               </w:rPr>
-              <w:t xml:space="preserve">የባለድርሻ አካላት ትስስር</w:t>
+              <w:t xml:space="preserve">ነባር መረጃና የመረጃ ሽግግር</w:t>
             </w:r>
           </w:p>
         </w:tc>
@@ -2686,7 +2693,7 @@
                 <w:b w:val="false"/>
                 <w:bCs w:val="false"/>
               </w:rPr>
-              <w:t xml:space="preserve">የመምሪያው ኃላፊና ዳይሬክቶሬቶች</w:t>
+              <w:t xml:space="preserve">ዳይሬክቶሬቶችና የአይሲቲ ባለሙያ</w:t>
             </w:r>
           </w:p>
         </w:tc>
@@ -2730,7 +2737,7 @@
                 <w:b w:val="false"/>
                 <w:bCs w:val="false"/>
               </w:rPr>
-              <w:t xml:space="preserve">የአገልግሎቶቹ ቅደም ተከተልና የትግበራ ምዕራፎች</w:t>
+              <w:t xml:space="preserve">ተጠቃሚዎች፣ ሥልጠናና የፕሮጀክቱ አስተባባሪ</w:t>
             </w:r>
           </w:p>
         </w:tc>
@@ -2772,7 +2779,7 @@
                 <w:b w:val="false"/>
                 <w:bCs w:val="false"/>
               </w:rPr>
-              <w:t xml:space="preserve">የመምሪያው ኃላፊ</w:t>
+              <w:t xml:space="preserve">የመምሪያው ኃላፊና የሰው ሀብት</w:t>
             </w:r>
           </w:p>
         </w:tc>
@@ -2816,7 +2823,7 @@
                 <w:b w:val="false"/>
                 <w:bCs w:val="false"/>
               </w:rPr>
-              <w:t xml:space="preserve">ነባር መረጃና የመረጃ ሽግግር</w:t>
+              <w:t xml:space="preserve">ሪፖርቶችና የአፈጻጸም መለኪያዎች</w:t>
             </w:r>
           </w:p>
         </w:tc>
@@ -2858,7 +2865,7 @@
                 <w:b w:val="false"/>
                 <w:bCs w:val="false"/>
               </w:rPr>
-              <w:t xml:space="preserve">ዳይሬክቶሬቶችና የአይሲቲ ባለሙያ</w:t>
+              <w:t xml:space="preserve">የዕቅድና በጀት ዳይሬክቶሬት</w:t>
             </w:r>
           </w:p>
         </w:tc>
@@ -2882,178 +2889,6 @@
                 <w:bCs w:val="false"/>
               </w:rPr>
               <w:t xml:space="preserve">24</w:t>
-            </w:r>
-          </w:p>
-        </w:tc>
-        <w:tc>
-          <w:tcPr>
-            <w:tcW w:type="dxa" w:w="4100"/>
-            <w:tcMar>
-              <w:top w:type="dxa" w:w="60"/>
-              <w:left w:type="dxa" w:w="100"/>
-              <w:bottom w:type="dxa" w:w="60"/>
-              <w:right w:type="dxa" w:w="100"/>
-            </w:tcMar>
-          </w:tcPr>
-          <w:p>
-            <w:r>
-              <w:rPr>
-                <w:rFonts w:ascii="Nyala" w:cs="Nyala" w:eastAsia="Nyala" w:hAnsi="Nyala"/>
-                <w:b w:val="false"/>
-                <w:bCs w:val="false"/>
-              </w:rPr>
-              <w:t xml:space="preserve">ተጠቃሚዎች፣ ሥልጠናና የፕሮጀክቱ አስተባባሪ</w:t>
-            </w:r>
-          </w:p>
-        </w:tc>
-        <w:tc>
-          <w:tcPr>
-            <w:tcW w:type="dxa" w:w="1300"/>
-            <w:tcMar>
-              <w:top w:type="dxa" w:w="60"/>
-              <w:left w:type="dxa" w:w="100"/>
-              <w:bottom w:type="dxa" w:w="60"/>
-              <w:right w:type="dxa" w:w="100"/>
-            </w:tcMar>
-          </w:tcPr>
-          <w:p>
-            <w:r>
-              <w:rPr>
-                <w:rFonts w:ascii="Nyala" w:cs="Nyala" w:eastAsia="Nyala" w:hAnsi="Nyala"/>
-                <w:b w:val="false"/>
-                <w:bCs w:val="false"/>
-              </w:rPr>
-              <w:t xml:space="preserve">ከፍተኛ</w:t>
-            </w:r>
-          </w:p>
-        </w:tc>
-        <w:tc>
-          <w:tcPr>
-            <w:tcW w:type="dxa" w:w="3538"/>
-            <w:tcMar>
-              <w:top w:type="dxa" w:w="60"/>
-              <w:left w:type="dxa" w:w="100"/>
-              <w:bottom w:type="dxa" w:w="60"/>
-              <w:right w:type="dxa" w:w="100"/>
-            </w:tcMar>
-          </w:tcPr>
-          <w:p>
-            <w:r>
-              <w:rPr>
-                <w:rFonts w:ascii="Nyala" w:cs="Nyala" w:eastAsia="Nyala" w:hAnsi="Nyala"/>
-                <w:b w:val="false"/>
-                <w:bCs w:val="false"/>
-              </w:rPr>
-              <w:t xml:space="preserve">የመምሪያው ኃላፊና የሰው ሀብት</w:t>
-            </w:r>
-          </w:p>
-        </w:tc>
-      </w:tr>
-      <w:tr>
-        <w:tc>
-          <w:tcPr>
-            <w:tcW w:type="dxa" w:w="700"/>
-            <w:tcMar>
-              <w:top w:type="dxa" w:w="60"/>
-              <w:left w:type="dxa" w:w="100"/>
-              <w:bottom w:type="dxa" w:w="60"/>
-              <w:right w:type="dxa" w:w="100"/>
-            </w:tcMar>
-          </w:tcPr>
-          <w:p>
-            <w:r>
-              <w:rPr>
-                <w:rFonts w:ascii="Nyala" w:cs="Nyala" w:eastAsia="Nyala" w:hAnsi="Nyala"/>
-                <w:b w:val="false"/>
-                <w:bCs w:val="false"/>
-              </w:rPr>
-              <w:t xml:space="preserve">25</w:t>
-            </w:r>
-          </w:p>
-        </w:tc>
-        <w:tc>
-          <w:tcPr>
-            <w:tcW w:type="dxa" w:w="4100"/>
-            <w:tcMar>
-              <w:top w:type="dxa" w:w="60"/>
-              <w:left w:type="dxa" w:w="100"/>
-              <w:bottom w:type="dxa" w:w="60"/>
-              <w:right w:type="dxa" w:w="100"/>
-            </w:tcMar>
-          </w:tcPr>
-          <w:p>
-            <w:r>
-              <w:rPr>
-                <w:rFonts w:ascii="Nyala" w:cs="Nyala" w:eastAsia="Nyala" w:hAnsi="Nyala"/>
-                <w:b w:val="false"/>
-                <w:bCs w:val="false"/>
-              </w:rPr>
-              <w:t xml:space="preserve">ሪፖርቶችና የአፈጻጸም መለኪያዎች</w:t>
-            </w:r>
-          </w:p>
-        </w:tc>
-        <w:tc>
-          <w:tcPr>
-            <w:tcW w:type="dxa" w:w="1300"/>
-            <w:tcMar>
-              <w:top w:type="dxa" w:w="60"/>
-              <w:left w:type="dxa" w:w="100"/>
-              <w:bottom w:type="dxa" w:w="60"/>
-              <w:right w:type="dxa" w:w="100"/>
-            </w:tcMar>
-          </w:tcPr>
-          <w:p>
-            <w:r>
-              <w:rPr>
-                <w:rFonts w:ascii="Nyala" w:cs="Nyala" w:eastAsia="Nyala" w:hAnsi="Nyala"/>
-                <w:b w:val="false"/>
-                <w:bCs w:val="false"/>
-              </w:rPr>
-              <w:t xml:space="preserve">መካከለኛ</w:t>
-            </w:r>
-          </w:p>
-        </w:tc>
-        <w:tc>
-          <w:tcPr>
-            <w:tcW w:type="dxa" w:w="3538"/>
-            <w:tcMar>
-              <w:top w:type="dxa" w:w="60"/>
-              <w:left w:type="dxa" w:w="100"/>
-              <w:bottom w:type="dxa" w:w="60"/>
-              <w:right w:type="dxa" w:w="100"/>
-            </w:tcMar>
-          </w:tcPr>
-          <w:p>
-            <w:r>
-              <w:rPr>
-                <w:rFonts w:ascii="Nyala" w:cs="Nyala" w:eastAsia="Nyala" w:hAnsi="Nyala"/>
-                <w:b w:val="false"/>
-                <w:bCs w:val="false"/>
-              </w:rPr>
-              <w:t xml:space="preserve">የዕቅድና በጀት ዳይሬክቶሬት</w:t>
-            </w:r>
-          </w:p>
-        </w:tc>
-      </w:tr>
-      <w:tr>
-        <w:tc>
-          <w:tcPr>
-            <w:tcW w:type="dxa" w:w="700"/>
-            <w:tcMar>
-              <w:top w:type="dxa" w:w="60"/>
-              <w:left w:type="dxa" w:w="100"/>
-              <w:bottom w:type="dxa" w:w="60"/>
-              <w:right w:type="dxa" w:w="100"/>
-            </w:tcMar>
-          </w:tcPr>
-          <w:p>
-            <w:r>
-              <w:rPr>
-                <w:rFonts w:ascii="Nyala" w:cs="Nyala" w:eastAsia="Nyala" w:hAnsi="Nyala"/>
-                <w:b w:val="false"/>
-                <w:bCs w:val="false"/>
-              </w:rPr>
-              <w:t xml:space="preserve">26</w:t>
             </w:r>
           </w:p>
         </w:tc>
@@ -3487,7 +3322,7 @@
         <w:rPr>
           <w:rFonts w:ascii="Nyala" w:cs="Nyala" w:eastAsia="Nyala" w:hAnsi="Nyala"/>
         </w:rPr>
-        <w:t xml:space="preserve">የፌዴራል የአገልግሎት ክፍያ ተመን በሚኒስትሮች ምክር ቤት ደንብ ቁጥር 572/2025 (እ.ኤ.አ.) ተሻሽሏል፤ ሆኖም ዝርዝር ተመኑን ማግኘት አልቻልንም። ክልሉም የራሱ ተመን ሊኖረው ይችላል። ሥርዓቱ ትክክለኛውን ክፍያ እንዲያሰላ ተመኑ ያስፈልጋል። የሌሎቹ አገልግሎቶች (ቦሎ፣ ምዝገባ፣ የማህበራት ፈቃድ፣ የጭነት ብቃት ማረጋገጫ …) ክፍያም በጥያቄ 13–17 ተጠይቋል።</w:t>
+        <w:t xml:space="preserve">የፌዴራል የአገልግሎት ክፍያ ተመን በሚኒስትሮች ምክር ቤት ደንብ ቁጥር 572/2025 (እ.ኤ.አ.) ተሻሽሏል፤ ሆኖም ዝርዝር ተመኑን ማግኘት አልቻልንም። ክልሉም የራሱ ተመን ሊኖረው ይችላል። ሥርዓቱ ትክክለኛውን ክፍያ እንዲያሰላ ተመኑ ያስፈልጋል። የሌሎቹ አገልግሎቶች (ቦሎ፣ ምዝገባ፣ የማህበራት ፈቃድ፣ የጭነት ብቃት ማረጋገጫ …) ክፍያም በጥያቄ 11–15 ተጠይቋል።</w:t>
       </w:r>
     </w:p>
     <w:p>
@@ -5660,7 +5495,7 @@
         <w:rPr>
           <w:rFonts w:ascii="Nyala" w:cs="Nyala" w:eastAsia="Nyala" w:hAnsi="Nyala"/>
         </w:rPr>
-        <w:t xml:space="preserve">ጥያቄ 6፦ የወላይትኛ ቋንቋ ትርጉም</w:t>
+        <w:t xml:space="preserve">ጥያቄ 6፦ ከፌዴራልና ከክልል ሥርዓቶች ጋር ያለው ግንኙነት</w:t>
       </w:r>
     </w:p>
     <w:p>
@@ -5684,7 +5519,7 @@
         <w:rPr>
           <w:rFonts w:ascii="Nyala" w:cs="Nyala" w:eastAsia="Nyala" w:hAnsi="Nyala"/>
         </w:rPr>
-        <w:t xml:space="preserve">ከፍተኛ (ለ6.1)፤ መካከለኛ (ለሌሎቹ)</w:t>
+        <w:t xml:space="preserve">መካከለኛ</w:t>
       </w:r>
     </w:p>
     <w:p>
@@ -5708,7 +5543,7 @@
         <w:rPr>
           <w:rFonts w:ascii="Nyala" w:cs="Nyala" w:eastAsia="Nyala" w:hAnsi="Nyala"/>
         </w:rPr>
-        <w:t xml:space="preserve">የመምሪያው ኃላፊና የቋንቋ ባለሙያ</w:t>
+        <w:t xml:space="preserve">የብቃት ማረጋገጫ ዳይሬክቶሬት (ከክልሉ ቢሮ ጋር)</w:t>
       </w:r>
     </w:p>
     <w:p>
@@ -5734,7 +5569,7 @@
         <w:rPr>
           <w:rFonts w:ascii="Nyala" w:cs="Nyala" w:eastAsia="Nyala" w:hAnsi="Nyala"/>
         </w:rPr>
-        <w:t xml:space="preserve">ሥርዓቱ በአማርኛ፣ በእንግሊዝኛና በወላይትኛ እንዲሠራ ተወስኗል። ወላይትኛ በትምህርት ቤቶች በላቲን ፊደል ስለሚጻፍ ሥርዓቱም የላቲን ፊደል ይጠቀማል። ትርጉሙ ብቁ በሆነ ሰው መሠራትና መረጋገጥ አለበት፤ በማሽን የተተረጎመ ጽሑፍ ያለ ማረጋገጫ ጥቅም ላይ አይውልም።</w:t>
+        <w:t xml:space="preserve">የትራንስፖርትና ሎጂስቲክስ ሚኒስቴር የተሽከርካሪ ምዝገባን ወደ አገር አቀፍ ሥርዓት እያሸጋገረ ነው (መመሪያ ቁጥር 1050/2025 እ.ኤ.አ.፤ "ETH" ሰሌዳ)። እንዲሁም የአሽከርካሪዎችን ምዝገባ፣ ሥልጠና፣ ምዘናና ፈቃድ የሚያስተዳድር ዲጂታል ሥርዓትና በነጥብ ላይ የተመሠረተ የትራፊክ ቅጣት ሥርዓት ተጀምሯል። ITRMS እነዚህን አይተካም፤ ከእነሱ ጋር ተገናኝቶ የዞኑን ሥራ ያቀላጥፋል።</w:t>
       </w:r>
     </w:p>
     <w:p>
@@ -5769,7 +5604,7 @@
         <w:rPr>
           <w:rFonts w:ascii="Nyala" w:cs="Nyala" w:eastAsia="Nyala" w:hAnsi="Nyala"/>
         </w:rPr>
-        <w:t xml:space="preserve">የሥርዓቱን ጽሑፎች (ለማሳያው ወደ 300 የሚጠጉ አጫጭር ቃላትና ዓረፍተ ነገሮች) የሚተረጉመው ማን ይሆናል? የሚያረጋግጠውስ ማን ነው? (ስም ወይም ኃላፊነት)</w:t>
+        <w:t xml:space="preserve">በአሁኑ ጊዜ መምሪያው መረጃ የሚያስገባበት የፌዴራል ወይም የክልል ኮምፒውተር ሥርዓት አለ? (የሥርዓቱ ስምና ለምን ሥራ እንደሚውል)</w:t>
       </w:r>
     </w:p>
     <w:p>
@@ -5789,7 +5624,7 @@
         <w:rPr>
           <w:rFonts w:ascii="Nyala" w:cs="Nyala" w:eastAsia="Nyala" w:hAnsi="Nyala"/>
         </w:rPr>
-        <w:t xml:space="preserve">ቋንቋው በራሱ ቋንቋ እንዴት ይጻፋል (ለምሳሌ "Wolayttattuwaa")? የላቲን ፊደል መጠቀማችን ትክክል ነው?</w:t>
+        <w:t xml:space="preserve">ክልሉ አዲሱን "ETH" የሰሌዳ ሥርዓት መቼ ይጀምራል? ስለ አፈጻጸሙ ለዞኑ የደረሰ መመሪያ አለ?</w:t>
       </w:r>
     </w:p>
     <w:p>
@@ -5809,7 +5644,7 @@
         <w:rPr>
           <w:rFonts w:ascii="Nyala" w:cs="Nyala" w:eastAsia="Nyala" w:hAnsi="Nyala"/>
         </w:rPr>
-        <w:t xml:space="preserve">የኢትዮጵያ ወራትና የሳምንቱ ቀናት በወላይትኛ በአባሪ "ሐ" ይሙሉ።</w:t>
+        <w:t xml:space="preserve">አገር አቀፉ የአሽከርካሪ ሥርዓት ሥራ ላይ ሲውል የትኞቹ ሥራዎች በዞኑ ይቀራሉ ተብሎ ይጠበቃል?</w:t>
       </w:r>
     </w:p>
     <w:p>
@@ -5829,27 +5664,7 @@
         <w:rPr>
           <w:rFonts w:ascii="Nyala" w:cs="Nyala" w:eastAsia="Nyala" w:hAnsi="Nyala"/>
         </w:rPr>
-        <w:t xml:space="preserve">የሚታተሙ ሰነዶች (መንጃ ፈቃድ፣ ደረሰኝ፣ ምስክር ወረቀት) በአማርኛና በእንግሊዝኛ ብቻ ይሁኑ ወይስ ወላይትኛም ይጨመር?</w:t>
-      </w:r>
-    </w:p>
-    <w:p>
-      <w:pPr>
-        <w:spacing w:after="100" w:line="300"/>
-        <w:ind w:left="567" w:hanging="567"/>
-      </w:pPr>
-      <w:r>
-        <w:rPr>
-          <w:rFonts w:ascii="Nyala" w:cs="Nyala" w:eastAsia="Nyala" w:hAnsi="Nyala"/>
-          <w:b/>
-          <w:bCs/>
-        </w:rPr>
-        <w:t xml:space="preserve">6.5  </w:t>
-      </w:r>
-      <w:r>
-        <w:rPr>
-          <w:rFonts w:ascii="Nyala" w:cs="Nyala" w:eastAsia="Nyala" w:hAnsi="Nyala"/>
-        </w:rPr>
-        <w:t xml:space="preserve">ለተገልጋዮች የሚላኩ የጽሑፍ መልዕክቶች (SMS) በየትኛው ቋንቋ ይሁኑ? (ወላይትኛ፣ አማርኛ፣ ሁለቱም)</w:t>
+        <w:t xml:space="preserve">ስለ ሥርዓቶቹ ትስስር ማነጋገር የምንችለው በክልሉ ቢሮ ወይም በሚኒስቴሩ ያለ ኃላፊ ማን ነው? (ስም፣ ኃላፊነት፣ ስልክ)</w:t>
       </w:r>
     </w:p>
     <w:tbl>
@@ -5966,7 +5781,7 @@
         <w:rPr>
           <w:rFonts w:ascii="Nyala" w:cs="Nyala" w:eastAsia="Nyala" w:hAnsi="Nyala"/>
         </w:rPr>
-        <w:t xml:space="preserve">ጥያቄ 7፦ ከፌዴራልና ከክልል ሥርዓቶች ጋር ያለው ግንኙነት</w:t>
+        <w:t xml:space="preserve">ጥያቄ 7፦ በሌላ ጽ/ቤት የተስተናገደ መረጃን ማየት</w:t>
       </w:r>
     </w:p>
     <w:p>
@@ -6014,7 +5829,7 @@
         <w:rPr>
           <w:rFonts w:ascii="Nyala" w:cs="Nyala" w:eastAsia="Nyala" w:hAnsi="Nyala"/>
         </w:rPr>
-        <w:t xml:space="preserve">የብቃት ማረጋገጫ ዳይሬክቶሬት (ከክልሉ ቢሮ ጋር)</w:t>
+        <w:t xml:space="preserve">የመምሪያው ኃላፊ</w:t>
       </w:r>
     </w:p>
     <w:p>
@@ -6040,7 +5855,7 @@
         <w:rPr>
           <w:rFonts w:ascii="Nyala" w:cs="Nyala" w:eastAsia="Nyala" w:hAnsi="Nyala"/>
         </w:rPr>
-        <w:t xml:space="preserve">የትራንስፖርትና ሎጂስቲክስ ሚኒስቴር የተሽከርካሪ ምዝገባን ወደ አገር አቀፍ ሥርዓት እያሸጋገረ ነው (መመሪያ ቁጥር 1050/2025 እ.ኤ.አ.፤ "ETH" ሰሌዳ)። እንዲሁም የአሽከርካሪዎችን ምዝገባ፣ ሥልጠና፣ ምዘናና ፈቃድ የሚያስተዳድር ዲጂታል ሥርዓትና በነጥብ ላይ የተመሠረተ የትራፊክ ቅጣት ሥርዓት ተጀምሯል። ITRMS እነዚህን አይተካም፤ ከእነሱ ጋር ተገናኝቶ የዞኑን ሥራ ያቀላጥፋል።</w:t>
+        <w:t xml:space="preserve">ተሽከርካሪዎች፣ አሽከርካሪዎችና ማህበራት የክልል መዝገብ ስለሆኑ በክልሉ ውስጥ ይፈለጋሉ። ሆኖም አንድ ጽ/ቤት የሌላውን ጽ/ቤት ዝርዝር ፋይል ማየት የለበትም። ያቀረብነው አማራጭ፦ የሌላ ጽ/ቤት ታሪክ በማጠቃለያ ብቻ (የአገልግሎት ዓይነት፣ ቀን፣ ያስተናገደው ጽ/ቤት፣ ውጤት) እንዲታይ ነው።</w:t>
       </w:r>
     </w:p>
     <w:p>
@@ -6075,7 +5890,7 @@
         <w:rPr>
           <w:rFonts w:ascii="Nyala" w:cs="Nyala" w:eastAsia="Nyala" w:hAnsi="Nyala"/>
         </w:rPr>
-        <w:t xml:space="preserve">በአሁኑ ጊዜ መምሪያው መረጃ የሚያስገባበት የፌዴራል ወይም የክልል ኮምፒውተር ሥርዓት አለ? (የሥርዓቱ ስምና ለምን ሥራ እንደሚውል)</w:t>
+        <w:t xml:space="preserve">ይህ አቀራረብ ተቀባይነት አለው? ካልሆነ ማን ምን ማየት እንዳለበት ይግለጹ።</w:t>
       </w:r>
     </w:p>
     <w:p>
@@ -6095,47 +5910,7 @@
         <w:rPr>
           <w:rFonts w:ascii="Nyala" w:cs="Nyala" w:eastAsia="Nyala" w:hAnsi="Nyala"/>
         </w:rPr>
-        <w:t xml:space="preserve">ክልሉ አዲሱን "ETH" የሰሌዳ ሥርዓት መቼ ይጀምራል? ስለ አፈጻጸሙ ለዞኑ የደረሰ መመሪያ አለ?</w:t>
-      </w:r>
-    </w:p>
-    <w:p>
-      <w:pPr>
-        <w:spacing w:after="100" w:line="300"/>
-        <w:ind w:left="567" w:hanging="567"/>
-      </w:pPr>
-      <w:r>
-        <w:rPr>
-          <w:rFonts w:ascii="Nyala" w:cs="Nyala" w:eastAsia="Nyala" w:hAnsi="Nyala"/>
-          <w:b/>
-          <w:bCs/>
-        </w:rPr>
-        <w:t xml:space="preserve">7.3  </w:t>
-      </w:r>
-      <w:r>
-        <w:rPr>
-          <w:rFonts w:ascii="Nyala" w:cs="Nyala" w:eastAsia="Nyala" w:hAnsi="Nyala"/>
-        </w:rPr>
-        <w:t xml:space="preserve">አገር አቀፉ የአሽከርካሪ ሥርዓት ሥራ ላይ ሲውል የትኞቹ ሥራዎች በዞኑ ይቀራሉ ተብሎ ይጠበቃል?</w:t>
-      </w:r>
-    </w:p>
-    <w:p>
-      <w:pPr>
-        <w:spacing w:after="100" w:line="300"/>
-        <w:ind w:left="567" w:hanging="567"/>
-      </w:pPr>
-      <w:r>
-        <w:rPr>
-          <w:rFonts w:ascii="Nyala" w:cs="Nyala" w:eastAsia="Nyala" w:hAnsi="Nyala"/>
-          <w:b/>
-          <w:bCs/>
-        </w:rPr>
-        <w:t xml:space="preserve">7.4  </w:t>
-      </w:r>
-      <w:r>
-        <w:rPr>
-          <w:rFonts w:ascii="Nyala" w:cs="Nyala" w:eastAsia="Nyala" w:hAnsi="Nyala"/>
-        </w:rPr>
-        <w:t xml:space="preserve">ስለ ሥርዓቶቹ ትስስር ማነጋገር የምንችለው በክልሉ ቢሮ ወይም በሚኒስቴሩ ያለ ኃላፊ ማን ነው? (ስም፣ ኃላፊነት፣ ስልክ)</w:t>
+        <w:t xml:space="preserve">የዞኑ መምሪያ የሁሉንም ወረዳዎችና ከተሞች ዝርዝር ፋይሎች ማየት ይገባዋል?</w:t>
       </w:r>
     </w:p>
     <w:tbl>
@@ -6252,7 +6027,7 @@
         <w:rPr>
           <w:rFonts w:ascii="Nyala" w:cs="Nyala" w:eastAsia="Nyala" w:hAnsi="Nyala"/>
         </w:rPr>
-        <w:t xml:space="preserve">ጥያቄ 8፦ በሌላ ጽ/ቤት የተስተናገደ መረጃን ማየት</w:t>
+        <w:t xml:space="preserve">ጥያቄ 8፦ የውጭ ተቋማት ተሳትፎ</w:t>
       </w:r>
     </w:p>
     <w:p>
@@ -6276,7 +6051,7 @@
         <w:rPr>
           <w:rFonts w:ascii="Nyala" w:cs="Nyala" w:eastAsia="Nyala" w:hAnsi="Nyala"/>
         </w:rPr>
-        <w:t xml:space="preserve">መካከለኛ</w:t>
+        <w:t xml:space="preserve">ዝቅተኛ (ለኋለኛው ምዕራፍ)</w:t>
       </w:r>
     </w:p>
     <w:p>
@@ -6300,7 +6075,7 @@
         <w:rPr>
           <w:rFonts w:ascii="Nyala" w:cs="Nyala" w:eastAsia="Nyala" w:hAnsi="Nyala"/>
         </w:rPr>
-        <w:t xml:space="preserve">የመምሪያው ኃላፊ</w:t>
+        <w:t xml:space="preserve">የብቃት ማረጋገጫና የህዝብ ትራንስፖርት ዳይሬክቶሬቶች</w:t>
       </w:r>
     </w:p>
     <w:p>
@@ -6326,7 +6101,7 @@
         <w:rPr>
           <w:rFonts w:ascii="Nyala" w:cs="Nyala" w:eastAsia="Nyala" w:hAnsi="Nyala"/>
         </w:rPr>
-        <w:t xml:space="preserve">ተሽከርካሪዎች፣ አሽከርካሪዎችና ማህበራት የክልል መዝገብ ስለሆኑ በክልሉ ውስጥ ይፈለጋሉ። ሆኖም አንድ ጽ/ቤት የሌላውን ጽ/ቤት ዝርዝር ፋይል ማየት የለበትም። ያቀረብነው አማራጭ፦ የሌላ ጽ/ቤት ታሪክ በማጠቃለያ ብቻ (የአገልግሎት ዓይነት፣ ቀን፣ ያስተናገደው ጽ/ቤት፣ ውጤት) እንዲታይ ነው።</w:t>
+        <w:t xml:space="preserve">የማሰልጠኛ ተቋማት ሥልጠና ያጠናቀቁ ሠልጣኞችን ለምዘና ያቀርባሉ፤ የትራንስፖርት ማህበራት ወርሃዊ የስምሪት መርሃ ግብራቸውን በመርሃ ግብር አውጪ ኮሚቴ አዘጋጅተው ለማጽደቅ ያቀርባሉ። ለማሳያው እነዚህ መረጃዎች በመምሪያው ሠራተኛ ይመዘገባሉ። የሌሎቹ ባለድርሻ አካላት ተሳትፎ በጥያቄ 19 ተጠይቋል።</w:t>
       </w:r>
     </w:p>
     <w:p>
@@ -6361,7 +6136,7 @@
         <w:rPr>
           <w:rFonts w:ascii="Nyala" w:cs="Nyala" w:eastAsia="Nyala" w:hAnsi="Nyala"/>
         </w:rPr>
-        <w:t xml:space="preserve">ይህ አቀራረብ ተቀባይነት አለው? ካልሆነ ማን ምን ማየት እንዳለበት ይግለጹ።</w:t>
+        <w:t xml:space="preserve">በኋለኛው ምዕራፍ ማሰልጠኛ ተቋማትና ማህበራት ውስን የራሳቸው መግቢያ (አካውንት) ተሰጥቷቸው መረጃውን በቀጥታ ቢያቀርቡ ይመረጣል ወይስ በወረቀት መቀጠል?</w:t>
       </w:r>
     </w:p>
     <w:p>
@@ -6381,7 +6156,7 @@
         <w:rPr>
           <w:rFonts w:ascii="Nyala" w:cs="Nyala" w:eastAsia="Nyala" w:hAnsi="Nyala"/>
         </w:rPr>
-        <w:t xml:space="preserve">የዞኑ መምሪያ የሁሉንም ወረዳዎችና ከተሞች ዝርዝር ፋይሎች ማየት ይገባዋል?</w:t>
+        <w:t xml:space="preserve">በዞኑ ስንት የማሰልጠኛ ተቋማት፣ የጤና ተቋማት (የህክምና ማረጋገጫ የሚሰጡ) እና የትራንስፖርት ማህበራት አሉ? (ግምታዊ ቁጥር)</w:t>
       </w:r>
     </w:p>
     <w:tbl>
@@ -6498,7 +6273,7 @@
         <w:rPr>
           <w:rFonts w:ascii="Nyala" w:cs="Nyala" w:eastAsia="Nyala" w:hAnsi="Nyala"/>
         </w:rPr>
-        <w:t xml:space="preserve">ጥያቄ 9፦ የውጭ ተቋማት ተሳትፎ</w:t>
+        <w:t xml:space="preserve">ጥያቄ 9፦ የሠራተኞች ወርሃዊ የደመወዝ ዝርዝር ለፋይናንስ</w:t>
       </w:r>
     </w:p>
     <w:p>
@@ -6546,7 +6321,7 @@
         <w:rPr>
           <w:rFonts w:ascii="Nyala" w:cs="Nyala" w:eastAsia="Nyala" w:hAnsi="Nyala"/>
         </w:rPr>
-        <w:t xml:space="preserve">የብቃት ማረጋገጫና የህዝብ ትራንስፖርት ዳይሬክቶሬቶች</w:t>
+        <w:t xml:space="preserve">የሰው ሀብትና ፋይናንስ</w:t>
       </w:r>
     </w:p>
     <w:p>
@@ -6572,7 +6347,7 @@
         <w:rPr>
           <w:rFonts w:ascii="Nyala" w:cs="Nyala" w:eastAsia="Nyala" w:hAnsi="Nyala"/>
         </w:rPr>
-        <w:t xml:space="preserve">የማሰልጠኛ ተቋማት ሥልጠና ያጠናቀቁ ሠልጣኞችን ለምዘና ያቀርባሉ፤ የትራንስፖርት ማህበራት ወርሃዊ የስምሪት መርሃ ግብራቸውን በመርሃ ግብር አውጪ ኮሚቴ አዘጋጅተው ለማጽደቅ ያቀርባሉ። ለማሳያው እነዚህ መረጃዎች በመምሪያው ሠራተኛ ይመዘገባሉ። የሌሎቹ ባለድርሻ አካላት ተሳትፎ በጥያቄ 21 ተጠይቋል።</w:t>
+        <w:t xml:space="preserve">በአገልግሎቶቹ ዝርዝር መሠረት የሰው ሀብት ክፍል የሠራተኞችን ወርሃዊ ደመወዝ ለፋይናንስ ያስተላልፋል። ሥርዓቱ ይህንን ዝርዝር አዘጋጅቶ፣ አስጸድቆ ለፋይናንስ ይልካል፤ ክፍያውንና የሂሳብ ሥራውን ፋይናንስ ይሠራል። ይህ በኋለኛው ምዕራፍ የሚሠራ ቢሆንም አሁን ማወቁ ንድፉን ያግዛል።</w:t>
       </w:r>
     </w:p>
     <w:p>
@@ -6607,7 +6382,7 @@
         <w:rPr>
           <w:rFonts w:ascii="Nyala" w:cs="Nyala" w:eastAsia="Nyala" w:hAnsi="Nyala"/>
         </w:rPr>
-        <w:t xml:space="preserve">በኋለኛው ምዕራፍ ማሰልጠኛ ተቋማትና ማህበራት ውስን የራሳቸው መግቢያ (አካውንት) ተሰጥቷቸው መረጃውን በቀጥታ ቢያቀርቡ ይመረጣል ወይስ በወረቀት መቀጠል?</w:t>
+        <w:t xml:space="preserve">ለፋይናንስ የሚላከው ዝርዝር የገቢ ግብርንና የጡረታ መዋጮን አስልቶ ይይዛል ወይስ ጠቅላላ ደመወዝንና ጥቅማ ጥቅሞችን ብቻ?</w:t>
       </w:r>
     </w:p>
     <w:p>
@@ -6627,7 +6402,67 @@
         <w:rPr>
           <w:rFonts w:ascii="Nyala" w:cs="Nyala" w:eastAsia="Nyala" w:hAnsi="Nyala"/>
         </w:rPr>
-        <w:t xml:space="preserve">በዞኑ ስንት የማሰልጠኛ ተቋማት፣ የጤና ተቋማት (የህክምና ማረጋገጫ የሚሰጡ) እና የትራንስፖርት ማህበራት አሉ? (ግምታዊ ቁጥር)</w:t>
+        <w:t xml:space="preserve">የሚከፈሉ አበሎችና የሚደረጉ ተቀናሾች ምንድናቸው? (ለምሳሌ የትራንስፖርት፣ የኃላፊነት፣ የቤት አበል፤ ብድር፣ የማህበር መዋጮ፣ የፍርድ ቤት ትዕዛዝ)</w:t>
+      </w:r>
+    </w:p>
+    <w:p>
+      <w:pPr>
+        <w:spacing w:after="100" w:line="300"/>
+        <w:ind w:left="567" w:hanging="567"/>
+      </w:pPr>
+      <w:r>
+        <w:rPr>
+          <w:rFonts w:ascii="Nyala" w:cs="Nyala" w:eastAsia="Nyala" w:hAnsi="Nyala"/>
+          <w:b/>
+          <w:bCs/>
+        </w:rPr>
+        <w:t xml:space="preserve">9.3  </w:t>
+      </w:r>
+      <w:r>
+        <w:rPr>
+          <w:rFonts w:ascii="Nyala" w:cs="Nyala" w:eastAsia="Nyala" w:hAnsi="Nyala"/>
+        </w:rPr>
+        <w:t xml:space="preserve">የጡረታ መዋጮ መጠን (የሠራተኛው % እና የመንግሥት %) እና የሚሰላበት መሠረት (መሠረታዊ ደመወዝ ወይስ ጠቅላላ) ምንድን ነው?</w:t>
+      </w:r>
+    </w:p>
+    <w:p>
+      <w:pPr>
+        <w:spacing w:after="100" w:line="300"/>
+        <w:ind w:left="567" w:hanging="567"/>
+      </w:pPr>
+      <w:r>
+        <w:rPr>
+          <w:rFonts w:ascii="Nyala" w:cs="Nyala" w:eastAsia="Nyala" w:hAnsi="Nyala"/>
+          <w:b/>
+          <w:bCs/>
+        </w:rPr>
+        <w:t xml:space="preserve">9.4  </w:t>
+      </w:r>
+      <w:r>
+        <w:rPr>
+          <w:rFonts w:ascii="Nyala" w:cs="Nyala" w:eastAsia="Nyala" w:hAnsi="Nyala"/>
+        </w:rPr>
+        <w:t xml:space="preserve">ፋይናንስ የሚቀበለውን የዝርዝር ቅጽ ናሙና ያያይዙ (የግል መረጃው ተሸፍኖ)።</w:t>
+      </w:r>
+    </w:p>
+    <w:p>
+      <w:pPr>
+        <w:spacing w:after="100" w:line="300"/>
+        <w:ind w:left="567" w:hanging="567"/>
+      </w:pPr>
+      <w:r>
+        <w:rPr>
+          <w:rFonts w:ascii="Nyala" w:cs="Nyala" w:eastAsia="Nyala" w:hAnsi="Nyala"/>
+          <w:b/>
+          <w:bCs/>
+        </w:rPr>
+        <w:t xml:space="preserve">9.5  </w:t>
+      </w:r>
+      <w:r>
+        <w:rPr>
+          <w:rFonts w:ascii="Nyala" w:cs="Nyala" w:eastAsia="Nyala" w:hAnsi="Nyala"/>
+        </w:rPr>
+        <w:t xml:space="preserve">ዝርዝሩን ማን ያዘጋጃል፣ ማን ያረጋግጣል፣ ማን ያጸድቃል?</w:t>
       </w:r>
     </w:p>
     <w:tbl>
@@ -6744,7 +6579,7 @@
         <w:rPr>
           <w:rFonts w:ascii="Nyala" w:cs="Nyala" w:eastAsia="Nyala" w:hAnsi="Nyala"/>
         </w:rPr>
-        <w:t xml:space="preserve">ጥያቄ 10፦ የሠራተኞች ወርሃዊ የደመወዝ ዝርዝር ለፋይናንስ</w:t>
+        <w:t xml:space="preserve">ጥያቄ 10፦ በዓላትና የቁጥር አሰጣጥ</w:t>
       </w:r>
     </w:p>
     <w:p>
@@ -6768,7 +6603,7 @@
         <w:rPr>
           <w:rFonts w:ascii="Nyala" w:cs="Nyala" w:eastAsia="Nyala" w:hAnsi="Nyala"/>
         </w:rPr>
-        <w:t xml:space="preserve">ዝቅተኛ (ለኋለኛው ምዕራፍ)</w:t>
+        <w:t xml:space="preserve">ከፍተኛ (ከማሳያው በፊት ያስፈልጋል)</w:t>
       </w:r>
     </w:p>
     <w:p>
@@ -6792,7 +6627,7 @@
         <w:rPr>
           <w:rFonts w:ascii="Nyala" w:cs="Nyala" w:eastAsia="Nyala" w:hAnsi="Nyala"/>
         </w:rPr>
-        <w:t xml:space="preserve">የሰው ሀብትና ፋይናንስ</w:t>
+        <w:t xml:space="preserve">የሰው ሀብትና የብቃት ማረጋገጫ ዳይሬክቶሬት</w:t>
       </w:r>
     </w:p>
     <w:p>
@@ -6818,7 +6653,7 @@
         <w:rPr>
           <w:rFonts w:ascii="Nyala" w:cs="Nyala" w:eastAsia="Nyala" w:hAnsi="Nyala"/>
         </w:rPr>
-        <w:t xml:space="preserve">በአገልግሎቶቹ ዝርዝር መሠረት የሰው ሀብት ክፍል የሠራተኞችን ወርሃዊ ደመወዝ ለፋይናንስ ያስተላልፋል። ሥርዓቱ ይህንን ዝርዝር አዘጋጅቶ፣ አስጸድቆ ለፋይናንስ ይልካል፤ ክፍያውንና የሂሳብ ሥራውን ፋይናንስ ይሠራል። ይህ በኋለኛው ምዕራፍ የሚሠራ ቢሆንም አሁን ማወቁ ንድፉን ያግዛል።</w:t>
+        <w:t xml:space="preserve">የአገልግሎት ጊዜ በሥራ ቀናት ይሰላል፤ ስለዚህ የበዓላት ዝርዝር ያስፈልጋል። እንዲሁም ሥርዓቱ የሚሰጣቸው ቁጥሮች አሁን ካለው አሠራር ጋር መመሳሰል አለባቸው።</w:t>
       </w:r>
     </w:p>
     <w:p>
@@ -6853,7 +6688,7 @@
         <w:rPr>
           <w:rFonts w:ascii="Nyala" w:cs="Nyala" w:eastAsia="Nyala" w:hAnsi="Nyala"/>
         </w:rPr>
-        <w:t xml:space="preserve">ለፋይናንስ የሚላከው ዝርዝር የገቢ ግብርንና የጡረታ መዋጮን አስልቶ ይይዛል ወይስ ጠቅላላ ደመወዝንና ጥቅማ ጥቅሞችን ብቻ?</w:t>
+        <w:t xml:space="preserve">ጊፋታ (የወላይታ ዘመን መለወጫ) ለመንግሥት ሠራተኞች የሥራ ዕረፍት ቀን ነው? ሌሎች የዞኑ ወይም የክልሉ ልዩ የዕረፍት ቀናት አሉ?</w:t>
       </w:r>
     </w:p>
     <w:p>
@@ -6873,7 +6708,7 @@
         <w:rPr>
           <w:rFonts w:ascii="Nyala" w:cs="Nyala" w:eastAsia="Nyala" w:hAnsi="Nyala"/>
         </w:rPr>
-        <w:t xml:space="preserve">የሚከፈሉ አበሎችና የሚደረጉ ተቀናሾች ምንድናቸው? (ለምሳሌ የትራንስፖርት፣ የኃላፊነት፣ የቤት አበል፤ ብድር፣ የማህበር መዋጮ፣ የፍርድ ቤት ትዕዛዝ)</w:t>
+        <w:t xml:space="preserve">የመንጃ ፈቃድ ቁጥር፣ የደረሰኝ ቁጥር፣ የሰሌዳ፣ የቦሎ፣ የምስክር ወረቀትና የፋይል (የማመልከቻ) ቁጥሮች አሁን በምን ዓይነት ቅርጽ ይሰጣሉ? ምሳሌ ይጻፉ (ለምሳሌ ወላ/0123/2018)።</w:t>
       </w:r>
     </w:p>
     <w:p>
@@ -6893,47 +6728,7 @@
         <w:rPr>
           <w:rFonts w:ascii="Nyala" w:cs="Nyala" w:eastAsia="Nyala" w:hAnsi="Nyala"/>
         </w:rPr>
-        <w:t xml:space="preserve">የጡረታ መዋጮ መጠን (የሠራተኛው % እና የመንግሥት %) እና የሚሰላበት መሠረት (መሠረታዊ ደመወዝ ወይስ ጠቅላላ) ምንድን ነው?</w:t>
-      </w:r>
-    </w:p>
-    <w:p>
-      <w:pPr>
-        <w:spacing w:after="100" w:line="300"/>
-        <w:ind w:left="567" w:hanging="567"/>
-      </w:pPr>
-      <w:r>
-        <w:rPr>
-          <w:rFonts w:ascii="Nyala" w:cs="Nyala" w:eastAsia="Nyala" w:hAnsi="Nyala"/>
-          <w:b/>
-          <w:bCs/>
-        </w:rPr>
-        <w:t xml:space="preserve">10.4  </w:t>
-      </w:r>
-      <w:r>
-        <w:rPr>
-          <w:rFonts w:ascii="Nyala" w:cs="Nyala" w:eastAsia="Nyala" w:hAnsi="Nyala"/>
-        </w:rPr>
-        <w:t xml:space="preserve">ፋይናንስ የሚቀበለውን የዝርዝር ቅጽ ናሙና ያያይዙ (የግል መረጃው ተሸፍኖ)።</w:t>
-      </w:r>
-    </w:p>
-    <w:p>
-      <w:pPr>
-        <w:spacing w:after="100" w:line="300"/>
-        <w:ind w:left="567" w:hanging="567"/>
-      </w:pPr>
-      <w:r>
-        <w:rPr>
-          <w:rFonts w:ascii="Nyala" w:cs="Nyala" w:eastAsia="Nyala" w:hAnsi="Nyala"/>
-          <w:b/>
-          <w:bCs/>
-        </w:rPr>
-        <w:t xml:space="preserve">10.5  </w:t>
-      </w:r>
-      <w:r>
-        <w:rPr>
-          <w:rFonts w:ascii="Nyala" w:cs="Nyala" w:eastAsia="Nyala" w:hAnsi="Nyala"/>
-        </w:rPr>
-        <w:t xml:space="preserve">ዝርዝሩን ማን ያዘጋጃል፣ ማን ያረጋግጣል፣ ማን ያጸድቃል?</w:t>
+        <w:t xml:space="preserve">ቁጥሮቹ በየበጀት ዓመቱ እንደገና ከ1 ይጀምራሉ?</w:t>
       </w:r>
     </w:p>
     <w:tbl>
@@ -7050,7 +6845,7 @@
         <w:rPr>
           <w:rFonts w:ascii="Nyala" w:cs="Nyala" w:eastAsia="Nyala" w:hAnsi="Nyala"/>
         </w:rPr>
-        <w:t xml:space="preserve">ጥያቄ 11፦ የኢንተርኔት፣ የኮምፒውተርና የኤሌክትሪክ ሁኔታ</w:t>
+        <w:t xml:space="preserve">ጥያቄ 11፦ የተሽከርካሪ ምዝገባ፣ ሰሌዳና ዝውውር</w:t>
       </w:r>
     </w:p>
     <w:p>
@@ -7098,7 +6893,7 @@
         <w:rPr>
           <w:rFonts w:ascii="Nyala" w:cs="Nyala" w:eastAsia="Nyala" w:hAnsi="Nyala"/>
         </w:rPr>
-        <w:t xml:space="preserve">የአይሲቲ ባለሙያ / አስተዳደር</w:t>
+        <w:t xml:space="preserve">የአሽከርካሪና ተሽከርካሪ ብቃት ማረጋገጫ ዳይሬክቶሬት</w:t>
       </w:r>
     </w:p>
     <w:p>
@@ -7124,7 +6919,18 @@
         <w:rPr>
           <w:rFonts w:ascii="Nyala" w:cs="Nyala" w:eastAsia="Nyala" w:hAnsi="Nyala"/>
         </w:rPr>
-        <w:t xml:space="preserve">ሥርዓቱ የኢንተርኔት መቆራረጥን እንዲቋቋም ተደርጎ ይሠራል (ረቂቅ በኮምፒውተሩ ላይ ይቀመጣል፤ መስመሩ ሲመለስ ይላካል)። ለሙከራ ትግበራው ዕቅድ የእያንዳንዱን ጽ/ቤት ሁኔታ ማወቅ ያስፈልጋል።</w:t>
+        <w:t xml:space="preserve">መምሪያው በደብዳቤው የተሽከርካሪ ምዝገባ ማከናወንና ሰሌዳ መስጠትን እንዲሁም ዞኑን ለቀው ለሚሄዱ ተሽከርካሪዎች ዝውውር መፈጸምን ጠቅሷል። በባለድርሻነት የጉምሩክ ባለሥልጣን፣ የኢንሹራንስ ኩባንያዎች፣ የገቢ ቢሮዎችና የውልና ማስረጃ ምዝገባ ተጠቅሰዋል።</w:t>
+      </w:r>
+    </w:p>
+    <w:p>
+      <w:pPr>
+        <w:spacing w:after="120" w:line="300"/>
+      </w:pPr>
+      <w:r>
+        <w:rPr>
+          <w:rFonts w:ascii="Nyala" w:cs="Nyala" w:eastAsia="Nyala" w:hAnsi="Nyala"/>
+        </w:rPr>
+        <w:t xml:space="preserve">የትራንስፖርትና ሎጂስቲክስ ሚኒስቴር መመሪያ ቁጥር 1050/2025 (እ.ኤ.አ.) ክልላዊውን ምዝገባ በአገር አቀፍ መዝገብና በ"ETH" ሰሌዳ ይተካል። አገር አቀፉ ሥርዓት የመረጃው ባለቤት በሆነበት ሥራ ITRMS የራሱን የተለየ መዝገብ አይይዝም፤ የአገር አቀፉን ማጣቀሻ ቁጥር ብቻ ይመዘግባል።</w:t>
       </w:r>
     </w:p>
     <w:p>
@@ -7159,7 +6965,7 @@
         <w:rPr>
           <w:rFonts w:ascii="Nyala" w:cs="Nyala" w:eastAsia="Nyala" w:hAnsi="Nyala"/>
         </w:rPr>
-        <w:t xml:space="preserve">በተደጋጋሚ የኢንተርኔት ወይም የኤሌክትሪክ መቋረጥ የሚያጋጥማቸው ጽ/ቤቶች የትኞቹ ናቸው?</w:t>
+        <w:t xml:space="preserve">አዲስ ተሽከርካሪ የሚመዘግበው ማን ነው (ዞን፣ ከተማ፣ ክልል)? ለምዝገባ የሚቀርቡት ሰነዶች ምንድናቸው (የጉምሩክ ዲክላራሲዮን፣ የግዢ ደረሰኝ፣ የኢንሹራንስ ማስረጃ፣ የግብር ክሊራንስ …)? ቅጹን ያያይዙ።</w:t>
       </w:r>
     </w:p>
     <w:p>
@@ -7179,7 +6985,7 @@
         <w:rPr>
           <w:rFonts w:ascii="Nyala" w:cs="Nyala" w:eastAsia="Nyala" w:hAnsi="Nyala"/>
         </w:rPr>
-        <w:t xml:space="preserve">ጽ/ቤቶቹ የሚጠቀሙት የኢንተርኔት ዓይነት ምንድን ነው? (ብሮድባንድ፣ የሞባይል ዳታ፣ የመንግሥት ኔትወርክ (WAN)፣ የለም)</w:t>
+        <w:t xml:space="preserve">ሰሌዳ የሚያቀርበው ማን ነው? የሰሌዳ ቁጥር እንዴት ይሰጣል? ያልተሰጡ ሰሌዳዎች ክምችት እንዴት ይመዘገባል?</w:t>
       </w:r>
     </w:p>
     <w:p>
@@ -7199,7 +7005,7 @@
         <w:rPr>
           <w:rFonts w:ascii="Nyala" w:cs="Nyala" w:eastAsia="Nyala" w:hAnsi="Nyala"/>
         </w:rPr>
-        <w:t xml:space="preserve">በእያንዳንዱ ጽ/ቤት ለአገልግሎቱ የሚውሉ ኮምፒውተሮችና ማተሚያዎች ብዛት ስንት ነው?</w:t>
+        <w:t xml:space="preserve">ሊብሬ (የባለቤትነት ደብተር) የሚያትመውና ለጠፋ ሊብሬ ምትክ የሚሰጠው ማን ነው?</w:t>
       </w:r>
     </w:p>
     <w:p>
@@ -7219,7 +7025,67 @@
         <w:rPr>
           <w:rFonts w:ascii="Nyala" w:cs="Nyala" w:eastAsia="Nyala" w:hAnsi="Nyala"/>
         </w:rPr>
-        <w:t xml:space="preserve">ሥርዓቱ የሚጫንበት አገልጋይ (ሰርቨር) በክልሉ ቢሮ ይሆናል ወይስ በዞኑ? የመረጃ መጠባበቂያ (backup) የሚቀመጥበት ሁለተኛ ቦታ (ለምሳሌ ሌላ ቢሮ) አለ?</w:t>
+        <w:t xml:space="preserve">የባለቤትነት ዝውውር (ሽያጭ፣ ውርስ፣ ስጦታ) እንዴት ይፈጸማል? የውልና ማስረጃ ምዝገባና የገቢ ቢሮ ሚና ምንድን ነው?</w:t>
+      </w:r>
+    </w:p>
+    <w:p>
+      <w:pPr>
+        <w:spacing w:after="100" w:line="300"/>
+        <w:ind w:left="567" w:hanging="567"/>
+      </w:pPr>
+      <w:r>
+        <w:rPr>
+          <w:rFonts w:ascii="Nyala" w:cs="Nyala" w:eastAsia="Nyala" w:hAnsi="Nyala"/>
+          <w:b/>
+          <w:bCs/>
+        </w:rPr>
+        <w:t xml:space="preserve">11.5  </w:t>
+      </w:r>
+      <w:r>
+        <w:rPr>
+          <w:rFonts w:ascii="Nyala" w:cs="Nyala" w:eastAsia="Nyala" w:hAnsi="Nyala"/>
+        </w:rPr>
+        <w:t xml:space="preserve">ተሽከርካሪ ከዞኑ ሲወጣ ወይም ከሌላ ዞን/ክልል ሲገባ ያለው አሠራር እንዴት ነው? ፋይሉ እንዴት ይላካል፤ ተቀባዩ ጽ/ቤት እንዴት ይነገረዋል?</w:t>
+      </w:r>
+    </w:p>
+    <w:p>
+      <w:pPr>
+        <w:spacing w:after="100" w:line="300"/>
+        <w:ind w:left="567" w:hanging="567"/>
+      </w:pPr>
+      <w:r>
+        <w:rPr>
+          <w:rFonts w:ascii="Nyala" w:cs="Nyala" w:eastAsia="Nyala" w:hAnsi="Nyala"/>
+          <w:b/>
+          <w:bCs/>
+        </w:rPr>
+        <w:t xml:space="preserve">11.6  </w:t>
+      </w:r>
+      <w:r>
+        <w:rPr>
+          <w:rFonts w:ascii="Nyala" w:cs="Nyala" w:eastAsia="Nyala" w:hAnsi="Nyala"/>
+        </w:rPr>
+        <w:t xml:space="preserve">የእነዚህ አገልግሎቶች ክፍያ ስንት ነው? (ምዝገባ፣ ሰሌዳ፣ ሊብሬ፣ ዝውውር፣ ምትክ)</w:t>
+      </w:r>
+    </w:p>
+    <w:p>
+      <w:pPr>
+        <w:spacing w:after="100" w:line="300"/>
+        <w:ind w:left="567" w:hanging="567"/>
+      </w:pPr>
+      <w:r>
+        <w:rPr>
+          <w:rFonts w:ascii="Nyala" w:cs="Nyala" w:eastAsia="Nyala" w:hAnsi="Nyala"/>
+          <w:b/>
+          <w:bCs/>
+        </w:rPr>
+        <w:t xml:space="preserve">11.7  </w:t>
+      </w:r>
+      <w:r>
+        <w:rPr>
+          <w:rFonts w:ascii="Nyala" w:cs="Nyala" w:eastAsia="Nyala" w:hAnsi="Nyala"/>
+        </w:rPr>
+        <w:t xml:space="preserve">በዞኑ ያሉ የተሽከርካሪ ፋይሎች ብዛት በግምት ስንት ነው? በወረቀት መዝገብ፣ በኤክሴል ወይስ በክልሉ ሥርዓት ነው የሚገኙት?</w:t>
       </w:r>
     </w:p>
     <w:tbl>
@@ -7336,7 +7202,7 @@
         <w:rPr>
           <w:rFonts w:ascii="Nyala" w:cs="Nyala" w:eastAsia="Nyala" w:hAnsi="Nyala"/>
         </w:rPr>
-        <w:t xml:space="preserve">ጥያቄ 12፦ በዓላትና የቁጥር አሰጣጥ</w:t>
+        <w:t xml:space="preserve">ጥያቄ 12፦ የቴክኒክ ምርመራና ቦሎ</w:t>
       </w:r>
     </w:p>
     <w:p>
@@ -7360,7 +7226,7 @@
         <w:rPr>
           <w:rFonts w:ascii="Nyala" w:cs="Nyala" w:eastAsia="Nyala" w:hAnsi="Nyala"/>
         </w:rPr>
-        <w:t xml:space="preserve">ከፍተኛ (ከማሳያው በፊት ያስፈልጋል)</w:t>
+        <w:t xml:space="preserve">መካከለኛ</w:t>
       </w:r>
     </w:p>
     <w:p>
@@ -7384,7 +7250,7 @@
         <w:rPr>
           <w:rFonts w:ascii="Nyala" w:cs="Nyala" w:eastAsia="Nyala" w:hAnsi="Nyala"/>
         </w:rPr>
-        <w:t xml:space="preserve">የሰው ሀብትና የብቃት ማረጋገጫ ዳይሬክቶሬት</w:t>
+        <w:t xml:space="preserve">የአሽከርካሪና ተሽከርካሪ ብቃት ማረጋገጫ ዳይሬክቶሬት</w:t>
       </w:r>
     </w:p>
     <w:p>
@@ -7410,7 +7276,7 @@
         <w:rPr>
           <w:rFonts w:ascii="Nyala" w:cs="Nyala" w:eastAsia="Nyala" w:hAnsi="Nyala"/>
         </w:rPr>
-        <w:t xml:space="preserve">የአገልግሎት ጊዜ በሥራ ቀናት ይሰላል፤ ስለዚህ የበዓላት ዝርዝር ያስፈልጋል። እንዲሁም ሥርዓቱ የሚሰጣቸው ቁጥሮች አሁን ካለው አሠራር ጋር መመሳሰል አለባቸው።</w:t>
+        <w:t xml:space="preserve">ደብዳቤው የተሽከርካሪ ቴክኒክ ምርመራ ማድረግን፣ ቦሎ መስጠትንና ለጠፋ ቦሎ ምትክ መስጠትን ይጠቅሳል። የአሽከርካሪ (ተሽከርካሪ) ምርመራ ተቋማትና ጋራዦችም ባለድርሻ ተብለው ተዘርዝረዋል።</w:t>
       </w:r>
     </w:p>
     <w:p>
@@ -7445,7 +7311,7 @@
         <w:rPr>
           <w:rFonts w:ascii="Nyala" w:cs="Nyala" w:eastAsia="Nyala" w:hAnsi="Nyala"/>
         </w:rPr>
-        <w:t xml:space="preserve">ጊፋታ (የወላይታ ዘመን መለወጫ) ለመንግሥት ሠራተኞች የሥራ ዕረፍት ቀን ነው? ሌሎች የዞኑ ወይም የክልሉ ልዩ የዕረፍት ቀናት አሉ?</w:t>
+        <w:t xml:space="preserve">ዓመታዊ የቴክኒክ ምርመራውን የሚያከናውነው ማን ነው? (የመንግሥት የምርመራ ጣቢያ፣ የግል የምርመራ ተቋም፣ ሁለቱም) በዞኑ ስንት የምርመራ ተቋማት አሉ?</w:t>
       </w:r>
     </w:p>
     <w:p>
@@ -7465,7 +7331,7 @@
         <w:rPr>
           <w:rFonts w:ascii="Nyala" w:cs="Nyala" w:eastAsia="Nyala" w:hAnsi="Nyala"/>
         </w:rPr>
-        <w:t xml:space="preserve">የመንጃ ፈቃድ ቁጥር፣ የደረሰኝ ቁጥር፣ የሰሌዳ፣ የቦሎ፣ የምስክር ወረቀትና የፋይል (የማመልከቻ) ቁጥሮች አሁን በምን ዓይነት ቅርጽ ይሰጣሉ? ምሳሌ ይጻፉ (ለምሳሌ ወላ/0123/2018)።</w:t>
+        <w:t xml:space="preserve">የምርመራ ማረጋገጫ ዝርዝሩን (checklist) እና የውጤት መመዝገቢያውን ያያይዙ። ተሽከርካሪው ምርመራውን ካላለፈ ምን ይደረጋል?</w:t>
       </w:r>
     </w:p>
     <w:p>
@@ -7485,7 +7351,67 @@
         <w:rPr>
           <w:rFonts w:ascii="Nyala" w:cs="Nyala" w:eastAsia="Nyala" w:hAnsi="Nyala"/>
         </w:rPr>
-        <w:t xml:space="preserve">ቁጥሮቹ በየበጀት ዓመቱ እንደገና ከ1 ይጀምራሉ?</w:t>
+        <w:t xml:space="preserve">ቦሎ ከመሰጠቱ በፊት የሦስተኛ ወገን ኢንሹራንስ፣ የመንገድ ፈንድ ክፍያ ወይም ሌላ ማስረጃ ይጠየቃል?</w:t>
+      </w:r>
+    </w:p>
+    <w:p>
+      <w:pPr>
+        <w:spacing w:after="100" w:line="300"/>
+        <w:ind w:left="567" w:hanging="567"/>
+      </w:pPr>
+      <w:r>
+        <w:rPr>
+          <w:rFonts w:ascii="Nyala" w:cs="Nyala" w:eastAsia="Nyala" w:hAnsi="Nyala"/>
+          <w:b/>
+          <w:bCs/>
+        </w:rPr>
+        <w:t xml:space="preserve">12.4  </w:t>
+      </w:r>
+      <w:r>
+        <w:rPr>
+          <w:rFonts w:ascii="Nyala" w:cs="Nyala" w:eastAsia="Nyala" w:hAnsi="Nyala"/>
+        </w:rPr>
+        <w:t xml:space="preserve">የቦሎ ምልክቱን (ስቲከር) የሚያትመው ማን ነው? ተከታታይ ቁጥር አለው? ለጠፋ ቦሎ ምትክ የሚሰጠው እንዴትና በስንት ብር ነው?</w:t>
+      </w:r>
+    </w:p>
+    <w:p>
+      <w:pPr>
+        <w:spacing w:after="100" w:line="300"/>
+        <w:ind w:left="567" w:hanging="567"/>
+      </w:pPr>
+      <w:r>
+        <w:rPr>
+          <w:rFonts w:ascii="Nyala" w:cs="Nyala" w:eastAsia="Nyala" w:hAnsi="Nyala"/>
+          <w:b/>
+          <w:bCs/>
+        </w:rPr>
+        <w:t xml:space="preserve">12.5  </w:t>
+      </w:r>
+      <w:r>
+        <w:rPr>
+          <w:rFonts w:ascii="Nyala" w:cs="Nyala" w:eastAsia="Nyala" w:hAnsi="Nyala"/>
+        </w:rPr>
+        <w:t xml:space="preserve">የቦሎ ክፍያ ስንት ነው? እንደ ተሽከርካሪው ዓይነት ይለያያል?</w:t>
+      </w:r>
+    </w:p>
+    <w:p>
+      <w:pPr>
+        <w:spacing w:after="100" w:line="300"/>
+        <w:ind w:left="567" w:hanging="567"/>
+      </w:pPr>
+      <w:r>
+        <w:rPr>
+          <w:rFonts w:ascii="Nyala" w:cs="Nyala" w:eastAsia="Nyala" w:hAnsi="Nyala"/>
+          <w:b/>
+          <w:bCs/>
+        </w:rPr>
+        <w:t xml:space="preserve">12.6  </w:t>
+      </w:r>
+      <w:r>
+        <w:rPr>
+          <w:rFonts w:ascii="Nyala" w:cs="Nyala" w:eastAsia="Nyala" w:hAnsi="Nyala"/>
+        </w:rPr>
+        <w:t xml:space="preserve">የምርመራ ውጤቶች ለክልሉ ወይም ለሚኒስቴሩ እንዴት ሪፖርት ይደረጋሉ?</w:t>
       </w:r>
     </w:p>
     <w:tbl>
@@ -7602,7 +7528,7 @@
         <w:rPr>
           <w:rFonts w:ascii="Nyala" w:cs="Nyala" w:eastAsia="Nyala" w:hAnsi="Nyala"/>
         </w:rPr>
-        <w:t xml:space="preserve">ጥያቄ 13፦ የተሽከርካሪ ምዝገባ፣ ሰሌዳና ዝውውር</w:t>
+        <w:t xml:space="preserve">ጥያቄ 13፦ የአሽከርካሪ ማሰልጠኛ ተቋማት ክትትል</w:t>
       </w:r>
     </w:p>
     <w:p>
@@ -7676,18 +7602,7 @@
         <w:rPr>
           <w:rFonts w:ascii="Nyala" w:cs="Nyala" w:eastAsia="Nyala" w:hAnsi="Nyala"/>
         </w:rPr>
-        <w:t xml:space="preserve">መምሪያው በደብዳቤው የተሽከርካሪ ምዝገባ ማከናወንና ሰሌዳ መስጠትን እንዲሁም ዞኑን ለቀው ለሚሄዱ ተሽከርካሪዎች ዝውውር መፈጸምን ጠቅሷል። በባለድርሻነት የጉምሩክ ባለሥልጣን፣ የኢንሹራንስ ኩባንያዎች፣ የገቢ ቢሮዎችና የውልና ማስረጃ ምዝገባ ተጠቅሰዋል።</w:t>
-      </w:r>
-    </w:p>
-    <w:p>
-      <w:pPr>
-        <w:spacing w:after="120" w:line="300"/>
-      </w:pPr>
-      <w:r>
-        <w:rPr>
-          <w:rFonts w:ascii="Nyala" w:cs="Nyala" w:eastAsia="Nyala" w:hAnsi="Nyala"/>
-        </w:rPr>
-        <w:t xml:space="preserve">የትራንስፖርትና ሎጂስቲክስ ሚኒስቴር መመሪያ ቁጥር 1050/2025 (እ.ኤ.አ.) ክልላዊውን ምዝገባ በአገር አቀፍ መዝገብና በ"ETH" ሰሌዳ ይተካል። አገር አቀፉ ሥርዓት የመረጃው ባለቤት በሆነበት ሥራ ITRMS የራሱን የተለየ መዝገብ አይይዝም፤ የአገር አቀፉን ማጣቀሻ ቁጥር ብቻ ይመዘግባል።</w:t>
+        <w:t xml:space="preserve">ደብዳቤው ማሰልጠኛ ተቋማትን መከታተልንና የዕጩ አሽከርካሪዎችን የንድፈ ሀሳብና የሜዳ ፈተና መስጠትን ይጠቅሳል።</w:t>
       </w:r>
     </w:p>
     <w:p>
@@ -7722,7 +7637,7 @@
         <w:rPr>
           <w:rFonts w:ascii="Nyala" w:cs="Nyala" w:eastAsia="Nyala" w:hAnsi="Nyala"/>
         </w:rPr>
-        <w:t xml:space="preserve">አዲስ ተሽከርካሪ የሚመዘግበው ማን ነው (ዞን፣ ከተማ፣ ክልል)? ለምዝገባ የሚቀርቡት ሰነዶች ምንድናቸው (የጉምሩክ ዲክላራሲዮን፣ የግዢ ደረሰኝ፣ የኢንሹራንስ ማስረጃ፣ የግብር ክሊራንስ …)? ቅጹን ያያይዙ።</w:t>
+        <w:t xml:space="preserve">ለማሰልጠኛ ተቋማት የሥራ ፈቃድ የሚሰጠውና የሚያድሰው ማን ነው? መስፈርቶቹ ምንድናቸው?</w:t>
       </w:r>
     </w:p>
     <w:p>
@@ -7742,7 +7657,7 @@
         <w:rPr>
           <w:rFonts w:ascii="Nyala" w:cs="Nyala" w:eastAsia="Nyala" w:hAnsi="Nyala"/>
         </w:rPr>
-        <w:t xml:space="preserve">ሰሌዳ የሚያቀርበው ማን ነው? የሰሌዳ ቁጥር እንዴት ይሰጣል? ያልተሰጡ ሰሌዳዎች ክምችት እንዴት ይመዘገባል?</w:t>
+        <w:t xml:space="preserve">ተቋማቱ በምን ያህል ጊዜ ይጎበኛሉ (ይፈተሻሉ)? የክትትል ቅጹን ያያይዙ። ጉድለት ሲገኝ ምን ርምጃ ይወሰዳል?</w:t>
       </w:r>
     </w:p>
     <w:p>
@@ -7762,7 +7677,7 @@
         <w:rPr>
           <w:rFonts w:ascii="Nyala" w:cs="Nyala" w:eastAsia="Nyala" w:hAnsi="Nyala"/>
         </w:rPr>
-        <w:t xml:space="preserve">ሊብሬ (የባለቤትነት ደብተር) የሚያትመውና ለጠፋ ሊብሬ ምትክ የሚሰጠው ማን ነው?</w:t>
+        <w:t xml:space="preserve">ተቋማቱ ለፈተና የሚያቀርቡትን የሠልጣኞች ዝርዝር በምን ቅርጽና በምን ያህል ጊዜ ያቀርባሉ?</w:t>
       </w:r>
     </w:p>
     <w:p>
@@ -7782,67 +7697,7 @@
         <w:rPr>
           <w:rFonts w:ascii="Nyala" w:cs="Nyala" w:eastAsia="Nyala" w:hAnsi="Nyala"/>
         </w:rPr>
-        <w:t xml:space="preserve">የባለቤትነት ዝውውር (ሽያጭ፣ ውርስ፣ ስጦታ) እንዴት ይፈጸማል? የውልና ማስረጃ ምዝገባና የገቢ ቢሮ ሚና ምንድን ነው?</w:t>
-      </w:r>
-    </w:p>
-    <w:p>
-      <w:pPr>
-        <w:spacing w:after="100" w:line="300"/>
-        <w:ind w:left="567" w:hanging="567"/>
-      </w:pPr>
-      <w:r>
-        <w:rPr>
-          <w:rFonts w:ascii="Nyala" w:cs="Nyala" w:eastAsia="Nyala" w:hAnsi="Nyala"/>
-          <w:b/>
-          <w:bCs/>
-        </w:rPr>
-        <w:t xml:space="preserve">13.5  </w:t>
-      </w:r>
-      <w:r>
-        <w:rPr>
-          <w:rFonts w:ascii="Nyala" w:cs="Nyala" w:eastAsia="Nyala" w:hAnsi="Nyala"/>
-        </w:rPr>
-        <w:t xml:space="preserve">ተሽከርካሪ ከዞኑ ሲወጣ ወይም ከሌላ ዞን/ክልል ሲገባ ያለው አሠራር እንዴት ነው? ፋይሉ እንዴት ይላካል፤ ተቀባዩ ጽ/ቤት እንዴት ይነገረዋል?</w:t>
-      </w:r>
-    </w:p>
-    <w:p>
-      <w:pPr>
-        <w:spacing w:after="100" w:line="300"/>
-        <w:ind w:left="567" w:hanging="567"/>
-      </w:pPr>
-      <w:r>
-        <w:rPr>
-          <w:rFonts w:ascii="Nyala" w:cs="Nyala" w:eastAsia="Nyala" w:hAnsi="Nyala"/>
-          <w:b/>
-          <w:bCs/>
-        </w:rPr>
-        <w:t xml:space="preserve">13.6  </w:t>
-      </w:r>
-      <w:r>
-        <w:rPr>
-          <w:rFonts w:ascii="Nyala" w:cs="Nyala" w:eastAsia="Nyala" w:hAnsi="Nyala"/>
-        </w:rPr>
-        <w:t xml:space="preserve">የእነዚህ አገልግሎቶች ክፍያ ስንት ነው? (ምዝገባ፣ ሰሌዳ፣ ሊብሬ፣ ዝውውር፣ ምትክ)</w:t>
-      </w:r>
-    </w:p>
-    <w:p>
-      <w:pPr>
-        <w:spacing w:after="100" w:line="300"/>
-        <w:ind w:left="567" w:hanging="567"/>
-      </w:pPr>
-      <w:r>
-        <w:rPr>
-          <w:rFonts w:ascii="Nyala" w:cs="Nyala" w:eastAsia="Nyala" w:hAnsi="Nyala"/>
-          <w:b/>
-          <w:bCs/>
-        </w:rPr>
-        <w:t xml:space="preserve">13.7  </w:t>
-      </w:r>
-      <w:r>
-        <w:rPr>
-          <w:rFonts w:ascii="Nyala" w:cs="Nyala" w:eastAsia="Nyala" w:hAnsi="Nyala"/>
-        </w:rPr>
-        <w:t xml:space="preserve">በዞኑ ያሉ የተሽከርካሪ ፋይሎች ብዛት በግምት ስንት ነው? በወረቀት መዝገብ፣ በኤክሴል ወይስ በክልሉ ሥርዓት ነው የሚገኙት?</w:t>
+        <w:t xml:space="preserve">የፈተና ቀጠሮ እንዴት ይያዛል? በቀን ስንት ዕጩዎች መፈተን ይቻላል?</w:t>
       </w:r>
     </w:p>
     <w:tbl>
@@ -7959,7 +7814,7 @@
         <w:rPr>
           <w:rFonts w:ascii="Nyala" w:cs="Nyala" w:eastAsia="Nyala" w:hAnsi="Nyala"/>
         </w:rPr>
-        <w:t xml:space="preserve">ጥያቄ 14፦ የቴክኒክ ምርመራና ቦሎ</w:t>
+        <w:t xml:space="preserve">ጥያቄ 14፦ የህዝብ ትራንስፖርት፦ የስምሪት መስመሮች፣ መርሃ ግብርና ደረጃ</w:t>
       </w:r>
     </w:p>
     <w:p>
@@ -8007,7 +7862,7 @@
         <w:rPr>
           <w:rFonts w:ascii="Nyala" w:cs="Nyala" w:eastAsia="Nyala" w:hAnsi="Nyala"/>
         </w:rPr>
-        <w:t xml:space="preserve">የአሽከርካሪና ተሽከርካሪ ብቃት ማረጋገጫ ዳይሬክቶሬት</w:t>
+        <w:t xml:space="preserve">የህዝብ ትራንስፖርት ዳይሬክቶሬት</w:t>
       </w:r>
     </w:p>
     <w:p>
@@ -8033,7 +7888,7 @@
         <w:rPr>
           <w:rFonts w:ascii="Nyala" w:cs="Nyala" w:eastAsia="Nyala" w:hAnsi="Nyala"/>
         </w:rPr>
-        <w:t xml:space="preserve">ደብዳቤው የተሽከርካሪ ቴክኒክ ምርመራ ማድረግን፣ ቦሎ መስጠትንና ለጠፋ ቦሎ ምትክ መስጠትን ይጠቅሳል። የአሽከርካሪ (ተሽከርካሪ) ምርመራ ተቋማትና ጋራዦችም ባለድርሻ ተብለው ተዘርዝረዋል።</w:t>
+        <w:t xml:space="preserve">ደብዳቤው በህዝብ ትራንስፖርት አገልግሎት አደረጃጀት ብቃት ማረጋገጫ ሥራ አዳዲስ የስምሪት መስመሮችን መክፈትን፣ ወርሃዊ የስምሪት መርሃ ግብር ማጽደቅንና ዓመታዊ ደረጃ መስጠትን ይጠቅሳል። የህዝብና የከተማ ትራንስፖርት ማህበራትም ባለድርሻ ናቸው።</w:t>
       </w:r>
     </w:p>
     <w:p>
@@ -8068,7 +7923,7 @@
         <w:rPr>
           <w:rFonts w:ascii="Nyala" w:cs="Nyala" w:eastAsia="Nyala" w:hAnsi="Nyala"/>
         </w:rPr>
-        <w:t xml:space="preserve">ዓመታዊ የቴክኒክ ምርመራውን የሚያከናውነው ማን ነው? (የመንግሥት የምርመራ ጣቢያ፣ የግል የምርመራ ተቋም፣ ሁለቱም) በዞኑ ስንት የምርመራ ተቋማት አሉ?</w:t>
+        <w:t xml:space="preserve">አዲስ የስምሪት መስመር እንዴት ይከፈታል? ማን ይጠይቃል፣ ምን ዓይነት ጥናት ይደረጋል፣ ማን ያጸድቃል? የሚያስፈልጉ ሰነዶችን ያያይዙ።</w:t>
       </w:r>
     </w:p>
     <w:p>
@@ -8088,7 +7943,7 @@
         <w:rPr>
           <w:rFonts w:ascii="Nyala" w:cs="Nyala" w:eastAsia="Nyala" w:hAnsi="Nyala"/>
         </w:rPr>
-        <w:t xml:space="preserve">የምርመራ ማረጋገጫ ዝርዝሩን (checklist) እና የውጤት መመዝገቢያውን ያያይዙ። ተሽከርካሪው ምርመራውን ካላለፈ ምን ይደረጋል?</w:t>
+        <w:t xml:space="preserve">ወርሃዊ የስምሪት መርሃ ግብር ማን ያዘጋጃል፣ ማን ያጸድቃል? የመርሃ ግብሩን ቅጽ ያያይዙ።</w:t>
       </w:r>
     </w:p>
     <w:p>
@@ -8108,7 +7963,7 @@
         <w:rPr>
           <w:rFonts w:ascii="Nyala" w:cs="Nyala" w:eastAsia="Nyala" w:hAnsi="Nyala"/>
         </w:rPr>
-        <w:t xml:space="preserve">ቦሎ ከመሰጠቱ በፊት የሦስተኛ ወገን ኢንሹራንስ፣ የመንገድ ፈንድ ክፍያ ወይም ሌላ ማስረጃ ይጠየቃል?</w:t>
+        <w:t xml:space="preserve">"ዓመታዊ ደረጃ መስጠት" የሚሰጠው ለማን ነው (ለማህበራት፣ ለተሽከርካሪዎች፣ ለመስመሮች)? መስፈርቶቹና የነጥብ አሰጣጡ ምንድን ነው? ቅጹን ያያይዙ።</w:t>
       </w:r>
     </w:p>
     <w:p>
@@ -8128,7 +7983,7 @@
         <w:rPr>
           <w:rFonts w:ascii="Nyala" w:cs="Nyala" w:eastAsia="Nyala" w:hAnsi="Nyala"/>
         </w:rPr>
-        <w:t xml:space="preserve">የቦሎ ምልክቱን (ስቲከር) የሚያትመው ማን ነው? ተከታታይ ቁጥር አለው? ለጠፋ ቦሎ ምትክ የሚሰጠው እንዴትና በስንት ብር ነው?</w:t>
+        <w:t xml:space="preserve">የትራንስፖርት ታሪፍ የሚወስነው ማን ነው? ለተገልጋዮች እንዴት ይገለጻል?</w:t>
       </w:r>
     </w:p>
     <w:p>
@@ -8148,7 +8003,7 @@
         <w:rPr>
           <w:rFonts w:ascii="Nyala" w:cs="Nyala" w:eastAsia="Nyala" w:hAnsi="Nyala"/>
         </w:rPr>
-        <w:t xml:space="preserve">የቦሎ ክፍያ ስንት ነው? እንደ ተሽከርካሪው ዓይነት ይለያያል?</w:t>
+        <w:t xml:space="preserve">መናኸሪያዎችን የሚያስተዳድረው ማን ነው? በመናኸሪያ የሚሰበሰብ ክፍያ አለ?</w:t>
       </w:r>
     </w:p>
     <w:p>
@@ -8168,7 +8023,7 @@
         <w:rPr>
           <w:rFonts w:ascii="Nyala" w:cs="Nyala" w:eastAsia="Nyala" w:hAnsi="Nyala"/>
         </w:rPr>
-        <w:t xml:space="preserve">የምርመራ ውጤቶች ለክልሉ ወይም ለሚኒስቴሩ እንዴት ሪፖርት ይደረጋሉ?</w:t>
+        <w:t xml:space="preserve">የማህበራት ዓመታዊ የፈቃድ ዕድሳት መስፈርቶችና ክፍያ ምንድን ናቸው?</w:t>
       </w:r>
     </w:p>
     <w:tbl>
@@ -8285,7 +8140,7 @@
         <w:rPr>
           <w:rFonts w:ascii="Nyala" w:cs="Nyala" w:eastAsia="Nyala" w:hAnsi="Nyala"/>
         </w:rPr>
-        <w:t xml:space="preserve">ጥያቄ 15፦ የአሽከርካሪ ማሰልጠኛ ተቋማት ክትትል</w:t>
+        <w:t xml:space="preserve">ጥያቄ 15፦ የጭነት ትራንስፖርት ብቃት ማረጋገጫ</w:t>
       </w:r>
     </w:p>
     <w:p>
@@ -8333,7 +8188,7 @@
         <w:rPr>
           <w:rFonts w:ascii="Nyala" w:cs="Nyala" w:eastAsia="Nyala" w:hAnsi="Nyala"/>
         </w:rPr>
-        <w:t xml:space="preserve">የአሽከርካሪና ተሽከርካሪ ብቃት ማረጋገጫ ዳይሬክቶሬት</w:t>
+        <w:t xml:space="preserve">የጭነት ትራንስፖርት ብቃት ማረጋገጫ ዳይሬክቶሬት</w:t>
       </w:r>
     </w:p>
     <w:p>
@@ -8359,7 +8214,7 @@
         <w:rPr>
           <w:rFonts w:ascii="Nyala" w:cs="Nyala" w:eastAsia="Nyala" w:hAnsi="Nyala"/>
         </w:rPr>
-        <w:t xml:space="preserve">ደብዳቤው ማሰልጠኛ ተቋማትን መከታተልንና የዕጩ አሽከርካሪዎችን የንድፈ ሀሳብና የሜዳ ፈተና መስጠትን ይጠቅሳል።</w:t>
+        <w:t xml:space="preserve">ደብዳቤው በጭነት ትራንስፖርት ብቃት ማረጋገጫ ሥራ ሂደት አዲስ ለመጡ ተሽከርካሪዎች የብቃት ማረጋገጫ ወረቀት መስጠትንና ለነባር ተሽከርካሪዎች የማረጋገጫ ምስክር ወረቀት ማሳደስን ይጠቅሳል።</w:t>
       </w:r>
     </w:p>
     <w:p>
@@ -8394,7 +8249,7 @@
         <w:rPr>
           <w:rFonts w:ascii="Nyala" w:cs="Nyala" w:eastAsia="Nyala" w:hAnsi="Nyala"/>
         </w:rPr>
-        <w:t xml:space="preserve">ለማሰልጠኛ ተቋማት የሥራ ፈቃድ የሚሰጠውና የሚያድሰው ማን ነው? መስፈርቶቹ ምንድናቸው?</w:t>
+        <w:t xml:space="preserve">የብቃት ማረጋገጫ ወረቀቱ የሚሰጠው ለተሽከርካሪው ነው ወይስ ለባለንብረቱ/ለድርጅቱ? መስፈርቶቹ ምንድናቸው፤ ለምን ያህል ጊዜ ያገለግላል?</w:t>
       </w:r>
     </w:p>
     <w:p>
@@ -8414,7 +8269,7 @@
         <w:rPr>
           <w:rFonts w:ascii="Nyala" w:cs="Nyala" w:eastAsia="Nyala" w:hAnsi="Nyala"/>
         </w:rPr>
-        <w:t xml:space="preserve">ተቋማቱ በምን ያህል ጊዜ ይጎበኛሉ (ይፈተሻሉ)? የክትትል ቅጹን ያያይዙ። ጉድለት ሲገኝ ምን ርምጃ ይወሰዳል?</w:t>
+        <w:t xml:space="preserve">የዕድሳት አሠራሩና ክፍያው ምንድን ነው? ዘግይቶ ሲታደስ ቅጣት አለ?</w:t>
       </w:r>
     </w:p>
     <w:p>
@@ -8434,7 +8289,7 @@
         <w:rPr>
           <w:rFonts w:ascii="Nyala" w:cs="Nyala" w:eastAsia="Nyala" w:hAnsi="Nyala"/>
         </w:rPr>
-        <w:t xml:space="preserve">ተቋማቱ ለፈተና የሚያቀርቡትን የሠልጣኞች ዝርዝር በምን ቅርጽና በምን ያህል ጊዜ ያቀርባሉ?</w:t>
+        <w:t xml:space="preserve">የጭነት ትራንስፖርት ማህበራት ወይም ድርጅቶች በዞኑ ይመዘገባሉ? እንዴት?</w:t>
       </w:r>
     </w:p>
     <w:p>
@@ -8454,7 +8309,7 @@
         <w:rPr>
           <w:rFonts w:ascii="Nyala" w:cs="Nyala" w:eastAsia="Nyala" w:hAnsi="Nyala"/>
         </w:rPr>
-        <w:t xml:space="preserve">የፈተና ቀጠሮ እንዴት ይያዛል? በቀን ስንት ዕጩዎች መፈተን ይቻላል?</w:t>
+        <w:t xml:space="preserve">የምስክር ወረቀቱን ናሙና ያያይዙ (የግል መረጃው ተሸፍኖ)።</w:t>
       </w:r>
     </w:p>
     <w:tbl>
@@ -8571,7 +8426,7 @@
         <w:rPr>
           <w:rFonts w:ascii="Nyala" w:cs="Nyala" w:eastAsia="Nyala" w:hAnsi="Nyala"/>
         </w:rPr>
-        <w:t xml:space="preserve">ጥያቄ 16፦ የህዝብ ትራንስፖርት፦ የስምሪት መስመሮች፣ መርሃ ግብርና ደረጃ</w:t>
+        <w:t xml:space="preserve">ጥያቄ 16፦ የመንገድ ትራፊክ ደህንነትና ቁጥጥር</w:t>
       </w:r>
     </w:p>
     <w:p>
@@ -8619,7 +8474,7 @@
         <w:rPr>
           <w:rFonts w:ascii="Nyala" w:cs="Nyala" w:eastAsia="Nyala" w:hAnsi="Nyala"/>
         </w:rPr>
-        <w:t xml:space="preserve">የህዝብ ትራንስፖርት ዳይሬክቶሬት</w:t>
+        <w:t xml:space="preserve">የመንገድ ትራፊክ ደህንነት ዳይሬክቶሬት</w:t>
       </w:r>
     </w:p>
     <w:p>
@@ -8645,7 +8500,18 @@
         <w:rPr>
           <w:rFonts w:ascii="Nyala" w:cs="Nyala" w:eastAsia="Nyala" w:hAnsi="Nyala"/>
         </w:rPr>
-        <w:t xml:space="preserve">ደብዳቤው በህዝብ ትራንስፖርት አገልግሎት አደረጃጀት ብቃት ማረጋገጫ ሥራ አዳዲስ የስምሪት መስመሮችን መክፈትን፣ ወርሃዊ የስምሪት መርሃ ግብር ማጽደቅንና ዓመታዊ ደረጃ መስጠትን ይጠቅሳል። የህዝብና የከተማ ትራንስፖርት ማህበራትም ባለድርሻ ናቸው።</w:t>
+        <w:t xml:space="preserve">ደብዳቤው በመንገድ ትራፊክ ደህንነት ሥራ ሂደት መደበኛና ድንገተኛ ቁጥጥር ማድረግን፣ የትራፊክ ደንብ ተላልፈው የተከሰሱ አሽከርካሪዎች ላይ ገንዘብ መሰብሰብንና የገንዘብ ማሰባሰቢያ ሥራ መሥራትን ይጠቅሳል። የፖሊስ መምሪያዎች (ትራፊክ ፖሊስ)፣ የመንገድ ፈንድ፣ የኢንሹራንስ ኩባንያዎች፣ የጤና ተቋማትና መገናኛ ብዙሀን ባለድርሻ ናቸው።</w:t>
+      </w:r>
+    </w:p>
+    <w:p>
+      <w:pPr>
+        <w:spacing w:after="120" w:line="300"/>
+      </w:pPr>
+      <w:r>
+        <w:rPr>
+          <w:rFonts w:ascii="Nyala" w:cs="Nyala" w:eastAsia="Nyala" w:hAnsi="Nyala"/>
+        </w:rPr>
+        <w:t xml:space="preserve">የፌዴራል በነጥብ ላይ የተመሠረተ የትራፊክ ቅጣት ሥርዓት ተጀምሯል፤ ITRMS ከሱ ጋር ተገናኝቶ ይሠራል እንጂ አይተካውም።</w:t>
       </w:r>
     </w:p>
     <w:p>
@@ -8680,7 +8546,7 @@
         <w:rPr>
           <w:rFonts w:ascii="Nyala" w:cs="Nyala" w:eastAsia="Nyala" w:hAnsi="Nyala"/>
         </w:rPr>
-        <w:t xml:space="preserve">አዲስ የስምሪት መስመር እንዴት ይከፈታል? ማን ይጠይቃል፣ ምን ዓይነት ጥናት ይደረጋል፣ ማን ያጸድቃል? የሚያስፈልጉ ሰነዶችን ያያይዙ።</w:t>
+        <w:t xml:space="preserve">መደበኛና ድንገተኛ ቁጥጥር የሚያደርገው ማን ነው? ውጤቱ በምን ቅጽ ይመዘገባል? በግኝቱ ላይ ምን ርምጃ ይወሰዳል?</w:t>
       </w:r>
     </w:p>
     <w:p>
@@ -8700,7 +8566,7 @@
         <w:rPr>
           <w:rFonts w:ascii="Nyala" w:cs="Nyala" w:eastAsia="Nyala" w:hAnsi="Nyala"/>
         </w:rPr>
-        <w:t xml:space="preserve">ወርሃዊ የስምሪት መርሃ ግብር ማን ያዘጋጃል፣ ማን ያጸድቃል? የመርሃ ግብሩን ቅጽ ያያይዙ።</w:t>
+        <w:t xml:space="preserve">የትራፊክ ደንብ ተላልፈው የተከሰሱ አሽከርካሪዎች ክስ የሚጻፈው በማን ነው? ቅጣቱ የት ይከፈላል፣ ደረሰኝ ማን ይሰጣል? የመምሪያው ሚና ምንድን ነው?</w:t>
       </w:r>
     </w:p>
     <w:p>
@@ -8720,7 +8586,7 @@
         <w:rPr>
           <w:rFonts w:ascii="Nyala" w:cs="Nyala" w:eastAsia="Nyala" w:hAnsi="Nyala"/>
         </w:rPr>
-        <w:t xml:space="preserve">"ዓመታዊ ደረጃ መስጠት" የሚሰጠው ለማን ነው (ለማህበራት፣ ለተሽከርካሪዎች፣ ለመስመሮች)? መስፈርቶቹና የነጥብ አሰጣጡ ምንድን ነው? ቅጹን ያያይዙ።</w:t>
+        <w:t xml:space="preserve">የትራፊክ አደጋ መረጃ የሚመዘግበው ማን ነው? ለክልሉ፣ ለመንገድ ፈንድ ወይም ለኢንሹራንስ ፈንድ እንዴት ሪፖርት ይደረጋል? ቅጹን ያያይዙ።</w:t>
       </w:r>
     </w:p>
     <w:p>
@@ -8740,7 +8606,7 @@
         <w:rPr>
           <w:rFonts w:ascii="Nyala" w:cs="Nyala" w:eastAsia="Nyala" w:hAnsi="Nyala"/>
         </w:rPr>
-        <w:t xml:space="preserve">የትራንስፖርት ታሪፍ የሚወስነው ማን ነው? ለተገልጋዮች እንዴት ይገለጻል?</w:t>
+        <w:t xml:space="preserve">የትራፊክ ደህንነት ክበባት (በትምህርት ቤቶችና በቀበሌዎች) እና የግንዛቤ ማስጨበጫ ሥራዎች እንዴት ይመዘገባሉ? ከመገናኛ ብዙሀን ጋር ያለው ግንኙነት ምንድን ነው?</w:t>
       </w:r>
     </w:p>
     <w:p>
@@ -8760,27 +8626,7 @@
         <w:rPr>
           <w:rFonts w:ascii="Nyala" w:cs="Nyala" w:eastAsia="Nyala" w:hAnsi="Nyala"/>
         </w:rPr>
-        <w:t xml:space="preserve">መናኸሪያዎችን የሚያስተዳድረው ማን ነው? በመናኸሪያ የሚሰበሰብ ክፍያ አለ?</w:t>
-      </w:r>
-    </w:p>
-    <w:p>
-      <w:pPr>
-        <w:spacing w:after="100" w:line="300"/>
-        <w:ind w:left="567" w:hanging="567"/>
-      </w:pPr>
-      <w:r>
-        <w:rPr>
-          <w:rFonts w:ascii="Nyala" w:cs="Nyala" w:eastAsia="Nyala" w:hAnsi="Nyala"/>
-          <w:b/>
-          <w:bCs/>
-        </w:rPr>
-        <w:t xml:space="preserve">16.6  </w:t>
-      </w:r>
-      <w:r>
-        <w:rPr>
-          <w:rFonts w:ascii="Nyala" w:cs="Nyala" w:eastAsia="Nyala" w:hAnsi="Nyala"/>
-        </w:rPr>
-        <w:t xml:space="preserve">የማህበራት ዓመታዊ የፈቃድ ዕድሳት መስፈርቶችና ክፍያ ምንድን ናቸው?</w:t>
+        <w:t xml:space="preserve">ከፌዴራሉ የነጥብ ቅጣት ሥርዓት ጋር የተገናኘ አሠራር አለ? የትኛው ክፍል ያስተዳድረዋል?</w:t>
       </w:r>
     </w:p>
     <w:tbl>
@@ -8897,7 +8743,7 @@
         <w:rPr>
           <w:rFonts w:ascii="Nyala" w:cs="Nyala" w:eastAsia="Nyala" w:hAnsi="Nyala"/>
         </w:rPr>
-        <w:t xml:space="preserve">ጥያቄ 17፦ የጭነት ትራንስፖርት ብቃት ማረጋገጫ</w:t>
+        <w:t xml:space="preserve">ጥያቄ 17፦ የመንገድ ግንባታና የጥገና ቁጥጥር</w:t>
       </w:r>
     </w:p>
     <w:p>
@@ -8945,7 +8791,7 @@
         <w:rPr>
           <w:rFonts w:ascii="Nyala" w:cs="Nyala" w:eastAsia="Nyala" w:hAnsi="Nyala"/>
         </w:rPr>
-        <w:t xml:space="preserve">የጭነት ትራንስፖርት ብቃት ማረጋገጫ ዳይሬክቶሬት</w:t>
+        <w:t xml:space="preserve">የመንገድ ዘርፍ ሥራ ክፍሎች (ግንባታና ጥገና)</w:t>
       </w:r>
     </w:p>
     <w:p>
@@ -8971,7 +8817,7 @@
         <w:rPr>
           <w:rFonts w:ascii="Nyala" w:cs="Nyala" w:eastAsia="Nyala" w:hAnsi="Nyala"/>
         </w:rPr>
-        <w:t xml:space="preserve">ደብዳቤው በጭነት ትራንስፖርት ብቃት ማረጋገጫ ሥራ ሂደት አዲስ ለመጡ ተሽከርካሪዎች የብቃት ማረጋገጫ ወረቀት መስጠትንና ለነባር ተሽከርካሪዎች የማረጋገጫ ምስክር ወረቀት ማሳደስን ይጠቅሳል።</w:t>
+        <w:t xml:space="preserve">ደብዳቤው በመንገድ ዘርፍ የሥራ ክፍሎች አዲስ መንገድ መገንባትንና የጥገና ቁጥጥር ማድረግን ይጠቅሳል። የመንገድ ፈንድና የኢትዮጵያ መንገዶች አስተዳደር ባለድርሻ ናቸው።</w:t>
       </w:r>
     </w:p>
     <w:p>
@@ -9006,7 +8852,7 @@
         <w:rPr>
           <w:rFonts w:ascii="Nyala" w:cs="Nyala" w:eastAsia="Nyala" w:hAnsi="Nyala"/>
         </w:rPr>
-        <w:t xml:space="preserve">የብቃት ማረጋገጫ ወረቀቱ የሚሰጠው ለተሽከርካሪው ነው ወይስ ለባለንብረቱ/ለድርጅቱ? መስፈርቶቹ ምንድናቸው፤ ለምን ያህል ጊዜ ያገለግላል?</w:t>
+        <w:t xml:space="preserve">ዞኑና ወረዳዎቹ የሚያስተዳድሩት የመንገድ መረብ ምንድን ነው (የገጠር መንገዶች፣ የማህበረሰብ መንገዶች፣ ወደ DC3 የሚሻሻሉ መንገዶች …)? የመንገድ ቆጠራ (inventory) መዝገብ አለ?</w:t>
       </w:r>
     </w:p>
     <w:p>
@@ -9026,7 +8872,7 @@
         <w:rPr>
           <w:rFonts w:ascii="Nyala" w:cs="Nyala" w:eastAsia="Nyala" w:hAnsi="Nyala"/>
         </w:rPr>
-        <w:t xml:space="preserve">የዕድሳት አሠራሩና ክፍያው ምንድን ነው? ዘግይቶ ሲታደስ ቅጣት አለ?</w:t>
+        <w:t xml:space="preserve">አዲስ የመንገድ ፕሮጀክት እንዴት ይለያል፣ ይጸድቃል፣ በጀቱ ከየት ይገኛል? (የመንገድ ፈንድ፣ ክልል፣ ወረዳ፣ የማህበረሰብ ተሳትፎ)</w:t>
       </w:r>
     </w:p>
     <w:p>
@@ -9046,7 +8892,7 @@
         <w:rPr>
           <w:rFonts w:ascii="Nyala" w:cs="Nyala" w:eastAsia="Nyala" w:hAnsi="Nyala"/>
         </w:rPr>
-        <w:t xml:space="preserve">የጭነት ትራንስፖርት ማህበራት ወይም ድርጅቶች በዞኑ ይመዘገባሉ? እንዴት?</w:t>
+        <w:t xml:space="preserve">የጥገና ቁጥጥር በምን ያህል ጊዜ ይደረጋል? የመንገድ ሁኔታ መገምገሚያ ቅጽና የጥገና ቅድሚያ አሰጣጥ ዘዴ ምንድን ነው?</w:t>
       </w:r>
     </w:p>
     <w:p>
@@ -9066,7 +8912,27 @@
         <w:rPr>
           <w:rFonts w:ascii="Nyala" w:cs="Nyala" w:eastAsia="Nyala" w:hAnsi="Nyala"/>
         </w:rPr>
-        <w:t xml:space="preserve">የምስክር ወረቀቱን ናሙና ያያይዙ (የግል መረጃው ተሸፍኖ)።</w:t>
+        <w:t xml:space="preserve">የግንባታ ሥራዎች የአካልና የፋይናንስ አፈጻጸም ሪፖርት ለማን፣ በምን ያህል ጊዜ ይላካል? ቅጹን ያያይዙ።</w:t>
+      </w:r>
+    </w:p>
+    <w:p>
+      <w:pPr>
+        <w:spacing w:after="100" w:line="300"/>
+        <w:ind w:left="567" w:hanging="567"/>
+      </w:pPr>
+      <w:r>
+        <w:rPr>
+          <w:rFonts w:ascii="Nyala" w:cs="Nyala" w:eastAsia="Nyala" w:hAnsi="Nyala"/>
+          <w:b/>
+          <w:bCs/>
+        </w:rPr>
+        <w:t xml:space="preserve">17.5  </w:t>
+      </w:r>
+      <w:r>
+        <w:rPr>
+          <w:rFonts w:ascii="Nyala" w:cs="Nyala" w:eastAsia="Nyala" w:hAnsi="Nyala"/>
+        </w:rPr>
+        <w:t xml:space="preserve">ለመንገድ ፈንድ ወይም ለኢትዮጵያ መንገዶች አስተዳደር የሚላኩ ሪፖርቶች ምንድናቸው?</w:t>
       </w:r>
     </w:p>
     <w:tbl>
@@ -9183,7 +9049,7 @@
         <w:rPr>
           <w:rFonts w:ascii="Nyala" w:cs="Nyala" w:eastAsia="Nyala" w:hAnsi="Nyala"/>
         </w:rPr>
-        <w:t xml:space="preserve">ጥያቄ 18፦ የመንገድ ትራፊክ ደህንነትና ቁጥጥር</w:t>
+        <w:t xml:space="preserve">ጥያቄ 18፦ የመንገድ ዲዛይንና የውል አስተዳደር</w:t>
       </w:r>
     </w:p>
     <w:p>
@@ -9231,7 +9097,7 @@
         <w:rPr>
           <w:rFonts w:ascii="Nyala" w:cs="Nyala" w:eastAsia="Nyala" w:hAnsi="Nyala"/>
         </w:rPr>
-        <w:t xml:space="preserve">የመንገድ ትራፊክ ደህንነት ዳይሬክቶሬት</w:t>
+        <w:t xml:space="preserve">የዲዛይንና የውል አስተዳደር ዳይሬክቶሬት</w:t>
       </w:r>
     </w:p>
     <w:p>
@@ -9257,18 +9123,7 @@
         <w:rPr>
           <w:rFonts w:ascii="Nyala" w:cs="Nyala" w:eastAsia="Nyala" w:hAnsi="Nyala"/>
         </w:rPr>
-        <w:t xml:space="preserve">ደብዳቤው በመንገድ ትራፊክ ደህንነት ሥራ ሂደት መደበኛና ድንገተኛ ቁጥጥር ማድረግን፣ የትራፊክ ደንብ ተላልፈው የተከሰሱ አሽከርካሪዎች ላይ ገንዘብ መሰብሰብንና የገንዘብ ማሰባሰቢያ ሥራ መሥራትን ይጠቅሳል። የፖሊስ መምሪያዎች (ትራፊክ ፖሊስ)፣ የመንገድ ፈንድ፣ የኢንሹራንስ ኩባንያዎች፣ የጤና ተቋማትና መገናኛ ብዙሀን ባለድርሻ ናቸው።</w:t>
-      </w:r>
-    </w:p>
-    <w:p>
-      <w:pPr>
-        <w:spacing w:after="120" w:line="300"/>
-      </w:pPr>
-      <w:r>
-        <w:rPr>
-          <w:rFonts w:ascii="Nyala" w:cs="Nyala" w:eastAsia="Nyala" w:hAnsi="Nyala"/>
-        </w:rPr>
-        <w:t xml:space="preserve">የፌዴራል በነጥብ ላይ የተመሠረተ የትራፊክ ቅጣት ሥርዓት ተጀምሯል፤ ITRMS ከሱ ጋር ተገናኝቶ ይሠራል እንጂ አይተካውም።</w:t>
+        <w:t xml:space="preserve">ደብዳቤው አዳዲስ መንገዶችን ዲዛይን ማሠራትን፣ የተቋራጭና የአማካሪ የውል ሰነድ ማዘጋጀትን፣ የአዳዲስ ፕሮጀክቶች ውል ማስገባትን፣ በግንባታ ላይ ላሉ ድልድዮችና መንገዶች የክፍያ ሰነድ ማዘጋጀትንና ለአዳዲስ ፕሮጀክቶች የቅድመ ክፍያ ሰነድ ማዘጋጀትን ይጠቅሳል። አማካሪዎችና ተቋራጮች እንዲሁም የፋይናንስ ቢሮዎች ባለድርሻ ናቸው።</w:t>
       </w:r>
     </w:p>
     <w:p>
@@ -9303,7 +9158,7 @@
         <w:rPr>
           <w:rFonts w:ascii="Nyala" w:cs="Nyala" w:eastAsia="Nyala" w:hAnsi="Nyala"/>
         </w:rPr>
-        <w:t xml:space="preserve">መደበኛና ድንገተኛ ቁጥጥር የሚያደርገው ማን ነው? ውጤቱ በምን ቅጽ ይመዘገባል? በግኝቱ ላይ ምን ርምጃ ይወሰዳል?</w:t>
+        <w:t xml:space="preserve">ዲዛይን በመምሪያው ባለሙያዎች ነው የሚሠራው ወይስ በአማካሪዎች? የትኛውን የዲዛይን ደረጃ (ለምሳሌ የኢትዮጵያ መንገዶች አስተዳደር ማኑዋሎች፣ DC3) ይጠቀማሉ? ዲዛይኑን ማን ያጸድቃል?</w:t>
       </w:r>
     </w:p>
     <w:p>
@@ -9323,7 +9178,7 @@
         <w:rPr>
           <w:rFonts w:ascii="Nyala" w:cs="Nyala" w:eastAsia="Nyala" w:hAnsi="Nyala"/>
         </w:rPr>
-        <w:t xml:space="preserve">የትራፊክ ደንብ ተላልፈው የተከሰሱ አሽከርካሪዎች ክስ የሚጻፈው በማን ነው? ቅጣቱ የት ይከፈላል፣ ደረሰኝ ማን ይሰጣል? የመምሪያው ሚና ምንድን ነው?</w:t>
+        <w:t xml:space="preserve">የጨረታና የውል ሰነዶች የሚዘጋጁት በየትኛው የግዢ ሕግ ወይም መመሪያ መሠረት ነው? ሰነዱን ማን ያዘጋጃል፣ የግምገማ ኮሚቴው ማን ነው? ናሙና ሰነዶችን ያያይዙ።</w:t>
       </w:r>
     </w:p>
     <w:p>
@@ -9343,7 +9198,7 @@
         <w:rPr>
           <w:rFonts w:ascii="Nyala" w:cs="Nyala" w:eastAsia="Nyala" w:hAnsi="Nyala"/>
         </w:rPr>
-        <w:t xml:space="preserve">የትራፊክ አደጋ መረጃ የሚመዘግበው ማን ነው? ለክልሉ፣ ለመንገድ ፈንድ ወይም ለኢንሹራንስ ፈንድ እንዴት ሪፖርት ይደረጋል? ቅጹን ያያይዙ።</w:t>
+        <w:t xml:space="preserve">ከክልሉ የሚላከው የቁርጥ ዋጋ (unit rate) እንዴት ይደርሳል፣ በምን ያህል ጊዜ ይሻሻላል? የቅርብ ጊዜውን ቅጂ ያያይዙ።</w:t>
       </w:r>
     </w:p>
     <w:p>
@@ -9363,7 +9218,7 @@
         <w:rPr>
           <w:rFonts w:ascii="Nyala" w:cs="Nyala" w:eastAsia="Nyala" w:hAnsi="Nyala"/>
         </w:rPr>
-        <w:t xml:space="preserve">የትራፊክ ደህንነት ክበባት (በትምህርት ቤቶችና በቀበሌዎች) እና የግንዛቤ ማስጨበጫ ሥራዎች እንዴት ይመዘገባሉ? ከመገናኛ ብዙሀን ጋር ያለው ግንኙነት ምንድን ነው?</w:t>
+        <w:t xml:space="preserve">ውል የሚፈርመው ማን ነው? የገንዘብ መጠንን መሠረት ያደረገ የማጽደቅ ደረጃ አለ?</w:t>
       </w:r>
     </w:p>
     <w:p>
@@ -9383,7 +9238,47 @@
         <w:rPr>
           <w:rFonts w:ascii="Nyala" w:cs="Nyala" w:eastAsia="Nyala" w:hAnsi="Nyala"/>
         </w:rPr>
-        <w:t xml:space="preserve">ከፌዴራሉ የነጥብ ቅጣት ሥርዓት ጋር የተገናኘ አሠራር አለ? የትኛው ክፍል ያስተዳድረዋል?</w:t>
+        <w:t xml:space="preserve">ለመንገድና ለድልድይ ሥራዎች የክፍያ ሰርተፍኬት (ጊዜያዊና የመጨረሻ) እንዴት ይዘጋጃል? ልኬቱን ማን ይወስዳል፣ በምን ቅደም ተከተል ይጸድቃል? ናሙና ያያይዙ።</w:t>
+      </w:r>
+    </w:p>
+    <w:p>
+      <w:pPr>
+        <w:spacing w:after="100" w:line="300"/>
+        <w:ind w:left="567" w:hanging="567"/>
+      </w:pPr>
+      <w:r>
+        <w:rPr>
+          <w:rFonts w:ascii="Nyala" w:cs="Nyala" w:eastAsia="Nyala" w:hAnsi="Nyala"/>
+          <w:b/>
+          <w:bCs/>
+        </w:rPr>
+        <w:t xml:space="preserve">18.6  </w:t>
+      </w:r>
+      <w:r>
+        <w:rPr>
+          <w:rFonts w:ascii="Nyala" w:cs="Nyala" w:eastAsia="Nyala" w:hAnsi="Nyala"/>
+        </w:rPr>
+        <w:t xml:space="preserve">ቅድመ ክፍያ ስንት በመቶ ነው? ዋስትናው ምንድን ነው? ከቀጣይ ክፍያዎች እንዴት ይቀነሳል? የማቆያ ገንዘብ (retention)፣ የመዘግየት ቅጣት፣ የዋጋ ማስተካከያና የሥራ ለውጥ (variation) የሚመሩበት ሕግ ምንድን ነው?</w:t>
+      </w:r>
+    </w:p>
+    <w:p>
+      <w:pPr>
+        <w:spacing w:after="100" w:line="300"/>
+        <w:ind w:left="567" w:hanging="567"/>
+      </w:pPr>
+      <w:r>
+        <w:rPr>
+          <w:rFonts w:ascii="Nyala" w:cs="Nyala" w:eastAsia="Nyala" w:hAnsi="Nyala"/>
+          <w:b/>
+          <w:bCs/>
+        </w:rPr>
+        <w:t xml:space="preserve">18.7  </w:t>
+      </w:r>
+      <w:r>
+        <w:rPr>
+          <w:rFonts w:ascii="Nyala" w:cs="Nyala" w:eastAsia="Nyala" w:hAnsi="Nyala"/>
+        </w:rPr>
+        <w:t xml:space="preserve">የተቋራጮችና የአማካሪዎች መዝገብ (ደረጃቸውን ጨምሮ) የሚይዘው ማን ነው?</w:t>
       </w:r>
     </w:p>
     <w:tbl>
@@ -9500,7 +9395,7 @@
         <w:rPr>
           <w:rFonts w:ascii="Nyala" w:cs="Nyala" w:eastAsia="Nyala" w:hAnsi="Nyala"/>
         </w:rPr>
-        <w:t xml:space="preserve">ጥያቄ 19፦ የመንገድ ግንባታና የጥገና ቁጥጥር</w:t>
+        <w:t xml:space="preserve">ጥያቄ 19፦ የባለድርሻ አካላት ትስስር</w:t>
       </w:r>
     </w:p>
     <w:p>
@@ -9548,7 +9443,7 @@
         <w:rPr>
           <w:rFonts w:ascii="Nyala" w:cs="Nyala" w:eastAsia="Nyala" w:hAnsi="Nyala"/>
         </w:rPr>
-        <w:t xml:space="preserve">የመንገድ ዘርፍ ሥራ ክፍሎች (ግንባታና ጥገና)</w:t>
+        <w:t xml:space="preserve">የመምሪያው ኃላፊና ዳይሬክቶሬቶች</w:t>
       </w:r>
     </w:p>
     <w:p>
@@ -9574,7 +9469,7 @@
         <w:rPr>
           <w:rFonts w:ascii="Nyala" w:cs="Nyala" w:eastAsia="Nyala" w:hAnsi="Nyala"/>
         </w:rPr>
-        <w:t xml:space="preserve">ደብዳቤው በመንገድ ዘርፍ የሥራ ክፍሎች አዲስ መንገድ መገንባትንና የጥገና ቁጥጥር ማድረግን ይጠቅሳል። የመንገድ ፈንድና የኢትዮጵያ መንገዶች አስተዳደር ባለድርሻ ናቸው።</w:t>
+        <w:t xml:space="preserve">ደብዳቤው ሥርዓቱ ከሚከተሉት ባለድርሻ አካላት ጋር በቅንጅት ለመሥራት የሚያስችል እንዲሆን ይጠይቃል፦ የክልሉ ትራንስፖርትና መንገድ ልማት አስተዳደር ቢሮ፣ የህዝብና የከተማ ትራንስፖርት ማህበራት፣ የፖሊስ መምሪያዎች (ትራፊክ ፖሊስ)፣ ኢንሹራንስ ኩባንያዎች፣ የመንገድ ፈንድ፣ የኢትዮጵያ መንገዶች አስተዳደር፣ የአሽከርካሪ ማሰልጠኛ ተቋማት፣ መገናኛ ብዙሀን፣ የጤና ተቋማት፣ የገቢ ሰብሳቢ ቢሮዎች፣ ጋራዦች፣ አማካሪዎችና ተቋራጮች፣ የፋይናንስ ቢሮዎች፣ ውልና ማስረጃ፣ የተሽከርካሪ ምርመራ ተቋማት፣ የጉምሩክ ባለሥልጣን እና የተሽከርካሪና የአሽከርካሪ ባለንብረቶች። ትስስሩን ለመንደፍ ከእያንዳንዳቸው ጋር የሚለዋወጠው መረጃ ያስፈልጋል።</w:t>
       </w:r>
     </w:p>
     <w:p>
@@ -9609,7 +9504,7 @@
         <w:rPr>
           <w:rFonts w:ascii="Nyala" w:cs="Nyala" w:eastAsia="Nyala" w:hAnsi="Nyala"/>
         </w:rPr>
-        <w:t xml:space="preserve">ዞኑና ወረዳዎቹ የሚያስተዳድሩት የመንገድ መረብ ምንድን ነው (የገጠር መንገዶች፣ የማህበረሰብ መንገዶች፣ ወደ DC3 የሚሻሻሉ መንገዶች …)? የመንገድ ቆጠራ (inventory) መዝገብ አለ?</w:t>
+        <w:t xml:space="preserve">በአባሪ "ሐ" ያለውን ሠንጠረዥ ይሙሉ (ከእያንዳንዱ ባለድርሻ ጋር የሚለዋወጠው መረጃ፣ አሁን እንዴት እንደሚለዋወጥ፣ በምን ያህል ጊዜ፣ የሚያገናኘው ክፍል)።</w:t>
       </w:r>
     </w:p>
     <w:p>
@@ -9629,7 +9524,7 @@
         <w:rPr>
           <w:rFonts w:ascii="Nyala" w:cs="Nyala" w:eastAsia="Nyala" w:hAnsi="Nyala"/>
         </w:rPr>
-        <w:t xml:space="preserve">አዲስ የመንገድ ፕሮጀክት እንዴት ይለያል፣ ይጸድቃል፣ በጀቱ ከየት ይገኛል? (የመንገድ ፈንድ፣ ክልል፣ ወረዳ፣ የማህበረሰብ ተሳትፎ)</w:t>
+        <w:t xml:space="preserve">ከነዚህ ውስጥ በኤሌክትሮኒክ መንገድ ለማገናኘት በጣም አስቸኳይ የሆኑት ሦስቱ የትኞቹ ናቸው? ለምን?</w:t>
       </w:r>
     </w:p>
     <w:p>
@@ -9649,7 +9544,7 @@
         <w:rPr>
           <w:rFonts w:ascii="Nyala" w:cs="Nyala" w:eastAsia="Nyala" w:hAnsi="Nyala"/>
         </w:rPr>
-        <w:t xml:space="preserve">የጥገና ቁጥጥር በምን ያህል ጊዜ ይደረጋል? የመንገድ ሁኔታ መገምገሚያ ቅጽና የጥገና ቅድሚያ አሰጣጥ ዘዴ ምንድን ነው?</w:t>
+        <w:t xml:space="preserve">ከባለድርሻዎቹ መካከል የራሳቸው ኤሌክትሮኒክ ሥርዓት ያላቸው አሉ (ለምሳሌ የኢንሹራንስ ኩባንያዎች፣ ጉምሩክ፣ ገቢዎች፣ ባንኮች)? ካሉ የሥርዓቱን ስምና የሚመለከተውን ክፍል ይጻፉ።</w:t>
       </w:r>
     </w:p>
     <w:p>
@@ -9669,7 +9564,7 @@
         <w:rPr>
           <w:rFonts w:ascii="Nyala" w:cs="Nyala" w:eastAsia="Nyala" w:hAnsi="Nyala"/>
         </w:rPr>
-        <w:t xml:space="preserve">የግንባታ ሥራዎች የአካልና የፋይናንስ አፈጻጸም ሪፖርት ለማን፣ በምን ያህል ጊዜ ይላካል? ቅጹን ያያይዙ።</w:t>
+        <w:t xml:space="preserve">መረጃ ለመለዋወጥ የመግባቢያ ሰነድ (MoU) ወይም ሌላ ሕጋዊ ስምምነት ያስፈልጋል? ማን ይፈርማል?</w:t>
       </w:r>
     </w:p>
     <w:p>
@@ -9689,7 +9584,7 @@
         <w:rPr>
           <w:rFonts w:ascii="Nyala" w:cs="Nyala" w:eastAsia="Nyala" w:hAnsi="Nyala"/>
         </w:rPr>
-        <w:t xml:space="preserve">ለመንገድ ፈንድ ወይም ለኢትዮጵያ መንገዶች አስተዳደር የሚላኩ ሪፖርቶች ምንድናቸው?</w:t>
+        <w:t xml:space="preserve">ማሰልጠኛ ተቋማት፣ የምርመራ ተቋማት፣ ጋራዦች፣ ኢንሹራንሶችና ማህበራት ውስን የራሳቸው መግቢያ (አካውንት) ቢሰጣቸው ይመረጣል?</w:t>
       </w:r>
     </w:p>
     <w:tbl>
@@ -9806,7 +9701,7 @@
         <w:rPr>
           <w:rFonts w:ascii="Nyala" w:cs="Nyala" w:eastAsia="Nyala" w:hAnsi="Nyala"/>
         </w:rPr>
-        <w:t xml:space="preserve">ጥያቄ 20፦ የመንገድ ዲዛይንና የውል አስተዳደር</w:t>
+        <w:t xml:space="preserve">ጥያቄ 20፦ የአገልግሎቶቹ ቅደም ተከተልና የትግበራ ምዕራፎች</w:t>
       </w:r>
     </w:p>
     <w:p>
@@ -9830,7 +9725,7 @@
         <w:rPr>
           <w:rFonts w:ascii="Nyala" w:cs="Nyala" w:eastAsia="Nyala" w:hAnsi="Nyala"/>
         </w:rPr>
-        <w:t xml:space="preserve">መካከለኛ</w:t>
+        <w:t xml:space="preserve">ከፍተኛ (ከማሳያው በፊት ያስፈልጋል)</w:t>
       </w:r>
     </w:p>
     <w:p>
@@ -9854,7 +9749,7 @@
         <w:rPr>
           <w:rFonts w:ascii="Nyala" w:cs="Nyala" w:eastAsia="Nyala" w:hAnsi="Nyala"/>
         </w:rPr>
-        <w:t xml:space="preserve">የዲዛይንና የውል አስተዳደር ዳይሬክቶሬት</w:t>
+        <w:t xml:space="preserve">የመምሪያው ኃላፊ</w:t>
       </w:r>
     </w:p>
     <w:p>
@@ -9880,7 +9775,7 @@
         <w:rPr>
           <w:rFonts w:ascii="Nyala" w:cs="Nyala" w:eastAsia="Nyala" w:hAnsi="Nyala"/>
         </w:rPr>
-        <w:t xml:space="preserve">ደብዳቤው አዳዲስ መንገዶችን ዲዛይን ማሠራትን፣ የተቋራጭና የአማካሪ የውል ሰነድ ማዘጋጀትን፣ የአዳዲስ ፕሮጀክቶች ውል ማስገባትን፣ በግንባታ ላይ ላሉ ድልድዮችና መንገዶች የክፍያ ሰነድ ማዘጋጀትንና ለአዳዲስ ፕሮጀክቶች የቅድመ ክፍያ ሰነድ ማዘጋጀትን ይጠቅሳል። አማካሪዎችና ተቋራጮች እንዲሁም የፋይናንስ ቢሮዎች ባለድርሻ ናቸው።</w:t>
+        <w:t xml:space="preserve">ደብዳቤው የጠየቃቸው አገልግሎቶች ብዙ በመሆናቸው ሥርዓቱ በምዕራፍ ይገነባል፤ የመጀመሪያው ማሳያ የአዲስ መንጃ ፈቃድና የመንጃ ፈቃድ ዕድሳት ነው። ቀጣዮቹ ምዕራፎች በመምሪያው ቅድሚያ መሠረት ይወሰናሉ። ሥርዓቱ ከደብዳቤው በተጨማሪ የሰው ሀብት (የደመወዝ ዝርዝርን ጨምሮ)፣ የዕቅድና በጀት፣ የሎጂስቲክስ፣ የማህበረሰብ ተሳትፎና የመንገድ ጥራትና ደህንነት ኦዲት ክፍሎችን ማካተት ይችላል።</w:t>
       </w:r>
     </w:p>
     <w:p>
@@ -9915,7 +9810,7 @@
         <w:rPr>
           <w:rFonts w:ascii="Nyala" w:cs="Nyala" w:eastAsia="Nyala" w:hAnsi="Nyala"/>
         </w:rPr>
-        <w:t xml:space="preserve">ዲዛይን በመምሪያው ባለሙያዎች ነው የሚሠራው ወይስ በአማካሪዎች? የትኛውን የዲዛይን ደረጃ (ለምሳሌ የኢትዮጵያ መንገዶች አስተዳደር ማኑዋሎች፣ DC3) ይጠቀማሉ? ዲዛይኑን ማን ያጸድቃል?</w:t>
+        <w:t xml:space="preserve">በአባሪ "መ" በተዘረዘሩት አገልግሎቶች ላይ የቅድሚያ ደረጃ ይስጡ (1 = አስቸኳይ፣ 2 = ቀጣይ፣ 3 = በኋላ) እና ዓመታዊ የተገልጋይ ብዛትን በግምት ይጻፉ።</w:t>
       </w:r>
     </w:p>
     <w:p>
@@ -9935,7 +9830,7 @@
         <w:rPr>
           <w:rFonts w:ascii="Nyala" w:cs="Nyala" w:eastAsia="Nyala" w:hAnsi="Nyala"/>
         </w:rPr>
-        <w:t xml:space="preserve">የጨረታና የውል ሰነዶች የሚዘጋጁት በየትኛው የግዢ ሕግ ወይም መመሪያ መሠረት ነው? ሰነዱን ማን ያዘጋጃል፣ የግምገማ ኮሚቴው ማን ነው? ናሙና ሰነዶችን ያያይዙ።</w:t>
+        <w:t xml:space="preserve">ከማሳያው በኋላ መጀመሪያ መሠራት ያለባቸው ሦስት አገልግሎቶች የትኞቹ ናቸው? ለምን?</w:t>
       </w:r>
     </w:p>
     <w:p>
@@ -9955,7 +9850,7 @@
         <w:rPr>
           <w:rFonts w:ascii="Nyala" w:cs="Nyala" w:eastAsia="Nyala" w:hAnsi="Nyala"/>
         </w:rPr>
-        <w:t xml:space="preserve">ከክልሉ የሚላከው የቁርጥ ዋጋ (unit rate) እንዴት ይደርሳል፣ በምን ያህል ጊዜ ይሻሻላል? የቅርብ ጊዜውን ቅጂ ያያይዙ።</w:t>
+        <w:t xml:space="preserve">ከዞኑ መምሪያ በተጨማሪ የሙከራ ትግበራ የሚጀመርባቸው ጽ/ቤቶች (ከተማ አስተዳደሮችና ወረዳዎች) የትኞቹ ይሁኑ?</w:t>
       </w:r>
     </w:p>
     <w:p>
@@ -9975,7 +9870,7 @@
         <w:rPr>
           <w:rFonts w:ascii="Nyala" w:cs="Nyala" w:eastAsia="Nyala" w:hAnsi="Nyala"/>
         </w:rPr>
-        <w:t xml:space="preserve">ውል የሚፈርመው ማን ነው? የገንዘብ መጠንን መሠረት ያደረገ የማጽደቅ ደረጃ አለ?</w:t>
+        <w:t xml:space="preserve">ከደብዳቤው ውጭ የተጠቀሱት ክፍሎች (የሰው ሀብት፣ የዕቅድና በጀት፣ ሎጂስቲክስ፣ የማህበረሰብ ተሳትፎ፣ የመንገድ ጥራትና ደህንነት ኦዲት) በሥርዓቱ እንዲካተቱ ይፈለጋል? በየትኛው ምዕራፍ?</w:t>
       </w:r>
     </w:p>
     <w:p>
@@ -9995,47 +9890,7 @@
         <w:rPr>
           <w:rFonts w:ascii="Nyala" w:cs="Nyala" w:eastAsia="Nyala" w:hAnsi="Nyala"/>
         </w:rPr>
-        <w:t xml:space="preserve">ለመንገድና ለድልድይ ሥራዎች የክፍያ ሰርተፍኬት (ጊዜያዊና የመጨረሻ) እንዴት ይዘጋጃል? ልኬቱን ማን ይወስዳል፣ በምን ቅደም ተከተል ይጸድቃል? ናሙና ያያይዙ።</w:t>
-      </w:r>
-    </w:p>
-    <w:p>
-      <w:pPr>
-        <w:spacing w:after="100" w:line="300"/>
-        <w:ind w:left="567" w:hanging="567"/>
-      </w:pPr>
-      <w:r>
-        <w:rPr>
-          <w:rFonts w:ascii="Nyala" w:cs="Nyala" w:eastAsia="Nyala" w:hAnsi="Nyala"/>
-          <w:b/>
-          <w:bCs/>
-        </w:rPr>
-        <w:t xml:space="preserve">20.6  </w:t>
-      </w:r>
-      <w:r>
-        <w:rPr>
-          <w:rFonts w:ascii="Nyala" w:cs="Nyala" w:eastAsia="Nyala" w:hAnsi="Nyala"/>
-        </w:rPr>
-        <w:t xml:space="preserve">ቅድመ ክፍያ ስንት በመቶ ነው? ዋስትናው ምንድን ነው? ከቀጣይ ክፍያዎች እንዴት ይቀነሳል? የማቆያ ገንዘብ (retention)፣ የመዘግየት ቅጣት፣ የዋጋ ማስተካከያና የሥራ ለውጥ (variation) የሚመሩበት ሕግ ምንድን ነው?</w:t>
-      </w:r>
-    </w:p>
-    <w:p>
-      <w:pPr>
-        <w:spacing w:after="100" w:line="300"/>
-        <w:ind w:left="567" w:hanging="567"/>
-      </w:pPr>
-      <w:r>
-        <w:rPr>
-          <w:rFonts w:ascii="Nyala" w:cs="Nyala" w:eastAsia="Nyala" w:hAnsi="Nyala"/>
-          <w:b/>
-          <w:bCs/>
-        </w:rPr>
-        <w:t xml:space="preserve">20.7  </w:t>
-      </w:r>
-      <w:r>
-        <w:rPr>
-          <w:rFonts w:ascii="Nyala" w:cs="Nyala" w:eastAsia="Nyala" w:hAnsi="Nyala"/>
-        </w:rPr>
-        <w:t xml:space="preserve">የተቋራጮችና የአማካሪዎች መዝገብ (ደረጃቸውን ጨምሮ) የሚይዘው ማን ነው?</w:t>
+        <w:t xml:space="preserve">የበጀት ዓመቱን (ሐምሌ 1 – ሰኔ 30) ጨምሮ ሥርዓቱ ሥራ ላይ የሚውልበትን ጊዜ የሚወስኑ ሁኔታዎች አሉ?</w:t>
       </w:r>
     </w:p>
     <w:tbl>
@@ -10152,7 +10007,7 @@
         <w:rPr>
           <w:rFonts w:ascii="Nyala" w:cs="Nyala" w:eastAsia="Nyala" w:hAnsi="Nyala"/>
         </w:rPr>
-        <w:t xml:space="preserve">ጥያቄ 21፦ የባለድርሻ አካላት ትስስር</w:t>
+        <w:t xml:space="preserve">ጥያቄ 21፦ ነባር መረጃና የመረጃ ሽግግር</w:t>
       </w:r>
     </w:p>
     <w:p>
@@ -10200,7 +10055,7 @@
         <w:rPr>
           <w:rFonts w:ascii="Nyala" w:cs="Nyala" w:eastAsia="Nyala" w:hAnsi="Nyala"/>
         </w:rPr>
-        <w:t xml:space="preserve">የመምሪያው ኃላፊና ዳይሬክቶሬቶች</w:t>
+        <w:t xml:space="preserve">ዳይሬክቶሬቶችና የአይሲቲ ባለሙያ</w:t>
       </w:r>
     </w:p>
     <w:p>
@@ -10226,7 +10081,7 @@
         <w:rPr>
           <w:rFonts w:ascii="Nyala" w:cs="Nyala" w:eastAsia="Nyala" w:hAnsi="Nyala"/>
         </w:rPr>
-        <w:t xml:space="preserve">ደብዳቤው ሥርዓቱ ከሚከተሉት ባለድርሻ አካላት ጋር በቅንጅት ለመሥራት የሚያስችል እንዲሆን ይጠይቃል፦ የክልሉ ትራንስፖርትና መንገድ ልማት አስተዳደር ቢሮ፣ የህዝብና የከተማ ትራንስፖርት ማህበራት፣ የፖሊስ መምሪያዎች (ትራፊክ ፖሊስ)፣ ኢንሹራንስ ኩባንያዎች፣ የመንገድ ፈንድ፣ የኢትዮጵያ መንገዶች አስተዳደር፣ የአሽከርካሪ ማሰልጠኛ ተቋማት፣ መገናኛ ብዙሀን፣ የጤና ተቋማት፣ የገቢ ሰብሳቢ ቢሮዎች፣ ጋራዦች፣ አማካሪዎችና ተቋራጮች፣ የፋይናንስ ቢሮዎች፣ ውልና ማስረጃ፣ የተሽከርካሪ ምርመራ ተቋማት፣ የጉምሩክ ባለሥልጣን እና የተሽከርካሪና የአሽከርካሪ ባለንብረቶች። ትስስሩን ለመንደፍ ከእያንዳንዳቸው ጋር የሚለዋወጠው መረጃ ያስፈልጋል።</w:t>
+        <w:t xml:space="preserve">ሥርዓቱ ሥራ ሲጀምር ነባር መዝገቦች (መንጃ ፈቃዶች፣ ተሽከርካሪዎች፣ ማህበራት፣ መስመሮች፣ ውሎች) በሥርዓቱ ውስጥ መኖራቸው የአገልግሎቱን ቀጣይነት ያረጋግጣል። ለዚህ የመረጃውን ዓይነት፣ መጠንና ጥራት ማወቅ ያስፈልጋል።</w:t>
       </w:r>
     </w:p>
     <w:p>
@@ -10261,7 +10116,7 @@
         <w:rPr>
           <w:rFonts w:ascii="Nyala" w:cs="Nyala" w:eastAsia="Nyala" w:hAnsi="Nyala"/>
         </w:rPr>
-        <w:t xml:space="preserve">በአባሪ "መ" ያለውን ሠንጠረዥ ይሙሉ (ከእያንዳንዱ ባለድርሻ ጋር የሚለዋወጠው መረጃ፣ አሁን እንዴት እንደሚለዋወጥ፣ በምን ያህል ጊዜ፣ የሚያገናኘው ክፍል)።</w:t>
+        <w:t xml:space="preserve">የትኞቹ መዝገቦች በኤሌክትሮኒክ መልክ (ኤክሴል፣ አክሰስ፣ የክልሉ ሥርዓት) ይገኛሉ? የትኞቹ በወረቀት ብቻ? የእያንዳንዱን ብዛት በግምት ይጻፉ።</w:t>
       </w:r>
     </w:p>
     <w:p>
@@ -10281,7 +10136,7 @@
         <w:rPr>
           <w:rFonts w:ascii="Nyala" w:cs="Nyala" w:eastAsia="Nyala" w:hAnsi="Nyala"/>
         </w:rPr>
-        <w:t xml:space="preserve">ከነዚህ ውስጥ በኤሌክትሮኒክ መንገድ ለማገናኘት በጣም አስቸኳይ የሆኑት ሦስቱ የትኞቹ ናቸው? ለምን?</w:t>
+        <w:t xml:space="preserve">ነባር መዝገቦች ወደ አዲሱ ሥርዓት እንዲገቡ ይፈለጋል? ከሆነ ማን ያስገባቸዋል፣ ማን ያረጋግጣቸዋል?</w:t>
       </w:r>
     </w:p>
     <w:p>
@@ -10301,47 +10156,7 @@
         <w:rPr>
           <w:rFonts w:ascii="Nyala" w:cs="Nyala" w:eastAsia="Nyala" w:hAnsi="Nyala"/>
         </w:rPr>
-        <w:t xml:space="preserve">ከባለድርሻዎቹ መካከል የራሳቸው ኤሌክትሮኒክ ሥርዓት ያላቸው አሉ (ለምሳሌ የኢንሹራንስ ኩባንያዎች፣ ጉምሩክ፣ ገቢዎች፣ ባንኮች)? ካሉ የሥርዓቱን ስምና የሚመለከተውን ክፍል ይጻፉ።</w:t>
-      </w:r>
-    </w:p>
-    <w:p>
-      <w:pPr>
-        <w:spacing w:after="100" w:line="300"/>
-        <w:ind w:left="567" w:hanging="567"/>
-      </w:pPr>
-      <w:r>
-        <w:rPr>
-          <w:rFonts w:ascii="Nyala" w:cs="Nyala" w:eastAsia="Nyala" w:hAnsi="Nyala"/>
-          <w:b/>
-          <w:bCs/>
-        </w:rPr>
-        <w:t xml:space="preserve">21.4  </w:t>
-      </w:r>
-      <w:r>
-        <w:rPr>
-          <w:rFonts w:ascii="Nyala" w:cs="Nyala" w:eastAsia="Nyala" w:hAnsi="Nyala"/>
-        </w:rPr>
-        <w:t xml:space="preserve">መረጃ ለመለዋወጥ የመግባቢያ ሰነድ (MoU) ወይም ሌላ ሕጋዊ ስምምነት ያስፈልጋል? ማን ይፈርማል?</w:t>
-      </w:r>
-    </w:p>
-    <w:p>
-      <w:pPr>
-        <w:spacing w:after="100" w:line="300"/>
-        <w:ind w:left="567" w:hanging="567"/>
-      </w:pPr>
-      <w:r>
-        <w:rPr>
-          <w:rFonts w:ascii="Nyala" w:cs="Nyala" w:eastAsia="Nyala" w:hAnsi="Nyala"/>
-          <w:b/>
-          <w:bCs/>
-        </w:rPr>
-        <w:t xml:space="preserve">21.5  </w:t>
-      </w:r>
-      <w:r>
-        <w:rPr>
-          <w:rFonts w:ascii="Nyala" w:cs="Nyala" w:eastAsia="Nyala" w:hAnsi="Nyala"/>
-        </w:rPr>
-        <w:t xml:space="preserve">ማሰልጠኛ ተቋማት፣ የምርመራ ተቋማት፣ ጋራዦች፣ ኢንሹራንሶችና ማህበራት ውስን የራሳቸው መግቢያ (አካውንት) ቢሰጣቸው ይመረጣል?</w:t>
+        <w:t xml:space="preserve">የመረጃውን አወቃቀር ለማየት የግል መረጃው የተሸፈነ ናሙና (ለምሳሌ ጥቂት የኤክሴል ረድፎች) መላክ ይቻላል?</w:t>
       </w:r>
     </w:p>
     <w:tbl>
@@ -10458,7 +10273,7 @@
         <w:rPr>
           <w:rFonts w:ascii="Nyala" w:cs="Nyala" w:eastAsia="Nyala" w:hAnsi="Nyala"/>
         </w:rPr>
-        <w:t xml:space="preserve">ጥያቄ 22፦ የአገልግሎቶቹ ቅደም ተከተልና የትግበራ ምዕራፎች</w:t>
+        <w:t xml:space="preserve">ጥያቄ 22፦ ተጠቃሚዎች፣ ሥልጠናና የፕሮጀክቱ አስተባባሪ</w:t>
       </w:r>
     </w:p>
     <w:p>
@@ -10506,7 +10321,7 @@
         <w:rPr>
           <w:rFonts w:ascii="Nyala" w:cs="Nyala" w:eastAsia="Nyala" w:hAnsi="Nyala"/>
         </w:rPr>
-        <w:t xml:space="preserve">የመምሪያው ኃላፊ</w:t>
+        <w:t xml:space="preserve">የመምሪያው ኃላፊና የሰው ሀብት</w:t>
       </w:r>
     </w:p>
     <w:p>
@@ -10532,7 +10347,7 @@
         <w:rPr>
           <w:rFonts w:ascii="Nyala" w:cs="Nyala" w:eastAsia="Nyala" w:hAnsi="Nyala"/>
         </w:rPr>
-        <w:t xml:space="preserve">ደብዳቤው የጠየቃቸው አገልግሎቶች ብዙ በመሆናቸው ሥርዓቱ በምዕራፍ ይገነባል፤ የመጀመሪያው ማሳያ የአዲስ መንጃ ፈቃድና የመንጃ ፈቃድ ዕድሳት ነው። ቀጣዮቹ ምዕራፎች በመምሪያው ቅድሚያ መሠረት ይወሰናሉ። ሥርዓቱ ከደብዳቤው በተጨማሪ የሰው ሀብት (የደመወዝ ዝርዝርን ጨምሮ)፣ የዕቅድና በጀት፣ የሎጂስቲክስ፣ የማህበረሰብ ተሳትፎና የመንገድ ጥራትና ደህንነት ኦዲት ክፍሎችን ማካተት ይችላል።</w:t>
+        <w:t xml:space="preserve">ሥርዓቱን በጋራ ለማበልጸግ ከመምሪያው በኩል ጥያቄዎችን የሚያስተባብር፣ ውሳኔ የሚያስተላልፍና ማሳያዎችን የሚገመግም ተወካይ ያስፈልጋል። እንዲሁም የሥልጠናውና የተጠቃሚ መለያዎች ዕቅድ የተጠቃሚዎችን ብዛት ይፈልጋል።</w:t>
       </w:r>
     </w:p>
     <w:p>
@@ -10567,7 +10382,7 @@
         <w:rPr>
           <w:rFonts w:ascii="Nyala" w:cs="Nyala" w:eastAsia="Nyala" w:hAnsi="Nyala"/>
         </w:rPr>
-        <w:t xml:space="preserve">በአባሪ "ሠ" በተዘረዘሩት አገልግሎቶች ላይ የቅድሚያ ደረጃ ይስጡ (1 = አስቸኳይ፣ 2 = ቀጣይ፣ 3 = በኋላ) እና ዓመታዊ የተገልጋይ ብዛትን በግምት ይጻፉ።</w:t>
+        <w:t xml:space="preserve">ፕሮጀክቱን ከመምሪያው በኩል የሚያስተባብር ባለሙያ (ስም፣ ኃላፊነት፣ ስልክ፣ ኢሜይል) ቢሰየምልን፤ የቴክኒክ ኮሚቴ የሚቋቋም ከሆነ አባላቱን ይጻፉ።</w:t>
       </w:r>
     </w:p>
     <w:p>
@@ -10587,7 +10402,7 @@
         <w:rPr>
           <w:rFonts w:ascii="Nyala" w:cs="Nyala" w:eastAsia="Nyala" w:hAnsi="Nyala"/>
         </w:rPr>
-        <w:t xml:space="preserve">ከማሳያው በኋላ መጀመሪያ መሠራት ያለባቸው ሦስት አገልግሎቶች የትኞቹ ናቸው? ለምን?</w:t>
+        <w:t xml:space="preserve">በእያንዳንዱ ጽ/ቤት ሥርዓቱን የሚጠቀሙ ሠራተኞች ብዛትና ኃላፊነታቸው በግምት ምንድን ነው?</w:t>
       </w:r>
     </w:p>
     <w:p>
@@ -10607,7 +10422,7 @@
         <w:rPr>
           <w:rFonts w:ascii="Nyala" w:cs="Nyala" w:eastAsia="Nyala" w:hAnsi="Nyala"/>
         </w:rPr>
-        <w:t xml:space="preserve">ከዞኑ መምሪያ በተጨማሪ የሙከራ ትግበራ የሚጀመርባቸው ጽ/ቤቶች (ከተማ አስተዳደሮችና ወረዳዎች) የትኞቹ ይሁኑ?</w:t>
+        <w:t xml:space="preserve">የተጠቃሚ መለያዎችን (አካውንቶችን) በዞኑ የሚያስተዳድረው ማን ይሆናል?</w:t>
       </w:r>
     </w:p>
     <w:p>
@@ -10627,7 +10442,7 @@
         <w:rPr>
           <w:rFonts w:ascii="Nyala" w:cs="Nyala" w:eastAsia="Nyala" w:hAnsi="Nyala"/>
         </w:rPr>
-        <w:t xml:space="preserve">ከደብዳቤው ውጭ የተጠቀሱት ክፍሎች (የሰው ሀብት፣ የዕቅድና በጀት፣ ሎጂስቲክስ፣ የማህበረሰብ ተሳትፎ፣ የመንገድ ጥራትና ደህንነት ኦዲት) በሥርዓቱ እንዲካተቱ ይፈለጋል? በየትኛው ምዕራፍ?</w:t>
+        <w:t xml:space="preserve">ሥልጠና የት፣ መቼና ለስንት ሰው ቢሰጥ ይመረጣል?</w:t>
       </w:r>
     </w:p>
     <w:p>
@@ -10647,7 +10462,7 @@
         <w:rPr>
           <w:rFonts w:ascii="Nyala" w:cs="Nyala" w:eastAsia="Nyala" w:hAnsi="Nyala"/>
         </w:rPr>
-        <w:t xml:space="preserve">የበጀት ዓመቱን (ሐምሌ 1 – ሰኔ 30) ጨምሮ ሥርዓቱ ሥራ ላይ የሚውልበትን ጊዜ የሚወስኑ ሁኔታዎች አሉ?</w:t>
+        <w:t xml:space="preserve">የእያንዳንዱን ምዕራፍ ማሳያ ተቀብሎ የሚያጸድቀው (የሚፈርመው) ማን ነው?</w:t>
       </w:r>
     </w:p>
     <w:tbl>
@@ -10764,7 +10579,7 @@
         <w:rPr>
           <w:rFonts w:ascii="Nyala" w:cs="Nyala" w:eastAsia="Nyala" w:hAnsi="Nyala"/>
         </w:rPr>
-        <w:t xml:space="preserve">ጥያቄ 23፦ ነባር መረጃና የመረጃ ሽግግር</w:t>
+        <w:t xml:space="preserve">ጥያቄ 23፦ ሪፖርቶችና የአፈጻጸም መለኪያዎች</w:t>
       </w:r>
     </w:p>
     <w:p>
@@ -10812,7 +10627,7 @@
         <w:rPr>
           <w:rFonts w:ascii="Nyala" w:cs="Nyala" w:eastAsia="Nyala" w:hAnsi="Nyala"/>
         </w:rPr>
-        <w:t xml:space="preserve">ዳይሬክቶሬቶችና የአይሲቲ ባለሙያ</w:t>
+        <w:t xml:space="preserve">የዕቅድና በጀት ዳይሬክቶሬት</w:t>
       </w:r>
     </w:p>
     <w:p>
@@ -10838,7 +10653,7 @@
         <w:rPr>
           <w:rFonts w:ascii="Nyala" w:cs="Nyala" w:eastAsia="Nyala" w:hAnsi="Nyala"/>
         </w:rPr>
-        <w:t xml:space="preserve">ሥርዓቱ ሥራ ሲጀምር ነባር መዝገቦች (መንጃ ፈቃዶች፣ ተሽከርካሪዎች፣ ማህበራት፣ መስመሮች፣ ውሎች) በሥርዓቱ ውስጥ መኖራቸው የአገልግሎቱን ቀጣይነት ያረጋግጣል። ለዚህ የመረጃውን ዓይነት፣ መጠንና ጥራት ማወቅ ያስፈልጋል።</w:t>
+        <w:t xml:space="preserve">ሥርዓቱ መረጃን በአንድ ቦታ ስለሚይዝ መምሪያው ለክልሉና ለባለድርሻዎች የሚልካቸውን ሪፖርቶች በራሱ ማዘጋጀት ይችላል። ለዚህ የሪፖርቶቹ ዝርዝርና ቅርጽ ያስፈልጋል።</w:t>
       </w:r>
     </w:p>
     <w:p>
@@ -10873,7 +10688,7 @@
         <w:rPr>
           <w:rFonts w:ascii="Nyala" w:cs="Nyala" w:eastAsia="Nyala" w:hAnsi="Nyala"/>
         </w:rPr>
-        <w:t xml:space="preserve">የትኞቹ መዝገቦች በኤሌክትሮኒክ መልክ (ኤክሴል፣ አክሰስ፣ የክልሉ ሥርዓት) ይገኛሉ? የትኞቹ በወረቀት ብቻ? የእያንዳንዱን ብዛት በግምት ይጻፉ።</w:t>
+        <w:t xml:space="preserve">መምሪያው ለክልሉ ቢሮ የሚልካቸው ሪፖርቶች የትኞቹ ናቸው (ሳምንታዊ፣ ወርሃዊ፣ ሩብ ዓመታዊ፣ ዓመታዊ)? ቅጾቹን ያያይዙ።</w:t>
       </w:r>
     </w:p>
     <w:p>
@@ -10893,7 +10708,7 @@
         <w:rPr>
           <w:rFonts w:ascii="Nyala" w:cs="Nyala" w:eastAsia="Nyala" w:hAnsi="Nyala"/>
         </w:rPr>
-        <w:t xml:space="preserve">ነባር መዝገቦች ወደ አዲሱ ሥርዓት እንዲገቡ ይፈለጋል? ከሆነ ማን ያስገባቸዋል፣ ማን ያረጋግጣቸዋል?</w:t>
+        <w:t xml:space="preserve">መምሪያው የሚጠቀምባቸው የአፈጻጸም መለኪያዎች (ለምሳሌ በዕቅዱ ወይም በBSC) ምንድናቸው?</w:t>
       </w:r>
     </w:p>
     <w:p>
@@ -10913,7 +10728,27 @@
         <w:rPr>
           <w:rFonts w:ascii="Nyala" w:cs="Nyala" w:eastAsia="Nyala" w:hAnsi="Nyala"/>
         </w:rPr>
-        <w:t xml:space="preserve">የመረጃውን አወቃቀር ለማየት የግል መረጃው የተሸፈነ ናሙና (ለምሳሌ ጥቂት የኤክሴል ረድፎች) መላክ ይቻላል?</w:t>
+        <w:t xml:space="preserve">ለመንገድ ፈንድ፣ ለኢንሹራንስ ፈንድ፣ ለፖሊስ ወይም ለሌሎች ባለድርሻዎች የሚላኩ ሪፖርቶች አሉ?</w:t>
+      </w:r>
+    </w:p>
+    <w:p>
+      <w:pPr>
+        <w:spacing w:after="100" w:line="300"/>
+        <w:ind w:left="567" w:hanging="567"/>
+      </w:pPr>
+      <w:r>
+        <w:rPr>
+          <w:rFonts w:ascii="Nyala" w:cs="Nyala" w:eastAsia="Nyala" w:hAnsi="Nyala"/>
+          <w:b/>
+          <w:bCs/>
+        </w:rPr>
+        <w:t xml:space="preserve">23.4  </w:t>
+      </w:r>
+      <w:r>
+        <w:rPr>
+          <w:rFonts w:ascii="Nyala" w:cs="Nyala" w:eastAsia="Nyala" w:hAnsi="Nyala"/>
+        </w:rPr>
+        <w:t xml:space="preserve">የዞኑን አጠቃላይ አፈጻጸም የሚያሳይ ማሳያ ሰሌዳ (dashboard) ማን ማየት ይገባዋል? (የመምሪያው ኃላፊ፣ የክልሉ ቢሮ፣ የወረዳ ኃላፊዎች)</w:t>
       </w:r>
     </w:p>
     <w:tbl>
@@ -11030,7 +10865,7 @@
         <w:rPr>
           <w:rFonts w:ascii="Nyala" w:cs="Nyala" w:eastAsia="Nyala" w:hAnsi="Nyala"/>
         </w:rPr>
-        <w:t xml:space="preserve">ጥያቄ 24፦ ተጠቃሚዎች፣ ሥልጠናና የፕሮጀክቱ አስተባባሪ</w:t>
+        <w:t xml:space="preserve">ጥያቄ 24፦ ሕጋዊ ማዕቀፍ፣ ፈቃድና የመረጃ ማስቀመጫ</w:t>
       </w:r>
     </w:p>
     <w:p>
@@ -11054,7 +10889,7 @@
         <w:rPr>
           <w:rFonts w:ascii="Nyala" w:cs="Nyala" w:eastAsia="Nyala" w:hAnsi="Nyala"/>
         </w:rPr>
-        <w:t xml:space="preserve">ከፍተኛ (ከማሳያው በፊት ያስፈልጋል)</w:t>
+        <w:t xml:space="preserve">መካከለኛ</w:t>
       </w:r>
     </w:p>
     <w:p>
@@ -11078,7 +10913,7 @@
         <w:rPr>
           <w:rFonts w:ascii="Nyala" w:cs="Nyala" w:eastAsia="Nyala" w:hAnsi="Nyala"/>
         </w:rPr>
-        <w:t xml:space="preserve">የመምሪያው ኃላፊና የሰው ሀብት</w:t>
+        <w:t xml:space="preserve">የመምሪያው ኃላፊ (ከክልሉ ቢሮ ጋር)</w:t>
       </w:r>
     </w:p>
     <w:p>
@@ -11104,7 +10939,7 @@
         <w:rPr>
           <w:rFonts w:ascii="Nyala" w:cs="Nyala" w:eastAsia="Nyala" w:hAnsi="Nyala"/>
         </w:rPr>
-        <w:t xml:space="preserve">ሥርዓቱን በጋራ ለማበልጸግ ከመምሪያው በኩል ጥያቄዎችን የሚያስተባብር፣ ውሳኔ የሚያስተላልፍና ማሳያዎችን የሚገመግም ተወካይ ያስፈልጋል። እንዲሁም የሥልጠናውና የተጠቃሚ መለያዎች ዕቅድ የተጠቃሚዎችን ብዛት ይፈልጋል።</w:t>
+        <w:t xml:space="preserve">የግል መረጃ ጥበቃ አዋጅ ቁጥር 1321/2024 (እ.ኤ.አ.) የግል መረጃን በአግባቡ መያዝን ይጠይቃል፤ በኢትዮጵያ ውስጥ የተሰበሰበ የግል መረጃ በአገር ውስጥ እንዲቀመጥም ይጠበቃል። የወሳኝ መሠረተ ልማቶች የሳይበር ደህንነት አዋጅ ቁጥር 1426/2026 (እ.ኤ.አ.) የደህንነት ግዴታዎችን ያስቀምጣል። የኤሌክትሮኒክ ፊርማ አዋጅ ቁጥር 1072/2018 እና የኤሌክትሮኒክ ግብይት አዋጅ ቁጥር 1205/2020 ለኤሌክትሮኒክ ሰነዶች ሕጋዊ ዕውቅና ይሰጣሉ። ሥርዓቱ የሚያትማቸው ሰነዶች (መንጃ ፈቃድ ማመልከቻ፣ ደረሰኝ፣ ምስክር ወረቀት) በQR ኮድ ትክክለኛነታቸው ሊረጋገጥ ይችላል።</w:t>
       </w:r>
     </w:p>
     <w:p>
@@ -11139,7 +10974,7 @@
         <w:rPr>
           <w:rFonts w:ascii="Nyala" w:cs="Nyala" w:eastAsia="Nyala" w:hAnsi="Nyala"/>
         </w:rPr>
-        <w:t xml:space="preserve">ፕሮጀክቱን ከመምሪያው በኩል የሚያስተባብር ባለሙያ (ስም፣ ኃላፊነት፣ ስልክ፣ ኢሜይል) ቢሰየምልን፤ የቴክኒክ ኮሚቴ የሚቋቋም ከሆነ አባላቱን ይጻፉ።</w:t>
+        <w:t xml:space="preserve">አዲስ የመንግሥት ሥርዓት ሥራ ላይ ከመዋሉ በፊት ከክልሉ ቢሮ፣ ከክልሉ የኢኖቬሽንና ቴክኖሎጂ ቢሮ ወይም ከኢንፎርሜሽን መረብ ደህንነት አስተዳደር (INSA) የሚያስፈልግ ፈቃድ ወይም የደህንነት ኦዲት አለ?</w:t>
       </w:r>
     </w:p>
     <w:p>
@@ -11159,7 +10994,7 @@
         <w:rPr>
           <w:rFonts w:ascii="Nyala" w:cs="Nyala" w:eastAsia="Nyala" w:hAnsi="Nyala"/>
         </w:rPr>
-        <w:t xml:space="preserve">በእያንዳንዱ ጽ/ቤት ሥርዓቱን የሚጠቀሙ ሠራተኞች ብዛትና ኃላፊነታቸው በግምት ምንድን ነው?</w:t>
+        <w:t xml:space="preserve">የሥርዓቱ አገልጋይ የት ቢቀመጥ ይመረጣል? (በዞኑ፣ በክልሉ የመረጃ ማዕከል፣ በአገር ውስጥ የመንግሥት ክላውድ)</w:t>
       </w:r>
     </w:p>
     <w:p>
@@ -11179,7 +11014,7 @@
         <w:rPr>
           <w:rFonts w:ascii="Nyala" w:cs="Nyala" w:eastAsia="Nyala" w:hAnsi="Nyala"/>
         </w:rPr>
-        <w:t xml:space="preserve">የተጠቃሚ መለያዎችን (አካውንቶችን) በዞኑ የሚያስተዳድረው ማን ይሆናል?</w:t>
+        <w:t xml:space="preserve">የመረጃው ባለቤትነትና ምስጢራዊነትን በተመለከተ ስምምነት (ለምሳሌ የመግባቢያ ሰነድ) ያስፈልጋል?</w:t>
       </w:r>
     </w:p>
     <w:p>
@@ -11199,7 +11034,7 @@
         <w:rPr>
           <w:rFonts w:ascii="Nyala" w:cs="Nyala" w:eastAsia="Nyala" w:hAnsi="Nyala"/>
         </w:rPr>
-        <w:t xml:space="preserve">ሥልጠና የት፣ መቼና ለስንት ሰው ቢሰጥ ይመረጣል?</w:t>
+        <w:t xml:space="preserve">በሥርዓቱ የሚታተሙ፣ በQR ኮድና በኤሌክትሮኒክ ፊርማ የሚረጋገጡ ሰነዶች ተቀባይነት ይኖራቸዋል? ወይስ እያንዳንዱ ሰነድ የእጅ ፊርማና ማኅተም ያስፈልገዋል?</w:t>
       </w:r>
     </w:p>
     <w:p>
@@ -11214,598 +11049,6 @@
           <w:bCs/>
         </w:rPr>
         <w:t xml:space="preserve">24.5  </w:t>
-      </w:r>
-      <w:r>
-        <w:rPr>
-          <w:rFonts w:ascii="Nyala" w:cs="Nyala" w:eastAsia="Nyala" w:hAnsi="Nyala"/>
-        </w:rPr>
-        <w:t xml:space="preserve">የእያንዳንዱን ምዕራፍ ማሳያ ተቀብሎ የሚያጸድቀው (የሚፈርመው) ማን ነው?</w:t>
-      </w:r>
-    </w:p>
-    <w:tbl>
-      <w:tblPr>
-        <w:tblW w:type="dxa" w:w="9638"/>
-        <w:tblBorders>
-          <w:top w:val="single" w:color="auto" w:sz="4"/>
-          <w:left w:val="single" w:color="auto" w:sz="4"/>
-          <w:bottom w:val="single" w:color="auto" w:sz="4"/>
-          <w:right w:val="single" w:color="auto" w:sz="4"/>
-          <w:insideH w:val="single" w:color="auto" w:sz="4"/>
-          <w:insideV w:val="single" w:color="auto" w:sz="4"/>
-        </w:tblBorders>
-      </w:tblPr>
-      <w:tblGrid>
-        <w:gridCol w:w="9638"/>
-      </w:tblGrid>
-      <w:tr>
-        <w:tc>
-          <w:tcPr>
-            <w:tcW w:type="dxa" w:w="9638"/>
-            <w:tcBorders>
-              <w:top w:val="single" w:color="8EA9C1" w:sz="4"/>
-              <w:left w:val="single" w:color="8EA9C1" w:sz="4"/>
-              <w:bottom w:val="single" w:color="8EA9C1" w:sz="4"/>
-              <w:right w:val="single" w:color="8EA9C1" w:sz="4"/>
-            </w:tcBorders>
-            <w:shd w:fill="F2F2F2" w:color="auto" w:val="clear"/>
-            <w:tcMar>
-              <w:top w:type="dxa" w:w="100"/>
-              <w:left w:type="dxa" w:w="140"/>
-              <w:bottom w:type="dxa" w:w="100"/>
-              <w:right w:type="dxa" w:w="140"/>
-            </w:tcMar>
-          </w:tcPr>
-          <w:p>
-            <w:pPr>
-              <w:spacing w:after="60"/>
-            </w:pPr>
-            <w:r>
-              <w:rPr>
-                <w:rFonts w:ascii="Nyala" w:cs="Nyala" w:eastAsia="Nyala" w:hAnsi="Nyala"/>
-                <w:b/>
-                <w:bCs/>
-                <w:color w:val="1F3864"/>
-              </w:rPr>
-              <w:t xml:space="preserve">ምላሽ፦</w:t>
-            </w:r>
-          </w:p>
-          <w:p>
-            <w:pPr>
-              <w:spacing w:after="160"/>
-            </w:pPr>
-            <w:r>
-              <w:rPr>
-                <w:rFonts w:ascii="Nyala" w:cs="Nyala" w:eastAsia="Nyala" w:hAnsi="Nyala"/>
-              </w:rPr>
-              <w:t xml:space="preserve"/>
-            </w:r>
-          </w:p>
-          <w:p>
-            <w:pPr>
-              <w:spacing w:after="160"/>
-            </w:pPr>
-            <w:r>
-              <w:rPr>
-                <w:rFonts w:ascii="Nyala" w:cs="Nyala" w:eastAsia="Nyala" w:hAnsi="Nyala"/>
-              </w:rPr>
-              <w:t xml:space="preserve"/>
-            </w:r>
-          </w:p>
-          <w:p>
-            <w:pPr>
-              <w:spacing w:after="160"/>
-            </w:pPr>
-            <w:r>
-              <w:rPr>
-                <w:rFonts w:ascii="Nyala" w:cs="Nyala" w:eastAsia="Nyala" w:hAnsi="Nyala"/>
-              </w:rPr>
-              <w:t xml:space="preserve"/>
-            </w:r>
-          </w:p>
-          <w:p>
-            <w:pPr>
-              <w:spacing w:after="160"/>
-            </w:pPr>
-            <w:r>
-              <w:rPr>
-                <w:rFonts w:ascii="Nyala" w:cs="Nyala" w:eastAsia="Nyala" w:hAnsi="Nyala"/>
-              </w:rPr>
-              <w:t xml:space="preserve"/>
-            </w:r>
-          </w:p>
-          <w:p>
-            <w:pPr>
-              <w:spacing w:after="160"/>
-            </w:pPr>
-            <w:r>
-              <w:rPr>
-                <w:rFonts w:ascii="Nyala" w:cs="Nyala" w:eastAsia="Nyala" w:hAnsi="Nyala"/>
-              </w:rPr>
-              <w:t xml:space="preserve"/>
-            </w:r>
-          </w:p>
-        </w:tc>
-      </w:tr>
-    </w:tbl>
-    <w:p>
-      <w:pPr>
-        <w:pStyle w:val="Heading2"/>
-        <w:keepNext/>
-      </w:pPr>
-      <w:r>
-        <w:rPr>
-          <w:rFonts w:ascii="Nyala" w:cs="Nyala" w:eastAsia="Nyala" w:hAnsi="Nyala"/>
-        </w:rPr>
-        <w:t xml:space="preserve">ጥያቄ 25፦ ሪፖርቶችና የአፈጻጸም መለኪያዎች</w:t>
-      </w:r>
-    </w:p>
-    <w:p>
-      <w:pPr>
-        <w:keepNext/>
-        <w:pBdr>
-          <w:left w:val="single" w:color="1F3864" w:sz="18" w:space="6"/>
-        </w:pBdr>
-        <w:shd w:fill="EAF1FB" w:color="auto" w:val="clear"/>
-        <w:spacing w:after="0"/>
-      </w:pPr>
-      <w:r>
-        <w:rPr>
-          <w:rFonts w:ascii="Nyala" w:cs="Nyala" w:eastAsia="Nyala" w:hAnsi="Nyala"/>
-          <w:b/>
-          <w:bCs/>
-        </w:rPr>
-        <w:t xml:space="preserve">ቅድሚያ፦ </w:t>
-      </w:r>
-      <w:r>
-        <w:rPr>
-          <w:rFonts w:ascii="Nyala" w:cs="Nyala" w:eastAsia="Nyala" w:hAnsi="Nyala"/>
-        </w:rPr>
-        <w:t xml:space="preserve">መካከለኛ</w:t>
-      </w:r>
-    </w:p>
-    <w:p>
-      <w:pPr>
-        <w:keepNext/>
-        <w:pBdr>
-          <w:left w:val="single" w:color="1F3864" w:sz="18" w:space="6"/>
-        </w:pBdr>
-        <w:shd w:fill="EAF1FB" w:color="auto" w:val="clear"/>
-        <w:spacing w:after="160"/>
-      </w:pPr>
-      <w:r>
-        <w:rPr>
-          <w:rFonts w:ascii="Nyala" w:cs="Nyala" w:eastAsia="Nyala" w:hAnsi="Nyala"/>
-          <w:b/>
-          <w:bCs/>
-        </w:rPr>
-        <w:t xml:space="preserve">ምላሽ የሚሰጠው፦ </w:t>
-      </w:r>
-      <w:r>
-        <w:rPr>
-          <w:rFonts w:ascii="Nyala" w:cs="Nyala" w:eastAsia="Nyala" w:hAnsi="Nyala"/>
-        </w:rPr>
-        <w:t xml:space="preserve">የዕቅድና በጀት ዳይሬክቶሬት</w:t>
-      </w:r>
-    </w:p>
-    <w:p>
-      <w:pPr>
-        <w:keepNext/>
-        <w:spacing w:before="120" w:after="60"/>
-      </w:pPr>
-      <w:r>
-        <w:rPr>
-          <w:rFonts w:ascii="Nyala" w:cs="Nyala" w:eastAsia="Nyala" w:hAnsi="Nyala"/>
-          <w:b/>
-          <w:bCs/>
-          <w:color w:val="1F3864"/>
-        </w:rPr>
-        <w:t xml:space="preserve">ዳራ</w:t>
-      </w:r>
-    </w:p>
-    <w:p>
-      <w:pPr>
-        <w:spacing w:after="120" w:line="300"/>
-      </w:pPr>
-      <w:r>
-        <w:rPr>
-          <w:rFonts w:ascii="Nyala" w:cs="Nyala" w:eastAsia="Nyala" w:hAnsi="Nyala"/>
-        </w:rPr>
-        <w:t xml:space="preserve">ሥርዓቱ መረጃን በአንድ ቦታ ስለሚይዝ መምሪያው ለክልሉና ለባለድርሻዎች የሚልካቸውን ሪፖርቶች በራሱ ማዘጋጀት ይችላል። ለዚህ የሪፖርቶቹ ዝርዝርና ቅርጽ ያስፈልጋል።</w:t>
-      </w:r>
-    </w:p>
-    <w:p>
-      <w:pPr>
-        <w:keepNext/>
-        <w:spacing w:before="120" w:after="60"/>
-      </w:pPr>
-      <w:r>
-        <w:rPr>
-          <w:rFonts w:ascii="Nyala" w:cs="Nyala" w:eastAsia="Nyala" w:hAnsi="Nyala"/>
-          <w:b/>
-          <w:bCs/>
-          <w:color w:val="1F3864"/>
-        </w:rPr>
-        <w:t xml:space="preserve">ጥያቄዎች</w:t>
-      </w:r>
-    </w:p>
-    <w:p>
-      <w:pPr>
-        <w:spacing w:after="100" w:line="300"/>
-        <w:ind w:left="567" w:hanging="567"/>
-      </w:pPr>
-      <w:r>
-        <w:rPr>
-          <w:rFonts w:ascii="Nyala" w:cs="Nyala" w:eastAsia="Nyala" w:hAnsi="Nyala"/>
-          <w:b/>
-          <w:bCs/>
-        </w:rPr>
-        <w:t xml:space="preserve">25.1  </w:t>
-      </w:r>
-      <w:r>
-        <w:rPr>
-          <w:rFonts w:ascii="Nyala" w:cs="Nyala" w:eastAsia="Nyala" w:hAnsi="Nyala"/>
-        </w:rPr>
-        <w:t xml:space="preserve">መምሪያው ለክልሉ ቢሮ የሚልካቸው ሪፖርቶች የትኞቹ ናቸው (ሳምንታዊ፣ ወርሃዊ፣ ሩብ ዓመታዊ፣ ዓመታዊ)? ቅጾቹን ያያይዙ።</w:t>
-      </w:r>
-    </w:p>
-    <w:p>
-      <w:pPr>
-        <w:spacing w:after="100" w:line="300"/>
-        <w:ind w:left="567" w:hanging="567"/>
-      </w:pPr>
-      <w:r>
-        <w:rPr>
-          <w:rFonts w:ascii="Nyala" w:cs="Nyala" w:eastAsia="Nyala" w:hAnsi="Nyala"/>
-          <w:b/>
-          <w:bCs/>
-        </w:rPr>
-        <w:t xml:space="preserve">25.2  </w:t>
-      </w:r>
-      <w:r>
-        <w:rPr>
-          <w:rFonts w:ascii="Nyala" w:cs="Nyala" w:eastAsia="Nyala" w:hAnsi="Nyala"/>
-        </w:rPr>
-        <w:t xml:space="preserve">መምሪያው የሚጠቀምባቸው የአፈጻጸም መለኪያዎች (ለምሳሌ በዕቅዱ ወይም በBSC) ምንድናቸው?</w:t>
-      </w:r>
-    </w:p>
-    <w:p>
-      <w:pPr>
-        <w:spacing w:after="100" w:line="300"/>
-        <w:ind w:left="567" w:hanging="567"/>
-      </w:pPr>
-      <w:r>
-        <w:rPr>
-          <w:rFonts w:ascii="Nyala" w:cs="Nyala" w:eastAsia="Nyala" w:hAnsi="Nyala"/>
-          <w:b/>
-          <w:bCs/>
-        </w:rPr>
-        <w:t xml:space="preserve">25.3  </w:t>
-      </w:r>
-      <w:r>
-        <w:rPr>
-          <w:rFonts w:ascii="Nyala" w:cs="Nyala" w:eastAsia="Nyala" w:hAnsi="Nyala"/>
-        </w:rPr>
-        <w:t xml:space="preserve">ለመንገድ ፈንድ፣ ለኢንሹራንስ ፈንድ፣ ለፖሊስ ወይም ለሌሎች ባለድርሻዎች የሚላኩ ሪፖርቶች አሉ?</w:t>
-      </w:r>
-    </w:p>
-    <w:p>
-      <w:pPr>
-        <w:spacing w:after="100" w:line="300"/>
-        <w:ind w:left="567" w:hanging="567"/>
-      </w:pPr>
-      <w:r>
-        <w:rPr>
-          <w:rFonts w:ascii="Nyala" w:cs="Nyala" w:eastAsia="Nyala" w:hAnsi="Nyala"/>
-          <w:b/>
-          <w:bCs/>
-        </w:rPr>
-        <w:t xml:space="preserve">25.4  </w:t>
-      </w:r>
-      <w:r>
-        <w:rPr>
-          <w:rFonts w:ascii="Nyala" w:cs="Nyala" w:eastAsia="Nyala" w:hAnsi="Nyala"/>
-        </w:rPr>
-        <w:t xml:space="preserve">የዞኑን አጠቃላይ አፈጻጸም የሚያሳይ ማሳያ ሰሌዳ (dashboard) ማን ማየት ይገባዋል? (የመምሪያው ኃላፊ፣ የክልሉ ቢሮ፣ የወረዳ ኃላፊዎች)</w:t>
-      </w:r>
-    </w:p>
-    <w:tbl>
-      <w:tblPr>
-        <w:tblW w:type="dxa" w:w="9638"/>
-        <w:tblBorders>
-          <w:top w:val="single" w:color="auto" w:sz="4"/>
-          <w:left w:val="single" w:color="auto" w:sz="4"/>
-          <w:bottom w:val="single" w:color="auto" w:sz="4"/>
-          <w:right w:val="single" w:color="auto" w:sz="4"/>
-          <w:insideH w:val="single" w:color="auto" w:sz="4"/>
-          <w:insideV w:val="single" w:color="auto" w:sz="4"/>
-        </w:tblBorders>
-      </w:tblPr>
-      <w:tblGrid>
-        <w:gridCol w:w="9638"/>
-      </w:tblGrid>
-      <w:tr>
-        <w:tc>
-          <w:tcPr>
-            <w:tcW w:type="dxa" w:w="9638"/>
-            <w:tcBorders>
-              <w:top w:val="single" w:color="8EA9C1" w:sz="4"/>
-              <w:left w:val="single" w:color="8EA9C1" w:sz="4"/>
-              <w:bottom w:val="single" w:color="8EA9C1" w:sz="4"/>
-              <w:right w:val="single" w:color="8EA9C1" w:sz="4"/>
-            </w:tcBorders>
-            <w:shd w:fill="F2F2F2" w:color="auto" w:val="clear"/>
-            <w:tcMar>
-              <w:top w:type="dxa" w:w="100"/>
-              <w:left w:type="dxa" w:w="140"/>
-              <w:bottom w:type="dxa" w:w="100"/>
-              <w:right w:type="dxa" w:w="140"/>
-            </w:tcMar>
-          </w:tcPr>
-          <w:p>
-            <w:pPr>
-              <w:spacing w:after="60"/>
-            </w:pPr>
-            <w:r>
-              <w:rPr>
-                <w:rFonts w:ascii="Nyala" w:cs="Nyala" w:eastAsia="Nyala" w:hAnsi="Nyala"/>
-                <w:b/>
-                <w:bCs/>
-                <w:color w:val="1F3864"/>
-              </w:rPr>
-              <w:t xml:space="preserve">ምላሽ፦</w:t>
-            </w:r>
-          </w:p>
-          <w:p>
-            <w:pPr>
-              <w:spacing w:after="160"/>
-            </w:pPr>
-            <w:r>
-              <w:rPr>
-                <w:rFonts w:ascii="Nyala" w:cs="Nyala" w:eastAsia="Nyala" w:hAnsi="Nyala"/>
-              </w:rPr>
-              <w:t xml:space="preserve"/>
-            </w:r>
-          </w:p>
-          <w:p>
-            <w:pPr>
-              <w:spacing w:after="160"/>
-            </w:pPr>
-            <w:r>
-              <w:rPr>
-                <w:rFonts w:ascii="Nyala" w:cs="Nyala" w:eastAsia="Nyala" w:hAnsi="Nyala"/>
-              </w:rPr>
-              <w:t xml:space="preserve"/>
-            </w:r>
-          </w:p>
-          <w:p>
-            <w:pPr>
-              <w:spacing w:after="160"/>
-            </w:pPr>
-            <w:r>
-              <w:rPr>
-                <w:rFonts w:ascii="Nyala" w:cs="Nyala" w:eastAsia="Nyala" w:hAnsi="Nyala"/>
-              </w:rPr>
-              <w:t xml:space="preserve"/>
-            </w:r>
-          </w:p>
-          <w:p>
-            <w:pPr>
-              <w:spacing w:after="160"/>
-            </w:pPr>
-            <w:r>
-              <w:rPr>
-                <w:rFonts w:ascii="Nyala" w:cs="Nyala" w:eastAsia="Nyala" w:hAnsi="Nyala"/>
-              </w:rPr>
-              <w:t xml:space="preserve"/>
-            </w:r>
-          </w:p>
-          <w:p>
-            <w:pPr>
-              <w:spacing w:after="160"/>
-            </w:pPr>
-            <w:r>
-              <w:rPr>
-                <w:rFonts w:ascii="Nyala" w:cs="Nyala" w:eastAsia="Nyala" w:hAnsi="Nyala"/>
-              </w:rPr>
-              <w:t xml:space="preserve"/>
-            </w:r>
-          </w:p>
-        </w:tc>
-      </w:tr>
-    </w:tbl>
-    <w:p>
-      <w:pPr>
-        <w:pStyle w:val="Heading2"/>
-        <w:keepNext/>
-      </w:pPr>
-      <w:r>
-        <w:rPr>
-          <w:rFonts w:ascii="Nyala" w:cs="Nyala" w:eastAsia="Nyala" w:hAnsi="Nyala"/>
-        </w:rPr>
-        <w:t xml:space="preserve">ጥያቄ 26፦ ሕጋዊ ማዕቀፍ፣ ፈቃድና የመረጃ ማስቀመጫ</w:t>
-      </w:r>
-    </w:p>
-    <w:p>
-      <w:pPr>
-        <w:keepNext/>
-        <w:pBdr>
-          <w:left w:val="single" w:color="1F3864" w:sz="18" w:space="6"/>
-        </w:pBdr>
-        <w:shd w:fill="EAF1FB" w:color="auto" w:val="clear"/>
-        <w:spacing w:after="0"/>
-      </w:pPr>
-      <w:r>
-        <w:rPr>
-          <w:rFonts w:ascii="Nyala" w:cs="Nyala" w:eastAsia="Nyala" w:hAnsi="Nyala"/>
-          <w:b/>
-          <w:bCs/>
-        </w:rPr>
-        <w:t xml:space="preserve">ቅድሚያ፦ </w:t>
-      </w:r>
-      <w:r>
-        <w:rPr>
-          <w:rFonts w:ascii="Nyala" w:cs="Nyala" w:eastAsia="Nyala" w:hAnsi="Nyala"/>
-        </w:rPr>
-        <w:t xml:space="preserve">መካከለኛ</w:t>
-      </w:r>
-    </w:p>
-    <w:p>
-      <w:pPr>
-        <w:keepNext/>
-        <w:pBdr>
-          <w:left w:val="single" w:color="1F3864" w:sz="18" w:space="6"/>
-        </w:pBdr>
-        <w:shd w:fill="EAF1FB" w:color="auto" w:val="clear"/>
-        <w:spacing w:after="160"/>
-      </w:pPr>
-      <w:r>
-        <w:rPr>
-          <w:rFonts w:ascii="Nyala" w:cs="Nyala" w:eastAsia="Nyala" w:hAnsi="Nyala"/>
-          <w:b/>
-          <w:bCs/>
-        </w:rPr>
-        <w:t xml:space="preserve">ምላሽ የሚሰጠው፦ </w:t>
-      </w:r>
-      <w:r>
-        <w:rPr>
-          <w:rFonts w:ascii="Nyala" w:cs="Nyala" w:eastAsia="Nyala" w:hAnsi="Nyala"/>
-        </w:rPr>
-        <w:t xml:space="preserve">የመምሪያው ኃላፊ (ከክልሉ ቢሮ ጋር)</w:t>
-      </w:r>
-    </w:p>
-    <w:p>
-      <w:pPr>
-        <w:keepNext/>
-        <w:spacing w:before="120" w:after="60"/>
-      </w:pPr>
-      <w:r>
-        <w:rPr>
-          <w:rFonts w:ascii="Nyala" w:cs="Nyala" w:eastAsia="Nyala" w:hAnsi="Nyala"/>
-          <w:b/>
-          <w:bCs/>
-          <w:color w:val="1F3864"/>
-        </w:rPr>
-        <w:t xml:space="preserve">ዳራ</w:t>
-      </w:r>
-    </w:p>
-    <w:p>
-      <w:pPr>
-        <w:spacing w:after="120" w:line="300"/>
-      </w:pPr>
-      <w:r>
-        <w:rPr>
-          <w:rFonts w:ascii="Nyala" w:cs="Nyala" w:eastAsia="Nyala" w:hAnsi="Nyala"/>
-        </w:rPr>
-        <w:t xml:space="preserve">የግል መረጃ ጥበቃ አዋጅ ቁጥር 1321/2024 (እ.ኤ.አ.) የግል መረጃን በአግባቡ መያዝን ይጠይቃል፤ በኢትዮጵያ ውስጥ የተሰበሰበ የግል መረጃ በአገር ውስጥ እንዲቀመጥም ይጠበቃል። የወሳኝ መሠረተ ልማቶች የሳይበር ደህንነት አዋጅ ቁጥር 1426/2026 (እ.ኤ.አ.) የደህንነት ግዴታዎችን ያስቀምጣል። የኤሌክትሮኒክ ፊርማ አዋጅ ቁጥር 1072/2018 እና የኤሌክትሮኒክ ግብይት አዋጅ ቁጥር 1205/2020 ለኤሌክትሮኒክ ሰነዶች ሕጋዊ ዕውቅና ይሰጣሉ። ሥርዓቱ የሚያትማቸው ሰነዶች (መንጃ ፈቃድ ማመልከቻ፣ ደረሰኝ፣ ምስክር ወረቀት) በQR ኮድ ትክክለኛነታቸው ሊረጋገጥ ይችላል።</w:t>
-      </w:r>
-    </w:p>
-    <w:p>
-      <w:pPr>
-        <w:keepNext/>
-        <w:spacing w:before="120" w:after="60"/>
-      </w:pPr>
-      <w:r>
-        <w:rPr>
-          <w:rFonts w:ascii="Nyala" w:cs="Nyala" w:eastAsia="Nyala" w:hAnsi="Nyala"/>
-          <w:b/>
-          <w:bCs/>
-          <w:color w:val="1F3864"/>
-        </w:rPr>
-        <w:t xml:space="preserve">ጥያቄዎች</w:t>
-      </w:r>
-    </w:p>
-    <w:p>
-      <w:pPr>
-        <w:spacing w:after="100" w:line="300"/>
-        <w:ind w:left="567" w:hanging="567"/>
-      </w:pPr>
-      <w:r>
-        <w:rPr>
-          <w:rFonts w:ascii="Nyala" w:cs="Nyala" w:eastAsia="Nyala" w:hAnsi="Nyala"/>
-          <w:b/>
-          <w:bCs/>
-        </w:rPr>
-        <w:t xml:space="preserve">26.1  </w:t>
-      </w:r>
-      <w:r>
-        <w:rPr>
-          <w:rFonts w:ascii="Nyala" w:cs="Nyala" w:eastAsia="Nyala" w:hAnsi="Nyala"/>
-        </w:rPr>
-        <w:t xml:space="preserve">አዲስ የመንግሥት ሥርዓት ሥራ ላይ ከመዋሉ በፊት ከክልሉ ቢሮ፣ ከክልሉ የኢኖቬሽንና ቴክኖሎጂ ቢሮ ወይም ከኢንፎርሜሽን መረብ ደህንነት አስተዳደር (INSA) የሚያስፈልግ ፈቃድ ወይም የደህንነት ኦዲት አለ?</w:t>
-      </w:r>
-    </w:p>
-    <w:p>
-      <w:pPr>
-        <w:spacing w:after="100" w:line="300"/>
-        <w:ind w:left="567" w:hanging="567"/>
-      </w:pPr>
-      <w:r>
-        <w:rPr>
-          <w:rFonts w:ascii="Nyala" w:cs="Nyala" w:eastAsia="Nyala" w:hAnsi="Nyala"/>
-          <w:b/>
-          <w:bCs/>
-        </w:rPr>
-        <w:t xml:space="preserve">26.2  </w:t>
-      </w:r>
-      <w:r>
-        <w:rPr>
-          <w:rFonts w:ascii="Nyala" w:cs="Nyala" w:eastAsia="Nyala" w:hAnsi="Nyala"/>
-        </w:rPr>
-        <w:t xml:space="preserve">የሥርዓቱ አገልጋይ የት ቢቀመጥ ይመረጣል? (በዞኑ፣ በክልሉ የመረጃ ማዕከል፣ በአገር ውስጥ የመንግሥት ክላውድ)</w:t>
-      </w:r>
-    </w:p>
-    <w:p>
-      <w:pPr>
-        <w:spacing w:after="100" w:line="300"/>
-        <w:ind w:left="567" w:hanging="567"/>
-      </w:pPr>
-      <w:r>
-        <w:rPr>
-          <w:rFonts w:ascii="Nyala" w:cs="Nyala" w:eastAsia="Nyala" w:hAnsi="Nyala"/>
-          <w:b/>
-          <w:bCs/>
-        </w:rPr>
-        <w:t xml:space="preserve">26.3  </w:t>
-      </w:r>
-      <w:r>
-        <w:rPr>
-          <w:rFonts w:ascii="Nyala" w:cs="Nyala" w:eastAsia="Nyala" w:hAnsi="Nyala"/>
-        </w:rPr>
-        <w:t xml:space="preserve">የመረጃው ባለቤትነትና ምስጢራዊነትን በተመለከተ ስምምነት (ለምሳሌ የመግባቢያ ሰነድ) ያስፈልጋል?</w:t>
-      </w:r>
-    </w:p>
-    <w:p>
-      <w:pPr>
-        <w:spacing w:after="100" w:line="300"/>
-        <w:ind w:left="567" w:hanging="567"/>
-      </w:pPr>
-      <w:r>
-        <w:rPr>
-          <w:rFonts w:ascii="Nyala" w:cs="Nyala" w:eastAsia="Nyala" w:hAnsi="Nyala"/>
-          <w:b/>
-          <w:bCs/>
-        </w:rPr>
-        <w:t xml:space="preserve">26.4  </w:t>
-      </w:r>
-      <w:r>
-        <w:rPr>
-          <w:rFonts w:ascii="Nyala" w:cs="Nyala" w:eastAsia="Nyala" w:hAnsi="Nyala"/>
-        </w:rPr>
-        <w:t xml:space="preserve">በሥርዓቱ የሚታተሙ፣ በQR ኮድና በኤሌክትሮኒክ ፊርማ የሚረጋገጡ ሰነዶች ተቀባይነት ይኖራቸዋል? ወይስ እያንዳንዱ ሰነድ የእጅ ፊርማና ማኅተም ያስፈልገዋል?</w:t>
-      </w:r>
-    </w:p>
-    <w:p>
-      <w:pPr>
-        <w:spacing w:after="100" w:line="300"/>
-        <w:ind w:left="567" w:hanging="567"/>
-      </w:pPr>
-      <w:r>
-        <w:rPr>
-          <w:rFonts w:ascii="Nyala" w:cs="Nyala" w:eastAsia="Nyala" w:hAnsi="Nyala"/>
-          <w:b/>
-          <w:bCs/>
-        </w:rPr>
-        <w:t xml:space="preserve">26.5  </w:t>
       </w:r>
       <w:r>
         <w:rPr>
@@ -20622,1531 +19865,7 @@
         <w:rPr>
           <w:rFonts w:ascii="Nyala" w:cs="Nyala" w:eastAsia="Nyala" w:hAnsi="Nyala"/>
         </w:rPr>
-        <w:t xml:space="preserve">አባሪ ሐ፦ ወራትና ቀናት በወላይትኛ (ለጥያቄ 6)</w:t>
-      </w:r>
-    </w:p>
-    <w:p>
-      <w:pPr>
-        <w:keepNext/>
-        <w:spacing w:before="120" w:after="60"/>
-      </w:pPr>
-      <w:r>
-        <w:rPr>
-          <w:rFonts w:ascii="Nyala" w:cs="Nyala" w:eastAsia="Nyala" w:hAnsi="Nyala"/>
-          <w:b/>
-          <w:bCs/>
-          <w:color w:val="1F3864"/>
-        </w:rPr>
-        <w:t xml:space="preserve">ወራት</w:t>
-      </w:r>
-    </w:p>
-    <w:tbl>
-      <w:tblPr>
-        <w:tblW w:type="dxa" w:w="9638"/>
-        <w:tblBorders>
-          <w:top w:val="single" w:color="auto" w:sz="4"/>
-          <w:left w:val="single" w:color="auto" w:sz="4"/>
-          <w:bottom w:val="single" w:color="auto" w:sz="4"/>
-          <w:right w:val="single" w:color="auto" w:sz="4"/>
-          <w:insideH w:val="single" w:color="auto" w:sz="4"/>
-          <w:insideV w:val="single" w:color="auto" w:sz="4"/>
-        </w:tblBorders>
-      </w:tblPr>
-      <w:tblGrid>
-        <w:gridCol w:w="3000"/>
-        <w:gridCol w:w="3000"/>
-        <w:gridCol w:w="3638"/>
-      </w:tblGrid>
-      <w:tr>
-        <w:trPr>
-          <w:tblHeader/>
-        </w:trPr>
-        <w:tc>
-          <w:tcPr>
-            <w:tcW w:type="dxa" w:w="3000"/>
-            <w:shd w:fill="D9E2F3" w:color="auto" w:val="clear"/>
-            <w:tcMar>
-              <w:top w:type="dxa" w:w="60"/>
-              <w:left w:type="dxa" w:w="100"/>
-              <w:bottom w:type="dxa" w:w="60"/>
-              <w:right w:type="dxa" w:w="100"/>
-            </w:tcMar>
-          </w:tcPr>
-          <w:p>
-            <w:r>
-              <w:rPr>
-                <w:rFonts w:ascii="Nyala" w:cs="Nyala" w:eastAsia="Nyala" w:hAnsi="Nyala"/>
-                <w:b/>
-                <w:bCs/>
-              </w:rPr>
-              <w:t xml:space="preserve">አማርኛ</w:t>
-            </w:r>
-          </w:p>
-        </w:tc>
-        <w:tc>
-          <w:tcPr>
-            <w:tcW w:type="dxa" w:w="3000"/>
-            <w:shd w:fill="D9E2F3" w:color="auto" w:val="clear"/>
-            <w:tcMar>
-              <w:top w:type="dxa" w:w="60"/>
-              <w:left w:type="dxa" w:w="100"/>
-              <w:bottom w:type="dxa" w:w="60"/>
-              <w:right w:type="dxa" w:w="100"/>
-            </w:tcMar>
-          </w:tcPr>
-          <w:p>
-            <w:r>
-              <w:rPr>
-                <w:rFonts w:ascii="Nyala" w:cs="Nyala" w:eastAsia="Nyala" w:hAnsi="Nyala"/>
-                <w:b/>
-                <w:bCs/>
-              </w:rPr>
-              <w:t xml:space="preserve">እንግሊዝኛ</w:t>
-            </w:r>
-          </w:p>
-        </w:tc>
-        <w:tc>
-          <w:tcPr>
-            <w:tcW w:type="dxa" w:w="3638"/>
-            <w:shd w:fill="D9E2F3" w:color="auto" w:val="clear"/>
-            <w:tcMar>
-              <w:top w:type="dxa" w:w="60"/>
-              <w:left w:type="dxa" w:w="100"/>
-              <w:bottom w:type="dxa" w:w="60"/>
-              <w:right w:type="dxa" w:w="100"/>
-            </w:tcMar>
-          </w:tcPr>
-          <w:p>
-            <w:r>
-              <w:rPr>
-                <w:rFonts w:ascii="Nyala" w:cs="Nyala" w:eastAsia="Nyala" w:hAnsi="Nyala"/>
-                <w:b/>
-                <w:bCs/>
-              </w:rPr>
-              <w:t xml:space="preserve">ወላይትኛ (ይሙሉ)</w:t>
-            </w:r>
-          </w:p>
-        </w:tc>
-      </w:tr>
-      <w:tr>
-        <w:tc>
-          <w:tcPr>
-            <w:tcW w:type="dxa" w:w="3000"/>
-            <w:tcMar>
-              <w:top w:type="dxa" w:w="60"/>
-              <w:left w:type="dxa" w:w="100"/>
-              <w:bottom w:type="dxa" w:w="60"/>
-              <w:right w:type="dxa" w:w="100"/>
-            </w:tcMar>
-          </w:tcPr>
-          <w:p>
-            <w:r>
-              <w:rPr>
-                <w:rFonts w:ascii="Nyala" w:cs="Nyala" w:eastAsia="Nyala" w:hAnsi="Nyala"/>
-                <w:b w:val="false"/>
-                <w:bCs w:val="false"/>
-              </w:rPr>
-              <w:t xml:space="preserve">መስከረም</w:t>
-            </w:r>
-          </w:p>
-        </w:tc>
-        <w:tc>
-          <w:tcPr>
-            <w:tcW w:type="dxa" w:w="3000"/>
-            <w:tcMar>
-              <w:top w:type="dxa" w:w="60"/>
-              <w:left w:type="dxa" w:w="100"/>
-              <w:bottom w:type="dxa" w:w="60"/>
-              <w:right w:type="dxa" w:w="100"/>
-            </w:tcMar>
-          </w:tcPr>
-          <w:p>
-            <w:r>
-              <w:rPr>
-                <w:rFonts w:ascii="Nyala" w:cs="Nyala" w:eastAsia="Nyala" w:hAnsi="Nyala"/>
-                <w:b w:val="false"/>
-                <w:bCs w:val="false"/>
-              </w:rPr>
-              <w:t xml:space="preserve">Meskerem</w:t>
-            </w:r>
-          </w:p>
-        </w:tc>
-        <w:tc>
-          <w:tcPr>
-            <w:tcW w:type="dxa" w:w="3638"/>
-            <w:tcMar>
-              <w:top w:type="dxa" w:w="60"/>
-              <w:left w:type="dxa" w:w="100"/>
-              <w:bottom w:type="dxa" w:w="60"/>
-              <w:right w:type="dxa" w:w="100"/>
-            </w:tcMar>
-          </w:tcPr>
-          <w:p>
-            <w:r>
-              <w:rPr>
-                <w:rFonts w:ascii="Nyala" w:cs="Nyala" w:eastAsia="Nyala" w:hAnsi="Nyala"/>
-                <w:b w:val="false"/>
-                <w:bCs w:val="false"/>
-              </w:rPr>
-              <w:t xml:space="preserve"/>
-            </w:r>
-          </w:p>
-        </w:tc>
-      </w:tr>
-      <w:tr>
-        <w:tc>
-          <w:tcPr>
-            <w:tcW w:type="dxa" w:w="3000"/>
-            <w:tcMar>
-              <w:top w:type="dxa" w:w="60"/>
-              <w:left w:type="dxa" w:w="100"/>
-              <w:bottom w:type="dxa" w:w="60"/>
-              <w:right w:type="dxa" w:w="100"/>
-            </w:tcMar>
-          </w:tcPr>
-          <w:p>
-            <w:r>
-              <w:rPr>
-                <w:rFonts w:ascii="Nyala" w:cs="Nyala" w:eastAsia="Nyala" w:hAnsi="Nyala"/>
-                <w:b w:val="false"/>
-                <w:bCs w:val="false"/>
-              </w:rPr>
-              <w:t xml:space="preserve">ጥቅምት</w:t>
-            </w:r>
-          </w:p>
-        </w:tc>
-        <w:tc>
-          <w:tcPr>
-            <w:tcW w:type="dxa" w:w="3000"/>
-            <w:tcMar>
-              <w:top w:type="dxa" w:w="60"/>
-              <w:left w:type="dxa" w:w="100"/>
-              <w:bottom w:type="dxa" w:w="60"/>
-              <w:right w:type="dxa" w:w="100"/>
-            </w:tcMar>
-          </w:tcPr>
-          <w:p>
-            <w:r>
-              <w:rPr>
-                <w:rFonts w:ascii="Nyala" w:cs="Nyala" w:eastAsia="Nyala" w:hAnsi="Nyala"/>
-                <w:b w:val="false"/>
-                <w:bCs w:val="false"/>
-              </w:rPr>
-              <w:t xml:space="preserve">Tikimt</w:t>
-            </w:r>
-          </w:p>
-        </w:tc>
-        <w:tc>
-          <w:tcPr>
-            <w:tcW w:type="dxa" w:w="3638"/>
-            <w:tcMar>
-              <w:top w:type="dxa" w:w="60"/>
-              <w:left w:type="dxa" w:w="100"/>
-              <w:bottom w:type="dxa" w:w="60"/>
-              <w:right w:type="dxa" w:w="100"/>
-            </w:tcMar>
-          </w:tcPr>
-          <w:p>
-            <w:r>
-              <w:rPr>
-                <w:rFonts w:ascii="Nyala" w:cs="Nyala" w:eastAsia="Nyala" w:hAnsi="Nyala"/>
-                <w:b w:val="false"/>
-                <w:bCs w:val="false"/>
-              </w:rPr>
-              <w:t xml:space="preserve"/>
-            </w:r>
-          </w:p>
-        </w:tc>
-      </w:tr>
-      <w:tr>
-        <w:tc>
-          <w:tcPr>
-            <w:tcW w:type="dxa" w:w="3000"/>
-            <w:tcMar>
-              <w:top w:type="dxa" w:w="60"/>
-              <w:left w:type="dxa" w:w="100"/>
-              <w:bottom w:type="dxa" w:w="60"/>
-              <w:right w:type="dxa" w:w="100"/>
-            </w:tcMar>
-          </w:tcPr>
-          <w:p>
-            <w:r>
-              <w:rPr>
-                <w:rFonts w:ascii="Nyala" w:cs="Nyala" w:eastAsia="Nyala" w:hAnsi="Nyala"/>
-                <w:b w:val="false"/>
-                <w:bCs w:val="false"/>
-              </w:rPr>
-              <w:t xml:space="preserve">ኅዳር</w:t>
-            </w:r>
-          </w:p>
-        </w:tc>
-        <w:tc>
-          <w:tcPr>
-            <w:tcW w:type="dxa" w:w="3000"/>
-            <w:tcMar>
-              <w:top w:type="dxa" w:w="60"/>
-              <w:left w:type="dxa" w:w="100"/>
-              <w:bottom w:type="dxa" w:w="60"/>
-              <w:right w:type="dxa" w:w="100"/>
-            </w:tcMar>
-          </w:tcPr>
-          <w:p>
-            <w:r>
-              <w:rPr>
-                <w:rFonts w:ascii="Nyala" w:cs="Nyala" w:eastAsia="Nyala" w:hAnsi="Nyala"/>
-                <w:b w:val="false"/>
-                <w:bCs w:val="false"/>
-              </w:rPr>
-              <w:t xml:space="preserve">Hidar</w:t>
-            </w:r>
-          </w:p>
-        </w:tc>
-        <w:tc>
-          <w:tcPr>
-            <w:tcW w:type="dxa" w:w="3638"/>
-            <w:tcMar>
-              <w:top w:type="dxa" w:w="60"/>
-              <w:left w:type="dxa" w:w="100"/>
-              <w:bottom w:type="dxa" w:w="60"/>
-              <w:right w:type="dxa" w:w="100"/>
-            </w:tcMar>
-          </w:tcPr>
-          <w:p>
-            <w:r>
-              <w:rPr>
-                <w:rFonts w:ascii="Nyala" w:cs="Nyala" w:eastAsia="Nyala" w:hAnsi="Nyala"/>
-                <w:b w:val="false"/>
-                <w:bCs w:val="false"/>
-              </w:rPr>
-              <w:t xml:space="preserve"/>
-            </w:r>
-          </w:p>
-        </w:tc>
-      </w:tr>
-      <w:tr>
-        <w:tc>
-          <w:tcPr>
-            <w:tcW w:type="dxa" w:w="3000"/>
-            <w:tcMar>
-              <w:top w:type="dxa" w:w="60"/>
-              <w:left w:type="dxa" w:w="100"/>
-              <w:bottom w:type="dxa" w:w="60"/>
-              <w:right w:type="dxa" w:w="100"/>
-            </w:tcMar>
-          </w:tcPr>
-          <w:p>
-            <w:r>
-              <w:rPr>
-                <w:rFonts w:ascii="Nyala" w:cs="Nyala" w:eastAsia="Nyala" w:hAnsi="Nyala"/>
-                <w:b w:val="false"/>
-                <w:bCs w:val="false"/>
-              </w:rPr>
-              <w:t xml:space="preserve">ታኅሣሥ</w:t>
-            </w:r>
-          </w:p>
-        </w:tc>
-        <w:tc>
-          <w:tcPr>
-            <w:tcW w:type="dxa" w:w="3000"/>
-            <w:tcMar>
-              <w:top w:type="dxa" w:w="60"/>
-              <w:left w:type="dxa" w:w="100"/>
-              <w:bottom w:type="dxa" w:w="60"/>
-              <w:right w:type="dxa" w:w="100"/>
-            </w:tcMar>
-          </w:tcPr>
-          <w:p>
-            <w:r>
-              <w:rPr>
-                <w:rFonts w:ascii="Nyala" w:cs="Nyala" w:eastAsia="Nyala" w:hAnsi="Nyala"/>
-                <w:b w:val="false"/>
-                <w:bCs w:val="false"/>
-              </w:rPr>
-              <w:t xml:space="preserve">Tahsas</w:t>
-            </w:r>
-          </w:p>
-        </w:tc>
-        <w:tc>
-          <w:tcPr>
-            <w:tcW w:type="dxa" w:w="3638"/>
-            <w:tcMar>
-              <w:top w:type="dxa" w:w="60"/>
-              <w:left w:type="dxa" w:w="100"/>
-              <w:bottom w:type="dxa" w:w="60"/>
-              <w:right w:type="dxa" w:w="100"/>
-            </w:tcMar>
-          </w:tcPr>
-          <w:p>
-            <w:r>
-              <w:rPr>
-                <w:rFonts w:ascii="Nyala" w:cs="Nyala" w:eastAsia="Nyala" w:hAnsi="Nyala"/>
-                <w:b w:val="false"/>
-                <w:bCs w:val="false"/>
-              </w:rPr>
-              <w:t xml:space="preserve"/>
-            </w:r>
-          </w:p>
-        </w:tc>
-      </w:tr>
-      <w:tr>
-        <w:tc>
-          <w:tcPr>
-            <w:tcW w:type="dxa" w:w="3000"/>
-            <w:tcMar>
-              <w:top w:type="dxa" w:w="60"/>
-              <w:left w:type="dxa" w:w="100"/>
-              <w:bottom w:type="dxa" w:w="60"/>
-              <w:right w:type="dxa" w:w="100"/>
-            </w:tcMar>
-          </w:tcPr>
-          <w:p>
-            <w:r>
-              <w:rPr>
-                <w:rFonts w:ascii="Nyala" w:cs="Nyala" w:eastAsia="Nyala" w:hAnsi="Nyala"/>
-                <w:b w:val="false"/>
-                <w:bCs w:val="false"/>
-              </w:rPr>
-              <w:t xml:space="preserve">ጥር</w:t>
-            </w:r>
-          </w:p>
-        </w:tc>
-        <w:tc>
-          <w:tcPr>
-            <w:tcW w:type="dxa" w:w="3000"/>
-            <w:tcMar>
-              <w:top w:type="dxa" w:w="60"/>
-              <w:left w:type="dxa" w:w="100"/>
-              <w:bottom w:type="dxa" w:w="60"/>
-              <w:right w:type="dxa" w:w="100"/>
-            </w:tcMar>
-          </w:tcPr>
-          <w:p>
-            <w:r>
-              <w:rPr>
-                <w:rFonts w:ascii="Nyala" w:cs="Nyala" w:eastAsia="Nyala" w:hAnsi="Nyala"/>
-                <w:b w:val="false"/>
-                <w:bCs w:val="false"/>
-              </w:rPr>
-              <w:t xml:space="preserve">Tir</w:t>
-            </w:r>
-          </w:p>
-        </w:tc>
-        <w:tc>
-          <w:tcPr>
-            <w:tcW w:type="dxa" w:w="3638"/>
-            <w:tcMar>
-              <w:top w:type="dxa" w:w="60"/>
-              <w:left w:type="dxa" w:w="100"/>
-              <w:bottom w:type="dxa" w:w="60"/>
-              <w:right w:type="dxa" w:w="100"/>
-            </w:tcMar>
-          </w:tcPr>
-          <w:p>
-            <w:r>
-              <w:rPr>
-                <w:rFonts w:ascii="Nyala" w:cs="Nyala" w:eastAsia="Nyala" w:hAnsi="Nyala"/>
-                <w:b w:val="false"/>
-                <w:bCs w:val="false"/>
-              </w:rPr>
-              <w:t xml:space="preserve"/>
-            </w:r>
-          </w:p>
-        </w:tc>
-      </w:tr>
-      <w:tr>
-        <w:tc>
-          <w:tcPr>
-            <w:tcW w:type="dxa" w:w="3000"/>
-            <w:tcMar>
-              <w:top w:type="dxa" w:w="60"/>
-              <w:left w:type="dxa" w:w="100"/>
-              <w:bottom w:type="dxa" w:w="60"/>
-              <w:right w:type="dxa" w:w="100"/>
-            </w:tcMar>
-          </w:tcPr>
-          <w:p>
-            <w:r>
-              <w:rPr>
-                <w:rFonts w:ascii="Nyala" w:cs="Nyala" w:eastAsia="Nyala" w:hAnsi="Nyala"/>
-                <w:b w:val="false"/>
-                <w:bCs w:val="false"/>
-              </w:rPr>
-              <w:t xml:space="preserve">የካቲት</w:t>
-            </w:r>
-          </w:p>
-        </w:tc>
-        <w:tc>
-          <w:tcPr>
-            <w:tcW w:type="dxa" w:w="3000"/>
-            <w:tcMar>
-              <w:top w:type="dxa" w:w="60"/>
-              <w:left w:type="dxa" w:w="100"/>
-              <w:bottom w:type="dxa" w:w="60"/>
-              <w:right w:type="dxa" w:w="100"/>
-            </w:tcMar>
-          </w:tcPr>
-          <w:p>
-            <w:r>
-              <w:rPr>
-                <w:rFonts w:ascii="Nyala" w:cs="Nyala" w:eastAsia="Nyala" w:hAnsi="Nyala"/>
-                <w:b w:val="false"/>
-                <w:bCs w:val="false"/>
-              </w:rPr>
-              <w:t xml:space="preserve">Yekatit</w:t>
-            </w:r>
-          </w:p>
-        </w:tc>
-        <w:tc>
-          <w:tcPr>
-            <w:tcW w:type="dxa" w:w="3638"/>
-            <w:tcMar>
-              <w:top w:type="dxa" w:w="60"/>
-              <w:left w:type="dxa" w:w="100"/>
-              <w:bottom w:type="dxa" w:w="60"/>
-              <w:right w:type="dxa" w:w="100"/>
-            </w:tcMar>
-          </w:tcPr>
-          <w:p>
-            <w:r>
-              <w:rPr>
-                <w:rFonts w:ascii="Nyala" w:cs="Nyala" w:eastAsia="Nyala" w:hAnsi="Nyala"/>
-                <w:b w:val="false"/>
-                <w:bCs w:val="false"/>
-              </w:rPr>
-              <w:t xml:space="preserve"/>
-            </w:r>
-          </w:p>
-        </w:tc>
-      </w:tr>
-      <w:tr>
-        <w:tc>
-          <w:tcPr>
-            <w:tcW w:type="dxa" w:w="3000"/>
-            <w:tcMar>
-              <w:top w:type="dxa" w:w="60"/>
-              <w:left w:type="dxa" w:w="100"/>
-              <w:bottom w:type="dxa" w:w="60"/>
-              <w:right w:type="dxa" w:w="100"/>
-            </w:tcMar>
-          </w:tcPr>
-          <w:p>
-            <w:r>
-              <w:rPr>
-                <w:rFonts w:ascii="Nyala" w:cs="Nyala" w:eastAsia="Nyala" w:hAnsi="Nyala"/>
-                <w:b w:val="false"/>
-                <w:bCs w:val="false"/>
-              </w:rPr>
-              <w:t xml:space="preserve">መጋቢት</w:t>
-            </w:r>
-          </w:p>
-        </w:tc>
-        <w:tc>
-          <w:tcPr>
-            <w:tcW w:type="dxa" w:w="3000"/>
-            <w:tcMar>
-              <w:top w:type="dxa" w:w="60"/>
-              <w:left w:type="dxa" w:w="100"/>
-              <w:bottom w:type="dxa" w:w="60"/>
-              <w:right w:type="dxa" w:w="100"/>
-            </w:tcMar>
-          </w:tcPr>
-          <w:p>
-            <w:r>
-              <w:rPr>
-                <w:rFonts w:ascii="Nyala" w:cs="Nyala" w:eastAsia="Nyala" w:hAnsi="Nyala"/>
-                <w:b w:val="false"/>
-                <w:bCs w:val="false"/>
-              </w:rPr>
-              <w:t xml:space="preserve">Megabit</w:t>
-            </w:r>
-          </w:p>
-        </w:tc>
-        <w:tc>
-          <w:tcPr>
-            <w:tcW w:type="dxa" w:w="3638"/>
-            <w:tcMar>
-              <w:top w:type="dxa" w:w="60"/>
-              <w:left w:type="dxa" w:w="100"/>
-              <w:bottom w:type="dxa" w:w="60"/>
-              <w:right w:type="dxa" w:w="100"/>
-            </w:tcMar>
-          </w:tcPr>
-          <w:p>
-            <w:r>
-              <w:rPr>
-                <w:rFonts w:ascii="Nyala" w:cs="Nyala" w:eastAsia="Nyala" w:hAnsi="Nyala"/>
-                <w:b w:val="false"/>
-                <w:bCs w:val="false"/>
-              </w:rPr>
-              <w:t xml:space="preserve"/>
-            </w:r>
-          </w:p>
-        </w:tc>
-      </w:tr>
-      <w:tr>
-        <w:tc>
-          <w:tcPr>
-            <w:tcW w:type="dxa" w:w="3000"/>
-            <w:tcMar>
-              <w:top w:type="dxa" w:w="60"/>
-              <w:left w:type="dxa" w:w="100"/>
-              <w:bottom w:type="dxa" w:w="60"/>
-              <w:right w:type="dxa" w:w="100"/>
-            </w:tcMar>
-          </w:tcPr>
-          <w:p>
-            <w:r>
-              <w:rPr>
-                <w:rFonts w:ascii="Nyala" w:cs="Nyala" w:eastAsia="Nyala" w:hAnsi="Nyala"/>
-                <w:b w:val="false"/>
-                <w:bCs w:val="false"/>
-              </w:rPr>
-              <w:t xml:space="preserve">ሚያዝያ</w:t>
-            </w:r>
-          </w:p>
-        </w:tc>
-        <w:tc>
-          <w:tcPr>
-            <w:tcW w:type="dxa" w:w="3000"/>
-            <w:tcMar>
-              <w:top w:type="dxa" w:w="60"/>
-              <w:left w:type="dxa" w:w="100"/>
-              <w:bottom w:type="dxa" w:w="60"/>
-              <w:right w:type="dxa" w:w="100"/>
-            </w:tcMar>
-          </w:tcPr>
-          <w:p>
-            <w:r>
-              <w:rPr>
-                <w:rFonts w:ascii="Nyala" w:cs="Nyala" w:eastAsia="Nyala" w:hAnsi="Nyala"/>
-                <w:b w:val="false"/>
-                <w:bCs w:val="false"/>
-              </w:rPr>
-              <w:t xml:space="preserve">Miyazya</w:t>
-            </w:r>
-          </w:p>
-        </w:tc>
-        <w:tc>
-          <w:tcPr>
-            <w:tcW w:type="dxa" w:w="3638"/>
-            <w:tcMar>
-              <w:top w:type="dxa" w:w="60"/>
-              <w:left w:type="dxa" w:w="100"/>
-              <w:bottom w:type="dxa" w:w="60"/>
-              <w:right w:type="dxa" w:w="100"/>
-            </w:tcMar>
-          </w:tcPr>
-          <w:p>
-            <w:r>
-              <w:rPr>
-                <w:rFonts w:ascii="Nyala" w:cs="Nyala" w:eastAsia="Nyala" w:hAnsi="Nyala"/>
-                <w:b w:val="false"/>
-                <w:bCs w:val="false"/>
-              </w:rPr>
-              <w:t xml:space="preserve"/>
-            </w:r>
-          </w:p>
-        </w:tc>
-      </w:tr>
-      <w:tr>
-        <w:tc>
-          <w:tcPr>
-            <w:tcW w:type="dxa" w:w="3000"/>
-            <w:tcMar>
-              <w:top w:type="dxa" w:w="60"/>
-              <w:left w:type="dxa" w:w="100"/>
-              <w:bottom w:type="dxa" w:w="60"/>
-              <w:right w:type="dxa" w:w="100"/>
-            </w:tcMar>
-          </w:tcPr>
-          <w:p>
-            <w:r>
-              <w:rPr>
-                <w:rFonts w:ascii="Nyala" w:cs="Nyala" w:eastAsia="Nyala" w:hAnsi="Nyala"/>
-                <w:b w:val="false"/>
-                <w:bCs w:val="false"/>
-              </w:rPr>
-              <w:t xml:space="preserve">ግንቦት</w:t>
-            </w:r>
-          </w:p>
-        </w:tc>
-        <w:tc>
-          <w:tcPr>
-            <w:tcW w:type="dxa" w:w="3000"/>
-            <w:tcMar>
-              <w:top w:type="dxa" w:w="60"/>
-              <w:left w:type="dxa" w:w="100"/>
-              <w:bottom w:type="dxa" w:w="60"/>
-              <w:right w:type="dxa" w:w="100"/>
-            </w:tcMar>
-          </w:tcPr>
-          <w:p>
-            <w:r>
-              <w:rPr>
-                <w:rFonts w:ascii="Nyala" w:cs="Nyala" w:eastAsia="Nyala" w:hAnsi="Nyala"/>
-                <w:b w:val="false"/>
-                <w:bCs w:val="false"/>
-              </w:rPr>
-              <w:t xml:space="preserve">Ginbot</w:t>
-            </w:r>
-          </w:p>
-        </w:tc>
-        <w:tc>
-          <w:tcPr>
-            <w:tcW w:type="dxa" w:w="3638"/>
-            <w:tcMar>
-              <w:top w:type="dxa" w:w="60"/>
-              <w:left w:type="dxa" w:w="100"/>
-              <w:bottom w:type="dxa" w:w="60"/>
-              <w:right w:type="dxa" w:w="100"/>
-            </w:tcMar>
-          </w:tcPr>
-          <w:p>
-            <w:r>
-              <w:rPr>
-                <w:rFonts w:ascii="Nyala" w:cs="Nyala" w:eastAsia="Nyala" w:hAnsi="Nyala"/>
-                <w:b w:val="false"/>
-                <w:bCs w:val="false"/>
-              </w:rPr>
-              <w:t xml:space="preserve"/>
-            </w:r>
-          </w:p>
-        </w:tc>
-      </w:tr>
-      <w:tr>
-        <w:tc>
-          <w:tcPr>
-            <w:tcW w:type="dxa" w:w="3000"/>
-            <w:tcMar>
-              <w:top w:type="dxa" w:w="60"/>
-              <w:left w:type="dxa" w:w="100"/>
-              <w:bottom w:type="dxa" w:w="60"/>
-              <w:right w:type="dxa" w:w="100"/>
-            </w:tcMar>
-          </w:tcPr>
-          <w:p>
-            <w:r>
-              <w:rPr>
-                <w:rFonts w:ascii="Nyala" w:cs="Nyala" w:eastAsia="Nyala" w:hAnsi="Nyala"/>
-                <w:b w:val="false"/>
-                <w:bCs w:val="false"/>
-              </w:rPr>
-              <w:t xml:space="preserve">ሰኔ</w:t>
-            </w:r>
-          </w:p>
-        </w:tc>
-        <w:tc>
-          <w:tcPr>
-            <w:tcW w:type="dxa" w:w="3000"/>
-            <w:tcMar>
-              <w:top w:type="dxa" w:w="60"/>
-              <w:left w:type="dxa" w:w="100"/>
-              <w:bottom w:type="dxa" w:w="60"/>
-              <w:right w:type="dxa" w:w="100"/>
-            </w:tcMar>
-          </w:tcPr>
-          <w:p>
-            <w:r>
-              <w:rPr>
-                <w:rFonts w:ascii="Nyala" w:cs="Nyala" w:eastAsia="Nyala" w:hAnsi="Nyala"/>
-                <w:b w:val="false"/>
-                <w:bCs w:val="false"/>
-              </w:rPr>
-              <w:t xml:space="preserve">Sene</w:t>
-            </w:r>
-          </w:p>
-        </w:tc>
-        <w:tc>
-          <w:tcPr>
-            <w:tcW w:type="dxa" w:w="3638"/>
-            <w:tcMar>
-              <w:top w:type="dxa" w:w="60"/>
-              <w:left w:type="dxa" w:w="100"/>
-              <w:bottom w:type="dxa" w:w="60"/>
-              <w:right w:type="dxa" w:w="100"/>
-            </w:tcMar>
-          </w:tcPr>
-          <w:p>
-            <w:r>
-              <w:rPr>
-                <w:rFonts w:ascii="Nyala" w:cs="Nyala" w:eastAsia="Nyala" w:hAnsi="Nyala"/>
-                <w:b w:val="false"/>
-                <w:bCs w:val="false"/>
-              </w:rPr>
-              <w:t xml:space="preserve"/>
-            </w:r>
-          </w:p>
-        </w:tc>
-      </w:tr>
-      <w:tr>
-        <w:tc>
-          <w:tcPr>
-            <w:tcW w:type="dxa" w:w="3000"/>
-            <w:tcMar>
-              <w:top w:type="dxa" w:w="60"/>
-              <w:left w:type="dxa" w:w="100"/>
-              <w:bottom w:type="dxa" w:w="60"/>
-              <w:right w:type="dxa" w:w="100"/>
-            </w:tcMar>
-          </w:tcPr>
-          <w:p>
-            <w:r>
-              <w:rPr>
-                <w:rFonts w:ascii="Nyala" w:cs="Nyala" w:eastAsia="Nyala" w:hAnsi="Nyala"/>
-                <w:b w:val="false"/>
-                <w:bCs w:val="false"/>
-              </w:rPr>
-              <w:t xml:space="preserve">ሐምሌ</w:t>
-            </w:r>
-          </w:p>
-        </w:tc>
-        <w:tc>
-          <w:tcPr>
-            <w:tcW w:type="dxa" w:w="3000"/>
-            <w:tcMar>
-              <w:top w:type="dxa" w:w="60"/>
-              <w:left w:type="dxa" w:w="100"/>
-              <w:bottom w:type="dxa" w:w="60"/>
-              <w:right w:type="dxa" w:w="100"/>
-            </w:tcMar>
-          </w:tcPr>
-          <w:p>
-            <w:r>
-              <w:rPr>
-                <w:rFonts w:ascii="Nyala" w:cs="Nyala" w:eastAsia="Nyala" w:hAnsi="Nyala"/>
-                <w:b w:val="false"/>
-                <w:bCs w:val="false"/>
-              </w:rPr>
-              <w:t xml:space="preserve">Hamle</w:t>
-            </w:r>
-          </w:p>
-        </w:tc>
-        <w:tc>
-          <w:tcPr>
-            <w:tcW w:type="dxa" w:w="3638"/>
-            <w:tcMar>
-              <w:top w:type="dxa" w:w="60"/>
-              <w:left w:type="dxa" w:w="100"/>
-              <w:bottom w:type="dxa" w:w="60"/>
-              <w:right w:type="dxa" w:w="100"/>
-            </w:tcMar>
-          </w:tcPr>
-          <w:p>
-            <w:r>
-              <w:rPr>
-                <w:rFonts w:ascii="Nyala" w:cs="Nyala" w:eastAsia="Nyala" w:hAnsi="Nyala"/>
-                <w:b w:val="false"/>
-                <w:bCs w:val="false"/>
-              </w:rPr>
-              <w:t xml:space="preserve"/>
-            </w:r>
-          </w:p>
-        </w:tc>
-      </w:tr>
-      <w:tr>
-        <w:tc>
-          <w:tcPr>
-            <w:tcW w:type="dxa" w:w="3000"/>
-            <w:tcMar>
-              <w:top w:type="dxa" w:w="60"/>
-              <w:left w:type="dxa" w:w="100"/>
-              <w:bottom w:type="dxa" w:w="60"/>
-              <w:right w:type="dxa" w:w="100"/>
-            </w:tcMar>
-          </w:tcPr>
-          <w:p>
-            <w:r>
-              <w:rPr>
-                <w:rFonts w:ascii="Nyala" w:cs="Nyala" w:eastAsia="Nyala" w:hAnsi="Nyala"/>
-                <w:b w:val="false"/>
-                <w:bCs w:val="false"/>
-              </w:rPr>
-              <w:t xml:space="preserve">ነሐሴ</w:t>
-            </w:r>
-          </w:p>
-        </w:tc>
-        <w:tc>
-          <w:tcPr>
-            <w:tcW w:type="dxa" w:w="3000"/>
-            <w:tcMar>
-              <w:top w:type="dxa" w:w="60"/>
-              <w:left w:type="dxa" w:w="100"/>
-              <w:bottom w:type="dxa" w:w="60"/>
-              <w:right w:type="dxa" w:w="100"/>
-            </w:tcMar>
-          </w:tcPr>
-          <w:p>
-            <w:r>
-              <w:rPr>
-                <w:rFonts w:ascii="Nyala" w:cs="Nyala" w:eastAsia="Nyala" w:hAnsi="Nyala"/>
-                <w:b w:val="false"/>
-                <w:bCs w:val="false"/>
-              </w:rPr>
-              <w:t xml:space="preserve">Nehase</w:t>
-            </w:r>
-          </w:p>
-        </w:tc>
-        <w:tc>
-          <w:tcPr>
-            <w:tcW w:type="dxa" w:w="3638"/>
-            <w:tcMar>
-              <w:top w:type="dxa" w:w="60"/>
-              <w:left w:type="dxa" w:w="100"/>
-              <w:bottom w:type="dxa" w:w="60"/>
-              <w:right w:type="dxa" w:w="100"/>
-            </w:tcMar>
-          </w:tcPr>
-          <w:p>
-            <w:r>
-              <w:rPr>
-                <w:rFonts w:ascii="Nyala" w:cs="Nyala" w:eastAsia="Nyala" w:hAnsi="Nyala"/>
-                <w:b w:val="false"/>
-                <w:bCs w:val="false"/>
-              </w:rPr>
-              <w:t xml:space="preserve"/>
-            </w:r>
-          </w:p>
-        </w:tc>
-      </w:tr>
-      <w:tr>
-        <w:tc>
-          <w:tcPr>
-            <w:tcW w:type="dxa" w:w="3000"/>
-            <w:tcMar>
-              <w:top w:type="dxa" w:w="60"/>
-              <w:left w:type="dxa" w:w="100"/>
-              <w:bottom w:type="dxa" w:w="60"/>
-              <w:right w:type="dxa" w:w="100"/>
-            </w:tcMar>
-          </w:tcPr>
-          <w:p>
-            <w:r>
-              <w:rPr>
-                <w:rFonts w:ascii="Nyala" w:cs="Nyala" w:eastAsia="Nyala" w:hAnsi="Nyala"/>
-                <w:b w:val="false"/>
-                <w:bCs w:val="false"/>
-              </w:rPr>
-              <w:t xml:space="preserve">ጳጉሜ</w:t>
-            </w:r>
-          </w:p>
-        </w:tc>
-        <w:tc>
-          <w:tcPr>
-            <w:tcW w:type="dxa" w:w="3000"/>
-            <w:tcMar>
-              <w:top w:type="dxa" w:w="60"/>
-              <w:left w:type="dxa" w:w="100"/>
-              <w:bottom w:type="dxa" w:w="60"/>
-              <w:right w:type="dxa" w:w="100"/>
-            </w:tcMar>
-          </w:tcPr>
-          <w:p>
-            <w:r>
-              <w:rPr>
-                <w:rFonts w:ascii="Nyala" w:cs="Nyala" w:eastAsia="Nyala" w:hAnsi="Nyala"/>
-                <w:b w:val="false"/>
-                <w:bCs w:val="false"/>
-              </w:rPr>
-              <w:t xml:space="preserve">Pagume</w:t>
-            </w:r>
-          </w:p>
-        </w:tc>
-        <w:tc>
-          <w:tcPr>
-            <w:tcW w:type="dxa" w:w="3638"/>
-            <w:tcMar>
-              <w:top w:type="dxa" w:w="60"/>
-              <w:left w:type="dxa" w:w="100"/>
-              <w:bottom w:type="dxa" w:w="60"/>
-              <w:right w:type="dxa" w:w="100"/>
-            </w:tcMar>
-          </w:tcPr>
-          <w:p>
-            <w:r>
-              <w:rPr>
-                <w:rFonts w:ascii="Nyala" w:cs="Nyala" w:eastAsia="Nyala" w:hAnsi="Nyala"/>
-                <w:b w:val="false"/>
-                <w:bCs w:val="false"/>
-              </w:rPr>
-              <w:t xml:space="preserve"/>
-            </w:r>
-          </w:p>
-        </w:tc>
-      </w:tr>
-    </w:tbl>
-    <w:p>
-      <w:pPr>
-        <w:keepNext/>
-        <w:spacing w:before="120" w:after="60"/>
-      </w:pPr>
-      <w:r>
-        <w:rPr>
-          <w:rFonts w:ascii="Nyala" w:cs="Nyala" w:eastAsia="Nyala" w:hAnsi="Nyala"/>
-          <w:b/>
-          <w:bCs/>
-          <w:color w:val="1F3864"/>
-        </w:rPr>
-        <w:t xml:space="preserve">የሳምንቱ ቀናት</w:t>
-      </w:r>
-    </w:p>
-    <w:tbl>
-      <w:tblPr>
-        <w:tblW w:type="dxa" w:w="9638"/>
-        <w:tblBorders>
-          <w:top w:val="single" w:color="auto" w:sz="4"/>
-          <w:left w:val="single" w:color="auto" w:sz="4"/>
-          <w:bottom w:val="single" w:color="auto" w:sz="4"/>
-          <w:right w:val="single" w:color="auto" w:sz="4"/>
-          <w:insideH w:val="single" w:color="auto" w:sz="4"/>
-          <w:insideV w:val="single" w:color="auto" w:sz="4"/>
-        </w:tblBorders>
-      </w:tblPr>
-      <w:tblGrid>
-        <w:gridCol w:w="3000"/>
-        <w:gridCol w:w="3000"/>
-        <w:gridCol w:w="3638"/>
-      </w:tblGrid>
-      <w:tr>
-        <w:trPr>
-          <w:tblHeader/>
-        </w:trPr>
-        <w:tc>
-          <w:tcPr>
-            <w:tcW w:type="dxa" w:w="3000"/>
-            <w:shd w:fill="D9E2F3" w:color="auto" w:val="clear"/>
-            <w:tcMar>
-              <w:top w:type="dxa" w:w="60"/>
-              <w:left w:type="dxa" w:w="100"/>
-              <w:bottom w:type="dxa" w:w="60"/>
-              <w:right w:type="dxa" w:w="100"/>
-            </w:tcMar>
-          </w:tcPr>
-          <w:p>
-            <w:r>
-              <w:rPr>
-                <w:rFonts w:ascii="Nyala" w:cs="Nyala" w:eastAsia="Nyala" w:hAnsi="Nyala"/>
-                <w:b/>
-                <w:bCs/>
-              </w:rPr>
-              <w:t xml:space="preserve">አማርኛ</w:t>
-            </w:r>
-          </w:p>
-        </w:tc>
-        <w:tc>
-          <w:tcPr>
-            <w:tcW w:type="dxa" w:w="3000"/>
-            <w:shd w:fill="D9E2F3" w:color="auto" w:val="clear"/>
-            <w:tcMar>
-              <w:top w:type="dxa" w:w="60"/>
-              <w:left w:type="dxa" w:w="100"/>
-              <w:bottom w:type="dxa" w:w="60"/>
-              <w:right w:type="dxa" w:w="100"/>
-            </w:tcMar>
-          </w:tcPr>
-          <w:p>
-            <w:r>
-              <w:rPr>
-                <w:rFonts w:ascii="Nyala" w:cs="Nyala" w:eastAsia="Nyala" w:hAnsi="Nyala"/>
-                <w:b/>
-                <w:bCs/>
-              </w:rPr>
-              <w:t xml:space="preserve">እንግሊዝኛ</w:t>
-            </w:r>
-          </w:p>
-        </w:tc>
-        <w:tc>
-          <w:tcPr>
-            <w:tcW w:type="dxa" w:w="3638"/>
-            <w:shd w:fill="D9E2F3" w:color="auto" w:val="clear"/>
-            <w:tcMar>
-              <w:top w:type="dxa" w:w="60"/>
-              <w:left w:type="dxa" w:w="100"/>
-              <w:bottom w:type="dxa" w:w="60"/>
-              <w:right w:type="dxa" w:w="100"/>
-            </w:tcMar>
-          </w:tcPr>
-          <w:p>
-            <w:r>
-              <w:rPr>
-                <w:rFonts w:ascii="Nyala" w:cs="Nyala" w:eastAsia="Nyala" w:hAnsi="Nyala"/>
-                <w:b/>
-                <w:bCs/>
-              </w:rPr>
-              <w:t xml:space="preserve">ወላይትኛ (ይሙሉ)</w:t>
-            </w:r>
-          </w:p>
-        </w:tc>
-      </w:tr>
-      <w:tr>
-        <w:tc>
-          <w:tcPr>
-            <w:tcW w:type="dxa" w:w="3000"/>
-            <w:tcMar>
-              <w:top w:type="dxa" w:w="60"/>
-              <w:left w:type="dxa" w:w="100"/>
-              <w:bottom w:type="dxa" w:w="60"/>
-              <w:right w:type="dxa" w:w="100"/>
-            </w:tcMar>
-          </w:tcPr>
-          <w:p>
-            <w:r>
-              <w:rPr>
-                <w:rFonts w:ascii="Nyala" w:cs="Nyala" w:eastAsia="Nyala" w:hAnsi="Nyala"/>
-                <w:b w:val="false"/>
-                <w:bCs w:val="false"/>
-              </w:rPr>
-              <w:t xml:space="preserve">እሑድ</w:t>
-            </w:r>
-          </w:p>
-        </w:tc>
-        <w:tc>
-          <w:tcPr>
-            <w:tcW w:type="dxa" w:w="3000"/>
-            <w:tcMar>
-              <w:top w:type="dxa" w:w="60"/>
-              <w:left w:type="dxa" w:w="100"/>
-              <w:bottom w:type="dxa" w:w="60"/>
-              <w:right w:type="dxa" w:w="100"/>
-            </w:tcMar>
-          </w:tcPr>
-          <w:p>
-            <w:r>
-              <w:rPr>
-                <w:rFonts w:ascii="Nyala" w:cs="Nyala" w:eastAsia="Nyala" w:hAnsi="Nyala"/>
-                <w:b w:val="false"/>
-                <w:bCs w:val="false"/>
-              </w:rPr>
-              <w:t xml:space="preserve">Sunday</w:t>
-            </w:r>
-          </w:p>
-        </w:tc>
-        <w:tc>
-          <w:tcPr>
-            <w:tcW w:type="dxa" w:w="3638"/>
-            <w:tcMar>
-              <w:top w:type="dxa" w:w="60"/>
-              <w:left w:type="dxa" w:w="100"/>
-              <w:bottom w:type="dxa" w:w="60"/>
-              <w:right w:type="dxa" w:w="100"/>
-            </w:tcMar>
-          </w:tcPr>
-          <w:p>
-            <w:r>
-              <w:rPr>
-                <w:rFonts w:ascii="Nyala" w:cs="Nyala" w:eastAsia="Nyala" w:hAnsi="Nyala"/>
-                <w:b w:val="false"/>
-                <w:bCs w:val="false"/>
-              </w:rPr>
-              <w:t xml:space="preserve"/>
-            </w:r>
-          </w:p>
-        </w:tc>
-      </w:tr>
-      <w:tr>
-        <w:tc>
-          <w:tcPr>
-            <w:tcW w:type="dxa" w:w="3000"/>
-            <w:tcMar>
-              <w:top w:type="dxa" w:w="60"/>
-              <w:left w:type="dxa" w:w="100"/>
-              <w:bottom w:type="dxa" w:w="60"/>
-              <w:right w:type="dxa" w:w="100"/>
-            </w:tcMar>
-          </w:tcPr>
-          <w:p>
-            <w:r>
-              <w:rPr>
-                <w:rFonts w:ascii="Nyala" w:cs="Nyala" w:eastAsia="Nyala" w:hAnsi="Nyala"/>
-                <w:b w:val="false"/>
-                <w:bCs w:val="false"/>
-              </w:rPr>
-              <w:t xml:space="preserve">ሰኞ</w:t>
-            </w:r>
-          </w:p>
-        </w:tc>
-        <w:tc>
-          <w:tcPr>
-            <w:tcW w:type="dxa" w:w="3000"/>
-            <w:tcMar>
-              <w:top w:type="dxa" w:w="60"/>
-              <w:left w:type="dxa" w:w="100"/>
-              <w:bottom w:type="dxa" w:w="60"/>
-              <w:right w:type="dxa" w:w="100"/>
-            </w:tcMar>
-          </w:tcPr>
-          <w:p>
-            <w:r>
-              <w:rPr>
-                <w:rFonts w:ascii="Nyala" w:cs="Nyala" w:eastAsia="Nyala" w:hAnsi="Nyala"/>
-                <w:b w:val="false"/>
-                <w:bCs w:val="false"/>
-              </w:rPr>
-              <w:t xml:space="preserve">Monday</w:t>
-            </w:r>
-          </w:p>
-        </w:tc>
-        <w:tc>
-          <w:tcPr>
-            <w:tcW w:type="dxa" w:w="3638"/>
-            <w:tcMar>
-              <w:top w:type="dxa" w:w="60"/>
-              <w:left w:type="dxa" w:w="100"/>
-              <w:bottom w:type="dxa" w:w="60"/>
-              <w:right w:type="dxa" w:w="100"/>
-            </w:tcMar>
-          </w:tcPr>
-          <w:p>
-            <w:r>
-              <w:rPr>
-                <w:rFonts w:ascii="Nyala" w:cs="Nyala" w:eastAsia="Nyala" w:hAnsi="Nyala"/>
-                <w:b w:val="false"/>
-                <w:bCs w:val="false"/>
-              </w:rPr>
-              <w:t xml:space="preserve"/>
-            </w:r>
-          </w:p>
-        </w:tc>
-      </w:tr>
-      <w:tr>
-        <w:tc>
-          <w:tcPr>
-            <w:tcW w:type="dxa" w:w="3000"/>
-            <w:tcMar>
-              <w:top w:type="dxa" w:w="60"/>
-              <w:left w:type="dxa" w:w="100"/>
-              <w:bottom w:type="dxa" w:w="60"/>
-              <w:right w:type="dxa" w:w="100"/>
-            </w:tcMar>
-          </w:tcPr>
-          <w:p>
-            <w:r>
-              <w:rPr>
-                <w:rFonts w:ascii="Nyala" w:cs="Nyala" w:eastAsia="Nyala" w:hAnsi="Nyala"/>
-                <w:b w:val="false"/>
-                <w:bCs w:val="false"/>
-              </w:rPr>
-              <w:t xml:space="preserve">ማክሰኞ</w:t>
-            </w:r>
-          </w:p>
-        </w:tc>
-        <w:tc>
-          <w:tcPr>
-            <w:tcW w:type="dxa" w:w="3000"/>
-            <w:tcMar>
-              <w:top w:type="dxa" w:w="60"/>
-              <w:left w:type="dxa" w:w="100"/>
-              <w:bottom w:type="dxa" w:w="60"/>
-              <w:right w:type="dxa" w:w="100"/>
-            </w:tcMar>
-          </w:tcPr>
-          <w:p>
-            <w:r>
-              <w:rPr>
-                <w:rFonts w:ascii="Nyala" w:cs="Nyala" w:eastAsia="Nyala" w:hAnsi="Nyala"/>
-                <w:b w:val="false"/>
-                <w:bCs w:val="false"/>
-              </w:rPr>
-              <w:t xml:space="preserve">Tuesday</w:t>
-            </w:r>
-          </w:p>
-        </w:tc>
-        <w:tc>
-          <w:tcPr>
-            <w:tcW w:type="dxa" w:w="3638"/>
-            <w:tcMar>
-              <w:top w:type="dxa" w:w="60"/>
-              <w:left w:type="dxa" w:w="100"/>
-              <w:bottom w:type="dxa" w:w="60"/>
-              <w:right w:type="dxa" w:w="100"/>
-            </w:tcMar>
-          </w:tcPr>
-          <w:p>
-            <w:r>
-              <w:rPr>
-                <w:rFonts w:ascii="Nyala" w:cs="Nyala" w:eastAsia="Nyala" w:hAnsi="Nyala"/>
-                <w:b w:val="false"/>
-                <w:bCs w:val="false"/>
-              </w:rPr>
-              <w:t xml:space="preserve"/>
-            </w:r>
-          </w:p>
-        </w:tc>
-      </w:tr>
-      <w:tr>
-        <w:tc>
-          <w:tcPr>
-            <w:tcW w:type="dxa" w:w="3000"/>
-            <w:tcMar>
-              <w:top w:type="dxa" w:w="60"/>
-              <w:left w:type="dxa" w:w="100"/>
-              <w:bottom w:type="dxa" w:w="60"/>
-              <w:right w:type="dxa" w:w="100"/>
-            </w:tcMar>
-          </w:tcPr>
-          <w:p>
-            <w:r>
-              <w:rPr>
-                <w:rFonts w:ascii="Nyala" w:cs="Nyala" w:eastAsia="Nyala" w:hAnsi="Nyala"/>
-                <w:b w:val="false"/>
-                <w:bCs w:val="false"/>
-              </w:rPr>
-              <w:t xml:space="preserve">ረቡዕ</w:t>
-            </w:r>
-          </w:p>
-        </w:tc>
-        <w:tc>
-          <w:tcPr>
-            <w:tcW w:type="dxa" w:w="3000"/>
-            <w:tcMar>
-              <w:top w:type="dxa" w:w="60"/>
-              <w:left w:type="dxa" w:w="100"/>
-              <w:bottom w:type="dxa" w:w="60"/>
-              <w:right w:type="dxa" w:w="100"/>
-            </w:tcMar>
-          </w:tcPr>
-          <w:p>
-            <w:r>
-              <w:rPr>
-                <w:rFonts w:ascii="Nyala" w:cs="Nyala" w:eastAsia="Nyala" w:hAnsi="Nyala"/>
-                <w:b w:val="false"/>
-                <w:bCs w:val="false"/>
-              </w:rPr>
-              <w:t xml:space="preserve">Wednesday</w:t>
-            </w:r>
-          </w:p>
-        </w:tc>
-        <w:tc>
-          <w:tcPr>
-            <w:tcW w:type="dxa" w:w="3638"/>
-            <w:tcMar>
-              <w:top w:type="dxa" w:w="60"/>
-              <w:left w:type="dxa" w:w="100"/>
-              <w:bottom w:type="dxa" w:w="60"/>
-              <w:right w:type="dxa" w:w="100"/>
-            </w:tcMar>
-          </w:tcPr>
-          <w:p>
-            <w:r>
-              <w:rPr>
-                <w:rFonts w:ascii="Nyala" w:cs="Nyala" w:eastAsia="Nyala" w:hAnsi="Nyala"/>
-                <w:b w:val="false"/>
-                <w:bCs w:val="false"/>
-              </w:rPr>
-              <w:t xml:space="preserve"/>
-            </w:r>
-          </w:p>
-        </w:tc>
-      </w:tr>
-      <w:tr>
-        <w:tc>
-          <w:tcPr>
-            <w:tcW w:type="dxa" w:w="3000"/>
-            <w:tcMar>
-              <w:top w:type="dxa" w:w="60"/>
-              <w:left w:type="dxa" w:w="100"/>
-              <w:bottom w:type="dxa" w:w="60"/>
-              <w:right w:type="dxa" w:w="100"/>
-            </w:tcMar>
-          </w:tcPr>
-          <w:p>
-            <w:r>
-              <w:rPr>
-                <w:rFonts w:ascii="Nyala" w:cs="Nyala" w:eastAsia="Nyala" w:hAnsi="Nyala"/>
-                <w:b w:val="false"/>
-                <w:bCs w:val="false"/>
-              </w:rPr>
-              <w:t xml:space="preserve">ሐሙስ</w:t>
-            </w:r>
-          </w:p>
-        </w:tc>
-        <w:tc>
-          <w:tcPr>
-            <w:tcW w:type="dxa" w:w="3000"/>
-            <w:tcMar>
-              <w:top w:type="dxa" w:w="60"/>
-              <w:left w:type="dxa" w:w="100"/>
-              <w:bottom w:type="dxa" w:w="60"/>
-              <w:right w:type="dxa" w:w="100"/>
-            </w:tcMar>
-          </w:tcPr>
-          <w:p>
-            <w:r>
-              <w:rPr>
-                <w:rFonts w:ascii="Nyala" w:cs="Nyala" w:eastAsia="Nyala" w:hAnsi="Nyala"/>
-                <w:b w:val="false"/>
-                <w:bCs w:val="false"/>
-              </w:rPr>
-              <w:t xml:space="preserve">Thursday</w:t>
-            </w:r>
-          </w:p>
-        </w:tc>
-        <w:tc>
-          <w:tcPr>
-            <w:tcW w:type="dxa" w:w="3638"/>
-            <w:tcMar>
-              <w:top w:type="dxa" w:w="60"/>
-              <w:left w:type="dxa" w:w="100"/>
-              <w:bottom w:type="dxa" w:w="60"/>
-              <w:right w:type="dxa" w:w="100"/>
-            </w:tcMar>
-          </w:tcPr>
-          <w:p>
-            <w:r>
-              <w:rPr>
-                <w:rFonts w:ascii="Nyala" w:cs="Nyala" w:eastAsia="Nyala" w:hAnsi="Nyala"/>
-                <w:b w:val="false"/>
-                <w:bCs w:val="false"/>
-              </w:rPr>
-              <w:t xml:space="preserve"/>
-            </w:r>
-          </w:p>
-        </w:tc>
-      </w:tr>
-      <w:tr>
-        <w:tc>
-          <w:tcPr>
-            <w:tcW w:type="dxa" w:w="3000"/>
-            <w:tcMar>
-              <w:top w:type="dxa" w:w="60"/>
-              <w:left w:type="dxa" w:w="100"/>
-              <w:bottom w:type="dxa" w:w="60"/>
-              <w:right w:type="dxa" w:w="100"/>
-            </w:tcMar>
-          </w:tcPr>
-          <w:p>
-            <w:r>
-              <w:rPr>
-                <w:rFonts w:ascii="Nyala" w:cs="Nyala" w:eastAsia="Nyala" w:hAnsi="Nyala"/>
-                <w:b w:val="false"/>
-                <w:bCs w:val="false"/>
-              </w:rPr>
-              <w:t xml:space="preserve">ዓርብ</w:t>
-            </w:r>
-          </w:p>
-        </w:tc>
-        <w:tc>
-          <w:tcPr>
-            <w:tcW w:type="dxa" w:w="3000"/>
-            <w:tcMar>
-              <w:top w:type="dxa" w:w="60"/>
-              <w:left w:type="dxa" w:w="100"/>
-              <w:bottom w:type="dxa" w:w="60"/>
-              <w:right w:type="dxa" w:w="100"/>
-            </w:tcMar>
-          </w:tcPr>
-          <w:p>
-            <w:r>
-              <w:rPr>
-                <w:rFonts w:ascii="Nyala" w:cs="Nyala" w:eastAsia="Nyala" w:hAnsi="Nyala"/>
-                <w:b w:val="false"/>
-                <w:bCs w:val="false"/>
-              </w:rPr>
-              <w:t xml:space="preserve">Friday</w:t>
-            </w:r>
-          </w:p>
-        </w:tc>
-        <w:tc>
-          <w:tcPr>
-            <w:tcW w:type="dxa" w:w="3638"/>
-            <w:tcMar>
-              <w:top w:type="dxa" w:w="60"/>
-              <w:left w:type="dxa" w:w="100"/>
-              <w:bottom w:type="dxa" w:w="60"/>
-              <w:right w:type="dxa" w:w="100"/>
-            </w:tcMar>
-          </w:tcPr>
-          <w:p>
-            <w:r>
-              <w:rPr>
-                <w:rFonts w:ascii="Nyala" w:cs="Nyala" w:eastAsia="Nyala" w:hAnsi="Nyala"/>
-                <w:b w:val="false"/>
-                <w:bCs w:val="false"/>
-              </w:rPr>
-              <w:t xml:space="preserve"/>
-            </w:r>
-          </w:p>
-        </w:tc>
-      </w:tr>
-      <w:tr>
-        <w:tc>
-          <w:tcPr>
-            <w:tcW w:type="dxa" w:w="3000"/>
-            <w:tcMar>
-              <w:top w:type="dxa" w:w="60"/>
-              <w:left w:type="dxa" w:w="100"/>
-              <w:bottom w:type="dxa" w:w="60"/>
-              <w:right w:type="dxa" w:w="100"/>
-            </w:tcMar>
-          </w:tcPr>
-          <w:p>
-            <w:r>
-              <w:rPr>
-                <w:rFonts w:ascii="Nyala" w:cs="Nyala" w:eastAsia="Nyala" w:hAnsi="Nyala"/>
-                <w:b w:val="false"/>
-                <w:bCs w:val="false"/>
-              </w:rPr>
-              <w:t xml:space="preserve">ቅዳሜ</w:t>
-            </w:r>
-          </w:p>
-        </w:tc>
-        <w:tc>
-          <w:tcPr>
-            <w:tcW w:type="dxa" w:w="3000"/>
-            <w:tcMar>
-              <w:top w:type="dxa" w:w="60"/>
-              <w:left w:type="dxa" w:w="100"/>
-              <w:bottom w:type="dxa" w:w="60"/>
-              <w:right w:type="dxa" w:w="100"/>
-            </w:tcMar>
-          </w:tcPr>
-          <w:p>
-            <w:r>
-              <w:rPr>
-                <w:rFonts w:ascii="Nyala" w:cs="Nyala" w:eastAsia="Nyala" w:hAnsi="Nyala"/>
-                <w:b w:val="false"/>
-                <w:bCs w:val="false"/>
-              </w:rPr>
-              <w:t xml:space="preserve">Saturday</w:t>
-            </w:r>
-          </w:p>
-        </w:tc>
-        <w:tc>
-          <w:tcPr>
-            <w:tcW w:type="dxa" w:w="3638"/>
-            <w:tcMar>
-              <w:top w:type="dxa" w:w="60"/>
-              <w:left w:type="dxa" w:w="100"/>
-              <w:bottom w:type="dxa" w:w="60"/>
-              <w:right w:type="dxa" w:w="100"/>
-            </w:tcMar>
-          </w:tcPr>
-          <w:p>
-            <w:r>
-              <w:rPr>
-                <w:rFonts w:ascii="Nyala" w:cs="Nyala" w:eastAsia="Nyala" w:hAnsi="Nyala"/>
-                <w:b w:val="false"/>
-                <w:bCs w:val="false"/>
-              </w:rPr>
-              <w:t xml:space="preserve"/>
-            </w:r>
-          </w:p>
-        </w:tc>
-      </w:tr>
-    </w:tbl>
-    <w:p>
-      <w:pPr>
-        <w:pageBreakBefore/>
-      </w:pPr>
-    </w:p>
-    <w:p>
-      <w:pPr>
-        <w:pStyle w:val="Heading1"/>
-      </w:pPr>
-      <w:r>
-        <w:rPr>
-          <w:rFonts w:ascii="Nyala" w:cs="Nyala" w:eastAsia="Nyala" w:hAnsi="Nyala"/>
-        </w:rPr>
-        <w:t xml:space="preserve">አባሪ መ፦ የባለድርሻ አካላት የመረጃ ልውውጥ (ለጥያቄ 21)</w:t>
+        <w:t xml:space="preserve">አባሪ ሐ፦ የባለድርሻ አካላት የመረጃ ልውውጥ (ለጥያቄ 19)</w:t>
       </w:r>
     </w:p>
     <w:p>
@@ -24635,7 +22354,7 @@
         <w:rPr>
           <w:rFonts w:ascii="Nyala" w:cs="Nyala" w:eastAsia="Nyala" w:hAnsi="Nyala"/>
         </w:rPr>
-        <w:t xml:space="preserve">አባሪ ሠ፦ የአገልግሎቶቹ ቅድሚያ (ለጥያቄ 22)</w:t>
+        <w:t xml:space="preserve">አባሪ መ፦ የአገልግሎቶቹ ቅድሚያ (ለጥያቄ 20)</w:t>
       </w:r>
     </w:p>
     <w:p>
@@ -29482,8 +27201,8 @@
       </w:r>
     </w:p>
     <w:sectPr>
-      <w:headerReference w:type="default" r:id="rId6"/>
-      <w:footerReference w:type="default" r:id="rId7"/>
+      <w:headerReference w:type="default" r:id="rId8"/>
+      <w:footerReference w:type="default" r:id="rId9"/>
       <w:pgSz w:w="11906" w:h="16838" w:orient="portrait"/>
       <w:pgMar w:top="1134" w:right="1134" w:bottom="1134" w:left="1134" w:header="708" w:footer="708" w:gutter="0"/>
       <w:pgNumType/>
@@ -29545,6 +27264,54 @@
 </w:ftr>
 </file>
 
+<file path=word/footer2.xml><?xml version="1.0" encoding="utf-8"?>
+<w:ftr xmlns:wpc="http://schemas.microsoft.com/office/word/2010/wordprocessingCanvas" xmlns:mc="http://schemas.openxmlformats.org/markup-compatibility/2006" xmlns:o="urn:schemas-microsoft-com:office:office" xmlns:r="http://schemas.openxmlformats.org/officeDocument/2006/relationships" xmlns:m="http://schemas.openxmlformats.org/officeDocument/2006/math" xmlns:v="urn:schemas-microsoft-com:vml" xmlns:wp14="http://schemas.microsoft.com/office/word/2010/wordprocessingDrawing" xmlns:wp="http://schemas.openxmlformats.org/drawingml/2006/wordprocessingDrawing" xmlns:w10="urn:schemas-microsoft-com:office:word" xmlns:w="http://schemas.openxmlformats.org/wordprocessingml/2006/main" xmlns:w14="http://schemas.microsoft.com/office/word/2010/wordml" xmlns:w15="http://schemas.microsoft.com/office/word/2012/wordml" xmlns:wpg="http://schemas.microsoft.com/office/word/2010/wordprocessingGroup" xmlns:wpi="http://schemas.microsoft.com/office/word/2010/wordprocessingInk" xmlns:wne="http://schemas.microsoft.com/office/word/2006/wordml" xmlns:wps="http://schemas.microsoft.com/office/word/2010/wordprocessingShape">
+  <w:p>
+    <w:pPr>
+      <w:jc w:val="center"/>
+    </w:pPr>
+    <w:r>
+      <w:rPr>
+        <w:rFonts w:ascii="Nyala" w:cs="Nyala" w:eastAsia="Nyala" w:hAnsi="Nyala"/>
+        <w:sz w:val="16"/>
+        <w:szCs w:val="16"/>
+      </w:rPr>
+      <w:t xml:space="preserve">ገጽ </w:t>
+    </w:r>
+    <w:r>
+      <w:rPr>
+        <w:rFonts w:ascii="Nyala" w:cs="Nyala" w:eastAsia="Nyala" w:hAnsi="Nyala"/>
+        <w:sz w:val="16"/>
+        <w:szCs w:val="16"/>
+      </w:rPr>
+      <w:fldChar w:fldCharType="begin"/>
+      <w:instrText xml:space="preserve">PAGE</w:instrText>
+      <w:fldChar w:fldCharType="separate"/>
+      <w:fldChar w:fldCharType="end"/>
+    </w:r>
+    <w:r>
+      <w:rPr>
+        <w:rFonts w:ascii="Nyala" w:cs="Nyala" w:eastAsia="Nyala" w:hAnsi="Nyala"/>
+        <w:sz w:val="16"/>
+        <w:szCs w:val="16"/>
+      </w:rPr>
+      <w:t xml:space="preserve"> ከ </w:t>
+    </w:r>
+    <w:r>
+      <w:rPr>
+        <w:rFonts w:ascii="Nyala" w:cs="Nyala" w:eastAsia="Nyala" w:hAnsi="Nyala"/>
+        <w:sz w:val="16"/>
+        <w:szCs w:val="16"/>
+      </w:rPr>
+      <w:fldChar w:fldCharType="begin"/>
+      <w:instrText xml:space="preserve">NUMPAGES</w:instrText>
+      <w:fldChar w:fldCharType="separate"/>
+      <w:fldChar w:fldCharType="end"/>
+    </w:r>
+  </w:p>
+</w:ftr>
+</file>
+
 <file path=word/footnotes.xml><?xml version="1.0" encoding="utf-8"?>
 <w:footnotes xmlns:wpc="http://schemas.microsoft.com/office/word/2010/wordprocessingCanvas" xmlns:mc="http://schemas.openxmlformats.org/markup-compatibility/2006" xmlns:o="urn:schemas-microsoft-com:office:office" xmlns:r="http://schemas.openxmlformats.org/officeDocument/2006/relationships" xmlns:m="http://schemas.openxmlformats.org/officeDocument/2006/math" xmlns:v="urn:schemas-microsoft-com:vml" xmlns:wp14="http://schemas.microsoft.com/office/word/2010/wordprocessingDrawing" xmlns:wp="http://schemas.openxmlformats.org/drawingml/2006/wordprocessingDrawing" xmlns:w10="urn:schemas-microsoft-com:office:word" xmlns:w="http://schemas.openxmlformats.org/wordprocessingml/2006/main" xmlns:w14="http://schemas.microsoft.com/office/word/2010/wordml" xmlns:w15="http://schemas.microsoft.com/office/word/2012/wordml" xmlns:wpg="http://schemas.microsoft.com/office/word/2010/wordprocessingGroup" xmlns:wpi="http://schemas.microsoft.com/office/word/2010/wordprocessingInk" xmlns:wne="http://schemas.microsoft.com/office/word/2006/wordml" xmlns:wps="http://schemas.microsoft.com/office/word/2010/wordprocessingShape" mc:Ignorable="w14 w15 wp14">
   <w:footnote w:type="separator" w:id="-1">
@@ -29586,8 +27353,100 @@
 <w:hdr xmlns:wpc="http://schemas.microsoft.com/office/word/2010/wordprocessingCanvas" xmlns:mc="http://schemas.openxmlformats.org/markup-compatibility/2006" xmlns:o="urn:schemas-microsoft-com:office:office" xmlns:r="http://schemas.openxmlformats.org/officeDocument/2006/relationships" xmlns:m="http://schemas.openxmlformats.org/officeDocument/2006/math" xmlns:v="urn:schemas-microsoft-com:vml" xmlns:wp14="http://schemas.microsoft.com/office/word/2010/wordprocessingDrawing" xmlns:wp="http://schemas.openxmlformats.org/drawingml/2006/wordprocessingDrawing" xmlns:w10="urn:schemas-microsoft-com:office:word" xmlns:w="http://schemas.openxmlformats.org/wordprocessingml/2006/main" xmlns:w14="http://schemas.microsoft.com/office/word/2010/wordml" xmlns:w15="http://schemas.microsoft.com/office/word/2012/wordml" xmlns:wpg="http://schemas.microsoft.com/office/word/2010/wordprocessingGroup" xmlns:wpi="http://schemas.microsoft.com/office/word/2010/wordprocessingInk" xmlns:wne="http://schemas.microsoft.com/office/word/2006/wordml" xmlns:wps="http://schemas.microsoft.com/office/word/2010/wordprocessingShape" xmlns:cx="http://schemas.microsoft.com/office/drawing/2014/chartex" xmlns:cx1="http://schemas.microsoft.com/office/drawing/2015/9/8/chartex" xmlns:cx2="http://schemas.microsoft.com/office/drawing/2015/10/21/chartex" xmlns:cx3="http://schemas.microsoft.com/office/drawing/2016/5/9/chartex" xmlns:cx4="http://schemas.microsoft.com/office/drawing/2016/5/10/chartex" xmlns:cx5="http://schemas.microsoft.com/office/drawing/2016/5/11/chartex" xmlns:cx6="http://schemas.microsoft.com/office/drawing/2016/5/12/chartex" xmlns:cx7="http://schemas.microsoft.com/office/drawing/2016/5/13/chartex" xmlns:cx8="http://schemas.microsoft.com/office/drawing/2016/5/14/chartex" xmlns:w16cid="http://schemas.microsoft.com/office/word/2016/wordml/cid" xmlns:w16se="http://schemas.microsoft.com/office/word/2015/wordml/symex">
   <w:p>
     <w:pPr>
-      <w:jc w:val="right"/>
+      <w:jc w:val="center"/>
     </w:pPr>
+    <w:r>
+      <w:drawing>
+        <wp:inline distT="0" distB="0" distL="0" distR="0">
+          <wp:extent cx="6096000" cy="2028825"/>
+          <wp:effectExtent t="0" r="0" b="0" l="0"/>
+          <wp:docPr id="1" name="" descr="" title=""/>
+          <wp:cNvGraphicFramePr>
+            <a:graphicFrameLocks xmlns:a="http://schemas.openxmlformats.org/drawingml/2006/main" noChangeAspect="1"/>
+          </wp:cNvGraphicFramePr>
+          <a:graphic xmlns:a="http://schemas.openxmlformats.org/drawingml/2006/main">
+            <a:graphicData uri="http://schemas.openxmlformats.org/drawingml/2006/picture">
+              <pic:pic xmlns:pic="http://schemas.openxmlformats.org/drawingml/2006/picture">
+                <pic:nvPicPr>
+                  <pic:cNvPr id="0" name="" descr=""/>
+                  <pic:cNvPicPr>
+                    <a:picLocks noChangeAspect="1" noChangeArrowheads="1"/>
+                  </pic:cNvPicPr>
+                </pic:nvPicPr>
+                <pic:blipFill>
+                  <a:blip r:embed="rId0" cstate="none"/>
+                  <a:srcRect/>
+                  <a:stretch>
+                    <a:fillRect/>
+                  </a:stretch>
+                </pic:blipFill>
+                <pic:spPr bwMode="auto">
+                  <a:xfrm>
+                    <a:off x="0" y="0"/>
+                    <a:ext cx="6096000" cy="2028825"/>
+                  </a:xfrm>
+                  <a:prstGeom prst="rect">
+                    <a:avLst/>
+                  </a:prstGeom>
+                </pic:spPr>
+              </pic:pic>
+            </a:graphicData>
+          </a:graphic>
+        </wp:inline>
+      </w:drawing>
+    </w:r>
+  </w:p>
+</w:hdr>
+</file>
+
+<file path=word/header2.xml><?xml version="1.0" encoding="utf-8"?>
+<w:hdr xmlns:wpc="http://schemas.microsoft.com/office/word/2010/wordprocessingCanvas" xmlns:mc="http://schemas.openxmlformats.org/markup-compatibility/2006" xmlns:o="urn:schemas-microsoft-com:office:office" xmlns:r="http://schemas.openxmlformats.org/officeDocument/2006/relationships" xmlns:m="http://schemas.openxmlformats.org/officeDocument/2006/math" xmlns:v="urn:schemas-microsoft-com:vml" xmlns:wp14="http://schemas.microsoft.com/office/word/2010/wordprocessingDrawing" xmlns:wp="http://schemas.openxmlformats.org/drawingml/2006/wordprocessingDrawing" xmlns:w10="urn:schemas-microsoft-com:office:word" xmlns:w="http://schemas.openxmlformats.org/wordprocessingml/2006/main" xmlns:w14="http://schemas.microsoft.com/office/word/2010/wordml" xmlns:w15="http://schemas.microsoft.com/office/word/2012/wordml" xmlns:wpg="http://schemas.microsoft.com/office/word/2010/wordprocessingGroup" xmlns:wpi="http://schemas.microsoft.com/office/word/2010/wordprocessingInk" xmlns:wne="http://schemas.microsoft.com/office/word/2006/wordml" xmlns:wps="http://schemas.microsoft.com/office/word/2010/wordprocessingShape" xmlns:cx="http://schemas.microsoft.com/office/drawing/2014/chartex" xmlns:cx1="http://schemas.microsoft.com/office/drawing/2015/9/8/chartex" xmlns:cx2="http://schemas.microsoft.com/office/drawing/2015/10/21/chartex" xmlns:cx3="http://schemas.microsoft.com/office/drawing/2016/5/9/chartex" xmlns:cx4="http://schemas.microsoft.com/office/drawing/2016/5/10/chartex" xmlns:cx5="http://schemas.microsoft.com/office/drawing/2016/5/11/chartex" xmlns:cx6="http://schemas.microsoft.com/office/drawing/2016/5/12/chartex" xmlns:cx7="http://schemas.microsoft.com/office/drawing/2016/5/13/chartex" xmlns:cx8="http://schemas.microsoft.com/office/drawing/2016/5/14/chartex" xmlns:w16cid="http://schemas.microsoft.com/office/word/2016/wordml/cid" xmlns:w16se="http://schemas.microsoft.com/office/word/2015/wordml/symex">
+  <w:p>
+    <w:pPr>
+      <w:pBdr>
+        <w:bottom w:val="single" w:color="8EA9C1" w:sz="4" w:space="4"/>
+      </w:pBdr>
+    </w:pPr>
+    <w:r>
+      <w:drawing>
+        <wp:inline distT="0" distB="0" distL="0" distR="0">
+          <wp:extent cx="419100" cy="228600"/>
+          <wp:effectExtent t="0" r="0" b="0" l="0"/>
+          <wp:docPr id="1" name="" descr="" title=""/>
+          <wp:cNvGraphicFramePr>
+            <a:graphicFrameLocks xmlns:a="http://schemas.openxmlformats.org/drawingml/2006/main" noChangeAspect="1"/>
+          </wp:cNvGraphicFramePr>
+          <a:graphic xmlns:a="http://schemas.openxmlformats.org/drawingml/2006/main">
+            <a:graphicData uri="http://schemas.openxmlformats.org/drawingml/2006/picture">
+              <pic:pic xmlns:pic="http://schemas.openxmlformats.org/drawingml/2006/picture">
+                <pic:nvPicPr>
+                  <pic:cNvPr id="0" name="" descr=""/>
+                  <pic:cNvPicPr>
+                    <a:picLocks noChangeAspect="1" noChangeArrowheads="1"/>
+                  </pic:cNvPicPr>
+                </pic:nvPicPr>
+                <pic:blipFill>
+                  <a:blip r:embed="rId0" cstate="none"/>
+                  <a:srcRect/>
+                  <a:stretch>
+                    <a:fillRect/>
+                  </a:stretch>
+                </pic:blipFill>
+                <pic:spPr bwMode="auto">
+                  <a:xfrm>
+                    <a:off x="0" y="0"/>
+                    <a:ext cx="419100" cy="228600"/>
+                  </a:xfrm>
+                  <a:prstGeom prst="rect">
+                    <a:avLst/>
+                  </a:prstGeom>
+                </pic:spPr>
+              </pic:pic>
+            </a:graphicData>
+          </a:graphic>
+        </wp:inline>
+      </w:drawing>
+    </w:r>
     <w:r>
       <w:rPr>
         <w:rFonts w:ascii="Nyala" w:cs="Nyala" w:eastAsia="Nyala" w:hAnsi="Nyala"/>
@@ -29595,7 +27454,7 @@
         <w:sz w:val="16"/>
         <w:szCs w:val="16"/>
       </w:rPr>
-      <w:t xml:space="preserve">ITRMS — ለወላይታ ዞን የቀረቡ የሥራ ጥያቄዎች (እትም 2.0) · ABA Nexus Technologies</w:t>
+      <w:t xml:space="preserve">   ITRMS — ለወላይታ ዞን የቀረቡ የሥራ ጥያቄዎች (እትም 2.0) · ABANEXUS SOFTWARE DEVELOPMENT PLC</w:t>
     </w:r>
   </w:p>
 </w:hdr>

</xml_diff>

<commit_message>
docs(business-questions): the first submission (version 1.0): no earlier version mentioned, no coordinator question
Co-Authored-By: Claude Opus 5.5 <noreply@anthropic.com>
Claude-Session: https://claude.ai/code/session_015s8K9PXZTrFfQKCLVZhoeJ
</commit_message>
<xml_diff>
--- a/docs/business-questions/ITRMS-business-questions-am.docx
+++ b/docs/business-questions/ITRMS-business-questions-am.docx
@@ -316,7 +316,7 @@
                 <w:b w:val="false"/>
                 <w:bCs w:val="false"/>
               </w:rPr>
-              <w:t xml:space="preserve">2.0 (እትም 1.0 ጥቅምት 8 ቀን 2019 ዓ.ም. የተዘጋጀውን ይተካል)</w:t>
+              <w:t xml:space="preserve">1.0</w:t>
             </w:r>
           </w:p>
         </w:tc>
@@ -507,7 +507,7 @@
         <w:rPr>
           <w:rFonts w:ascii="Nyala" w:cs="Nyala" w:eastAsia="Nyala" w:hAnsi="Nyala"/>
         </w:rPr>
-        <w:t xml:space="preserve">ሥርዓቱን መምሪያው በሚሠራበት ትክክለኛ አሠራር፣ ሕግና መመሪያ መሠረት ለማበልጸግ ከመምሪያው ሥራ ክፍሎች ማብራሪያ የሚያስፈልጋቸው ጥያቄዎች በዚህ ሰነድ ቀርበዋል። ጥያቄዎቹ በደብዳቤው የተዘረዘሩትን አገልግሎቶችና ባለድርሻ አካላት በሙሉ ይሸፍናሉ፤ ቀደም ሲል (ጥቅምት 8 ቀን 2019 ዓ.ም.) የቀረቡትን ጥያቄዎችም ያካትታሉ።</w:t>
+        <w:t xml:space="preserve">ሥርዓቱን መምሪያው በሚሠራበት ትክክለኛ አሠራር፣ ሕግና መመሪያ መሠረት ለማበልጸግ ከመምሪያው ሥራ ክፍሎች ማብራሪያ የሚያስፈልጋቸው ጥያቄዎች በዚህ ሰነድ ቀርበዋል። ጥያቄዎቹ በደብዳቤው የተዘረዘሩትን አገልግሎቶችና ባለድርሻ አካላት በሙሉ ይሸፍናሉ።</w:t>
       </w:r>
     </w:p>
     <w:p>
@@ -518,7 +518,7 @@
         <w:rPr>
           <w:rFonts w:ascii="Nyala" w:cs="Nyala" w:eastAsia="Nyala" w:hAnsi="Nyala"/>
         </w:rPr>
-        <w:t xml:space="preserve">በመሆኑም ጥያቄዎቹ ለሚመለከታቸው የሥራ ክፍሎች ተመርተው፣ ምላሹ ከተጠየቁት ቅጾችና ሰነዶች ጋር በሰነዱ ፊት ለፊት በተጠቀሰው ቀን እንዲላክልን በአክብሮት እንጠይቃለን። "ከፍተኛ" ቅድሚያ የተሰጣቸው ጥያቄዎች (በማጠቃለያ ሠንጠረዡ ይመልከቱ) ቀድመው ቢመለሱ የመጀመሪያው ማሳያ በጊዜ እንዲዘጋጅ ያግዛል። እንዲሁም ፕሮጀክቱን ከመምሪያው በኩል የሚያስተባብር ባለሙያ እንዲሰየምልን እንጠይቃለን (ጥያቄ 22)።</w:t>
+        <w:t xml:space="preserve">በመሆኑም ጥያቄዎቹ ለሚመለከታቸው የሥራ ክፍሎች ተመርተው፣ ምላሹ ከተጠየቁት ቅጾችና ሰነዶች ጋር በሰነዱ ፊት ለፊት በተጠቀሰው ቀን እንዲላክልን በአክብሮት እንጠይቃለን። "ከፍተኛ" ቅድሚያ የተሰጣቸው ጥያቄዎች (በማጠቃለያ ሠንጠረዡ ይመልከቱ) ቀድመው ቢመለሱ የመጀመሪያው ማሳያ በጊዜ እንዲዘጋጅ ያግዛል።</w:t>
       </w:r>
     </w:p>
     <w:p>
@@ -665,7 +665,7 @@
         <w:rPr>
           <w:rFonts w:ascii="Nyala" w:cs="Nyala" w:eastAsia="Nyala" w:hAnsi="Nyala"/>
         </w:rPr>
-        <w:t xml:space="preserve">ጥያቄ 1–10 ከእትም 1.0 የተወሰዱ ናቸው። ጥያቄ 11–24 በደብዳቤው የተዘረዘሩትን ሌሎች አገልግሎቶች (የተሽከርካሪ ምዝገባ፣ ቦሎ፣ የማሰልጠኛ ተቋማት ክትትል፣ የህዝብና የጭነት ትራንስፖርት፣ የትራፊክ ደህንነት፣ የመንገድ ግንባታ፣ ጥገና፣ ዲዛይንና ውል አስተዳደር) እና ባለድርሻ አካላትን እንዲሁም የፕሮጀክቱን አፈጻጸም ይሸፍናሉ።</w:t>
+        <w:t xml:space="preserve">ጥያቄ 1–10 አጠቃላይ አሠራሩን፣ ክፍያንና የመጀመሪያውን ማሳያ ይመለከታሉ። ጥያቄ 11–23 በደብዳቤው የተዘረዘሩትን ሌሎች አገልግሎቶች (የተሽከርካሪ ምዝገባ፣ ቦሎ፣ የማሰልጠኛ ተቋማት ክትትል፣ የህዝብና የጭነት ትራንስፖርት፣ የትራፊክ ደህንነት፣ የመንገድ ግንባታ፣ ጥገና፣ ዲዛይንና ውል አስተዳደር) እና ባለድርሻ አካላትን እንዲሁም የፕሮጀክቱን አፈጻጸም ይሸፍናሉ።</w:t>
       </w:r>
     </w:p>
     <w:p>
@@ -2737,7 +2737,7 @@
                 <w:b w:val="false"/>
                 <w:bCs w:val="false"/>
               </w:rPr>
-              <w:t xml:space="preserve">ተጠቃሚዎች፣ ሥልጠናና የፕሮጀክቱ አስተባባሪ</w:t>
+              <w:t xml:space="preserve">ሪፖርቶችና የአፈጻጸም መለኪያዎች</w:t>
             </w:r>
           </w:p>
         </w:tc>
@@ -2758,7 +2758,7 @@
                 <w:b w:val="false"/>
                 <w:bCs w:val="false"/>
               </w:rPr>
-              <w:t xml:space="preserve">ከፍተኛ</w:t>
+              <w:t xml:space="preserve">መካከለኛ</w:t>
             </w:r>
           </w:p>
         </w:tc>
@@ -2779,7 +2779,7 @@
                 <w:b w:val="false"/>
                 <w:bCs w:val="false"/>
               </w:rPr>
-              <w:t xml:space="preserve">የመምሪያው ኃላፊና የሰው ሀብት</w:t>
+              <w:t xml:space="preserve">የዕቅድና በጀት ዳይሬክቶሬት</w:t>
             </w:r>
           </w:p>
         </w:tc>
@@ -2803,92 +2803,6 @@
                 <w:bCs w:val="false"/>
               </w:rPr>
               <w:t xml:space="preserve">23</w:t>
-            </w:r>
-          </w:p>
-        </w:tc>
-        <w:tc>
-          <w:tcPr>
-            <w:tcW w:type="dxa" w:w="4100"/>
-            <w:tcMar>
-              <w:top w:type="dxa" w:w="60"/>
-              <w:left w:type="dxa" w:w="100"/>
-              <w:bottom w:type="dxa" w:w="60"/>
-              <w:right w:type="dxa" w:w="100"/>
-            </w:tcMar>
-          </w:tcPr>
-          <w:p>
-            <w:r>
-              <w:rPr>
-                <w:rFonts w:ascii="Nyala" w:cs="Nyala" w:eastAsia="Nyala" w:hAnsi="Nyala"/>
-                <w:b w:val="false"/>
-                <w:bCs w:val="false"/>
-              </w:rPr>
-              <w:t xml:space="preserve">ሪፖርቶችና የአፈጻጸም መለኪያዎች</w:t>
-            </w:r>
-          </w:p>
-        </w:tc>
-        <w:tc>
-          <w:tcPr>
-            <w:tcW w:type="dxa" w:w="1300"/>
-            <w:tcMar>
-              <w:top w:type="dxa" w:w="60"/>
-              <w:left w:type="dxa" w:w="100"/>
-              <w:bottom w:type="dxa" w:w="60"/>
-              <w:right w:type="dxa" w:w="100"/>
-            </w:tcMar>
-          </w:tcPr>
-          <w:p>
-            <w:r>
-              <w:rPr>
-                <w:rFonts w:ascii="Nyala" w:cs="Nyala" w:eastAsia="Nyala" w:hAnsi="Nyala"/>
-                <w:b w:val="false"/>
-                <w:bCs w:val="false"/>
-              </w:rPr>
-              <w:t xml:space="preserve">መካከለኛ</w:t>
-            </w:r>
-          </w:p>
-        </w:tc>
-        <w:tc>
-          <w:tcPr>
-            <w:tcW w:type="dxa" w:w="3538"/>
-            <w:tcMar>
-              <w:top w:type="dxa" w:w="60"/>
-              <w:left w:type="dxa" w:w="100"/>
-              <w:bottom w:type="dxa" w:w="60"/>
-              <w:right w:type="dxa" w:w="100"/>
-            </w:tcMar>
-          </w:tcPr>
-          <w:p>
-            <w:r>
-              <w:rPr>
-                <w:rFonts w:ascii="Nyala" w:cs="Nyala" w:eastAsia="Nyala" w:hAnsi="Nyala"/>
-                <w:b w:val="false"/>
-                <w:bCs w:val="false"/>
-              </w:rPr>
-              <w:t xml:space="preserve">የዕቅድና በጀት ዳይሬክቶሬት</w:t>
-            </w:r>
-          </w:p>
-        </w:tc>
-      </w:tr>
-      <w:tr>
-        <w:tc>
-          <w:tcPr>
-            <w:tcW w:type="dxa" w:w="700"/>
-            <w:tcMar>
-              <w:top w:type="dxa" w:w="60"/>
-              <w:left w:type="dxa" w:w="100"/>
-              <w:bottom w:type="dxa" w:w="60"/>
-              <w:right w:type="dxa" w:w="100"/>
-            </w:tcMar>
-          </w:tcPr>
-          <w:p>
-            <w:r>
-              <w:rPr>
-                <w:rFonts w:ascii="Nyala" w:cs="Nyala" w:eastAsia="Nyala" w:hAnsi="Nyala"/>
-                <w:b w:val="false"/>
-                <w:bCs w:val="false"/>
-              </w:rPr>
-              <w:t xml:space="preserve">24</w:t>
             </w:r>
           </w:p>
         </w:tc>
@@ -10273,7 +10187,7 @@
         <w:rPr>
           <w:rFonts w:ascii="Nyala" w:cs="Nyala" w:eastAsia="Nyala" w:hAnsi="Nyala"/>
         </w:rPr>
-        <w:t xml:space="preserve">ጥያቄ 22፦ ተጠቃሚዎች፣ ሥልጠናና የፕሮጀክቱ አስተባባሪ</w:t>
+        <w:t xml:space="preserve">ጥያቄ 22፦ ሪፖርቶችና የአፈጻጸም መለኪያዎች</w:t>
       </w:r>
     </w:p>
     <w:p>
@@ -10297,7 +10211,7 @@
         <w:rPr>
           <w:rFonts w:ascii="Nyala" w:cs="Nyala" w:eastAsia="Nyala" w:hAnsi="Nyala"/>
         </w:rPr>
-        <w:t xml:space="preserve">ከፍተኛ (ከማሳያው በፊት ያስፈልጋል)</w:t>
+        <w:t xml:space="preserve">መካከለኛ</w:t>
       </w:r>
     </w:p>
     <w:p>
@@ -10321,7 +10235,7 @@
         <w:rPr>
           <w:rFonts w:ascii="Nyala" w:cs="Nyala" w:eastAsia="Nyala" w:hAnsi="Nyala"/>
         </w:rPr>
-        <w:t xml:space="preserve">የመምሪያው ኃላፊና የሰው ሀብት</w:t>
+        <w:t xml:space="preserve">የዕቅድና በጀት ዳይሬክቶሬት</w:t>
       </w:r>
     </w:p>
     <w:p>
@@ -10347,7 +10261,7 @@
         <w:rPr>
           <w:rFonts w:ascii="Nyala" w:cs="Nyala" w:eastAsia="Nyala" w:hAnsi="Nyala"/>
         </w:rPr>
-        <w:t xml:space="preserve">ሥርዓቱን በጋራ ለማበልጸግ ከመምሪያው በኩል ጥያቄዎችን የሚያስተባብር፣ ውሳኔ የሚያስተላልፍና ማሳያዎችን የሚገመግም ተወካይ ያስፈልጋል። እንዲሁም የሥልጠናውና የተጠቃሚ መለያዎች ዕቅድ የተጠቃሚዎችን ብዛት ይፈልጋል።</w:t>
+        <w:t xml:space="preserve">ሥርዓቱ መረጃን በአንድ ቦታ ስለሚይዝ መምሪያው ለክልሉና ለባለድርሻዎች የሚልካቸውን ሪፖርቶች በራሱ ማዘጋጀት ይችላል። ለዚህ የሪፖርቶቹ ዝርዝርና ቅርጽ ያስፈልጋል።</w:t>
       </w:r>
     </w:p>
     <w:p>
@@ -10382,7 +10296,7 @@
         <w:rPr>
           <w:rFonts w:ascii="Nyala" w:cs="Nyala" w:eastAsia="Nyala" w:hAnsi="Nyala"/>
         </w:rPr>
-        <w:t xml:space="preserve">ፕሮጀክቱን ከመምሪያው በኩል የሚያስተባብር ባለሙያ (ስም፣ ኃላፊነት፣ ስልክ፣ ኢሜይል) ቢሰየምልን፤ የቴክኒክ ኮሚቴ የሚቋቋም ከሆነ አባላቱን ይጻፉ።</w:t>
+        <w:t xml:space="preserve">መምሪያው ለክልሉ ቢሮ የሚልካቸው ሪፖርቶች የትኞቹ ናቸው (ሳምንታዊ፣ ወርሃዊ፣ ሩብ ዓመታዊ፣ ዓመታዊ)? ቅጾቹን ያያይዙ።</w:t>
       </w:r>
     </w:p>
     <w:p>
@@ -10402,7 +10316,7 @@
         <w:rPr>
           <w:rFonts w:ascii="Nyala" w:cs="Nyala" w:eastAsia="Nyala" w:hAnsi="Nyala"/>
         </w:rPr>
-        <w:t xml:space="preserve">በእያንዳንዱ ጽ/ቤት ሥርዓቱን የሚጠቀሙ ሠራተኞች ብዛትና ኃላፊነታቸው በግምት ምንድን ነው?</w:t>
+        <w:t xml:space="preserve">መምሪያው የሚጠቀምባቸው የአፈጻጸም መለኪያዎች (ለምሳሌ በዕቅዱ ወይም በBSC) ምንድናቸው?</w:t>
       </w:r>
     </w:p>
     <w:p>
@@ -10422,7 +10336,7 @@
         <w:rPr>
           <w:rFonts w:ascii="Nyala" w:cs="Nyala" w:eastAsia="Nyala" w:hAnsi="Nyala"/>
         </w:rPr>
-        <w:t xml:space="preserve">የተጠቃሚ መለያዎችን (አካውንቶችን) በዞኑ የሚያስተዳድረው ማን ይሆናል?</w:t>
+        <w:t xml:space="preserve">ለመንገድ ፈንድ፣ ለኢንሹራንስ ፈንድ፣ ለፖሊስ ወይም ለሌሎች ባለድርሻዎች የሚላኩ ሪፖርቶች አሉ?</w:t>
       </w:r>
     </w:p>
     <w:p>
@@ -10442,27 +10356,7 @@
         <w:rPr>
           <w:rFonts w:ascii="Nyala" w:cs="Nyala" w:eastAsia="Nyala" w:hAnsi="Nyala"/>
         </w:rPr>
-        <w:t xml:space="preserve">ሥልጠና የት፣ መቼና ለስንት ሰው ቢሰጥ ይመረጣል?</w:t>
-      </w:r>
-    </w:p>
-    <w:p>
-      <w:pPr>
-        <w:spacing w:after="100" w:line="300"/>
-        <w:ind w:left="567" w:hanging="567"/>
-      </w:pPr>
-      <w:r>
-        <w:rPr>
-          <w:rFonts w:ascii="Nyala" w:cs="Nyala" w:eastAsia="Nyala" w:hAnsi="Nyala"/>
-          <w:b/>
-          <w:bCs/>
-        </w:rPr>
-        <w:t xml:space="preserve">22.5  </w:t>
-      </w:r>
-      <w:r>
-        <w:rPr>
-          <w:rFonts w:ascii="Nyala" w:cs="Nyala" w:eastAsia="Nyala" w:hAnsi="Nyala"/>
-        </w:rPr>
-        <w:t xml:space="preserve">የእያንዳንዱን ምዕራፍ ማሳያ ተቀብሎ የሚያጸድቀው (የሚፈርመው) ማን ነው?</w:t>
+        <w:t xml:space="preserve">የዞኑን አጠቃላይ አፈጻጸም የሚያሳይ ማሳያ ሰሌዳ (dashboard) ማን ማየት ይገባዋል? (የመምሪያው ኃላፊ፣ የክልሉ ቢሮ፣ የወረዳ ኃላፊዎች)</w:t>
       </w:r>
     </w:p>
     <w:tbl>
@@ -10579,7 +10473,7 @@
         <w:rPr>
           <w:rFonts w:ascii="Nyala" w:cs="Nyala" w:eastAsia="Nyala" w:hAnsi="Nyala"/>
         </w:rPr>
-        <w:t xml:space="preserve">ጥያቄ 23፦ ሪፖርቶችና የአፈጻጸም መለኪያዎች</w:t>
+        <w:t xml:space="preserve">ጥያቄ 23፦ ሕጋዊ ማዕቀፍ፣ ፈቃድና የመረጃ ማስቀመጫ</w:t>
       </w:r>
     </w:p>
     <w:p>
@@ -10627,7 +10521,7 @@
         <w:rPr>
           <w:rFonts w:ascii="Nyala" w:cs="Nyala" w:eastAsia="Nyala" w:hAnsi="Nyala"/>
         </w:rPr>
-        <w:t xml:space="preserve">የዕቅድና በጀት ዳይሬክቶሬት</w:t>
+        <w:t xml:space="preserve">የመምሪያው ኃላፊ (ከክልሉ ቢሮ ጋር)</w:t>
       </w:r>
     </w:p>
     <w:p>
@@ -10653,7 +10547,7 @@
         <w:rPr>
           <w:rFonts w:ascii="Nyala" w:cs="Nyala" w:eastAsia="Nyala" w:hAnsi="Nyala"/>
         </w:rPr>
-        <w:t xml:space="preserve">ሥርዓቱ መረጃን በአንድ ቦታ ስለሚይዝ መምሪያው ለክልሉና ለባለድርሻዎች የሚልካቸውን ሪፖርቶች በራሱ ማዘጋጀት ይችላል። ለዚህ የሪፖርቶቹ ዝርዝርና ቅርጽ ያስፈልጋል።</w:t>
+        <w:t xml:space="preserve">የግል መረጃ ጥበቃ አዋጅ ቁጥር 1321/2024 (እ.ኤ.አ.) የግል መረጃን በአግባቡ መያዝን ይጠይቃል፤ በኢትዮጵያ ውስጥ የተሰበሰበ የግል መረጃ በአገር ውስጥ እንዲቀመጥም ይጠበቃል። የወሳኝ መሠረተ ልማቶች የሳይበር ደህንነት አዋጅ ቁጥር 1426/2026 (እ.ኤ.አ.) የደህንነት ግዴታዎችን ያስቀምጣል። የኤሌክትሮኒክ ፊርማ አዋጅ ቁጥር 1072/2018 እና የኤሌክትሮኒክ ግብይት አዋጅ ቁጥር 1205/2020 ለኤሌክትሮኒክ ሰነዶች ሕጋዊ ዕውቅና ይሰጣሉ። ሥርዓቱ የሚያትማቸው ሰነዶች (መንጃ ፈቃድ ማመልከቻ፣ ደረሰኝ፣ ምስክር ወረቀት) በQR ኮድ ትክክለኛነታቸው ሊረጋገጥ ይችላል።</w:t>
       </w:r>
     </w:p>
     <w:p>
@@ -10688,7 +10582,7 @@
         <w:rPr>
           <w:rFonts w:ascii="Nyala" w:cs="Nyala" w:eastAsia="Nyala" w:hAnsi="Nyala"/>
         </w:rPr>
-        <w:t xml:space="preserve">መምሪያው ለክልሉ ቢሮ የሚልካቸው ሪፖርቶች የትኞቹ ናቸው (ሳምንታዊ፣ ወርሃዊ፣ ሩብ ዓመታዊ፣ ዓመታዊ)? ቅጾቹን ያያይዙ።</w:t>
+        <w:t xml:space="preserve">አዲስ የመንግሥት ሥርዓት ሥራ ላይ ከመዋሉ በፊት ከክልሉ ቢሮ፣ ከክልሉ የኢኖቬሽንና ቴክኖሎጂ ቢሮ ወይም ከኢንፎርሜሽን መረብ ደህንነት አስተዳደር (INSA) የሚያስፈልግ ፈቃድ ወይም የደህንነት ኦዲት አለ?</w:t>
       </w:r>
     </w:p>
     <w:p>
@@ -10708,7 +10602,7 @@
         <w:rPr>
           <w:rFonts w:ascii="Nyala" w:cs="Nyala" w:eastAsia="Nyala" w:hAnsi="Nyala"/>
         </w:rPr>
-        <w:t xml:space="preserve">መምሪያው የሚጠቀምባቸው የአፈጻጸም መለኪያዎች (ለምሳሌ በዕቅዱ ወይም በBSC) ምንድናቸው?</w:t>
+        <w:t xml:space="preserve">የሥርዓቱ አገልጋይ የት ቢቀመጥ ይመረጣል? (በዞኑ፣ በክልሉ የመረጃ ማዕከል፣ በአገር ውስጥ የመንግሥት ክላውድ)</w:t>
       </w:r>
     </w:p>
     <w:p>
@@ -10728,7 +10622,7 @@
         <w:rPr>
           <w:rFonts w:ascii="Nyala" w:cs="Nyala" w:eastAsia="Nyala" w:hAnsi="Nyala"/>
         </w:rPr>
-        <w:t xml:space="preserve">ለመንገድ ፈንድ፣ ለኢንሹራንስ ፈንድ፣ ለፖሊስ ወይም ለሌሎች ባለድርሻዎች የሚላኩ ሪፖርቶች አሉ?</w:t>
+        <w:t xml:space="preserve">የመረጃው ባለቤትነትና ምስጢራዊነትን በተመለከተ ስምምነት (ለምሳሌ የመግባቢያ ሰነድ) ያስፈልጋል?</w:t>
       </w:r>
     </w:p>
     <w:p>
@@ -10748,134 +10642,13 @@
         <w:rPr>
           <w:rFonts w:ascii="Nyala" w:cs="Nyala" w:eastAsia="Nyala" w:hAnsi="Nyala"/>
         </w:rPr>
-        <w:t xml:space="preserve">የዞኑን አጠቃላይ አፈጻጸም የሚያሳይ ማሳያ ሰሌዳ (dashboard) ማን ማየት ይገባዋል? (የመምሪያው ኃላፊ፣ የክልሉ ቢሮ፣ የወረዳ ኃላፊዎች)</w:t>
-      </w:r>
-    </w:p>
-    <w:tbl>
-      <w:tblPr>
-        <w:tblW w:type="dxa" w:w="9638"/>
-        <w:tblBorders>
-          <w:top w:val="single" w:color="auto" w:sz="4"/>
-          <w:left w:val="single" w:color="auto" w:sz="4"/>
-          <w:bottom w:val="single" w:color="auto" w:sz="4"/>
-          <w:right w:val="single" w:color="auto" w:sz="4"/>
-          <w:insideH w:val="single" w:color="auto" w:sz="4"/>
-          <w:insideV w:val="single" w:color="auto" w:sz="4"/>
-        </w:tblBorders>
-      </w:tblPr>
-      <w:tblGrid>
-        <w:gridCol w:w="9638"/>
-      </w:tblGrid>
-      <w:tr>
-        <w:tc>
-          <w:tcPr>
-            <w:tcW w:type="dxa" w:w="9638"/>
-            <w:tcBorders>
-              <w:top w:val="single" w:color="8EA9C1" w:sz="4"/>
-              <w:left w:val="single" w:color="8EA9C1" w:sz="4"/>
-              <w:bottom w:val="single" w:color="8EA9C1" w:sz="4"/>
-              <w:right w:val="single" w:color="8EA9C1" w:sz="4"/>
-            </w:tcBorders>
-            <w:shd w:fill="F2F2F2" w:color="auto" w:val="clear"/>
-            <w:tcMar>
-              <w:top w:type="dxa" w:w="100"/>
-              <w:left w:type="dxa" w:w="140"/>
-              <w:bottom w:type="dxa" w:w="100"/>
-              <w:right w:type="dxa" w:w="140"/>
-            </w:tcMar>
-          </w:tcPr>
-          <w:p>
-            <w:pPr>
-              <w:spacing w:after="60"/>
-            </w:pPr>
-            <w:r>
-              <w:rPr>
-                <w:rFonts w:ascii="Nyala" w:cs="Nyala" w:eastAsia="Nyala" w:hAnsi="Nyala"/>
-                <w:b/>
-                <w:bCs/>
-                <w:color w:val="1F3864"/>
-              </w:rPr>
-              <w:t xml:space="preserve">ምላሽ፦</w:t>
-            </w:r>
-          </w:p>
-          <w:p>
-            <w:pPr>
-              <w:spacing w:after="160"/>
-            </w:pPr>
-            <w:r>
-              <w:rPr>
-                <w:rFonts w:ascii="Nyala" w:cs="Nyala" w:eastAsia="Nyala" w:hAnsi="Nyala"/>
-              </w:rPr>
-              <w:t xml:space="preserve"/>
-            </w:r>
-          </w:p>
-          <w:p>
-            <w:pPr>
-              <w:spacing w:after="160"/>
-            </w:pPr>
-            <w:r>
-              <w:rPr>
-                <w:rFonts w:ascii="Nyala" w:cs="Nyala" w:eastAsia="Nyala" w:hAnsi="Nyala"/>
-              </w:rPr>
-              <w:t xml:space="preserve"/>
-            </w:r>
-          </w:p>
-          <w:p>
-            <w:pPr>
-              <w:spacing w:after="160"/>
-            </w:pPr>
-            <w:r>
-              <w:rPr>
-                <w:rFonts w:ascii="Nyala" w:cs="Nyala" w:eastAsia="Nyala" w:hAnsi="Nyala"/>
-              </w:rPr>
-              <w:t xml:space="preserve"/>
-            </w:r>
-          </w:p>
-          <w:p>
-            <w:pPr>
-              <w:spacing w:after="160"/>
-            </w:pPr>
-            <w:r>
-              <w:rPr>
-                <w:rFonts w:ascii="Nyala" w:cs="Nyala" w:eastAsia="Nyala" w:hAnsi="Nyala"/>
-              </w:rPr>
-              <w:t xml:space="preserve"/>
-            </w:r>
-          </w:p>
-          <w:p>
-            <w:pPr>
-              <w:spacing w:after="160"/>
-            </w:pPr>
-            <w:r>
-              <w:rPr>
-                <w:rFonts w:ascii="Nyala" w:cs="Nyala" w:eastAsia="Nyala" w:hAnsi="Nyala"/>
-              </w:rPr>
-              <w:t xml:space="preserve"/>
-            </w:r>
-          </w:p>
-        </w:tc>
-      </w:tr>
-    </w:tbl>
-    <w:p>
-      <w:pPr>
-        <w:pStyle w:val="Heading2"/>
-        <w:keepNext/>
-      </w:pPr>
-      <w:r>
-        <w:rPr>
-          <w:rFonts w:ascii="Nyala" w:cs="Nyala" w:eastAsia="Nyala" w:hAnsi="Nyala"/>
-        </w:rPr>
-        <w:t xml:space="preserve">ጥያቄ 24፦ ሕጋዊ ማዕቀፍ፣ ፈቃድና የመረጃ ማስቀመጫ</w:t>
-      </w:r>
-    </w:p>
-    <w:p>
-      <w:pPr>
-        <w:keepNext/>
-        <w:pBdr>
-          <w:left w:val="single" w:color="1F3864" w:sz="18" w:space="6"/>
-        </w:pBdr>
-        <w:shd w:fill="EAF1FB" w:color="auto" w:val="clear"/>
-        <w:spacing w:after="0"/>
+        <w:t xml:space="preserve">በሥርዓቱ የሚታተሙ፣ በQR ኮድና በኤሌክትሮኒክ ፊርማ የሚረጋገጡ ሰነዶች ተቀባይነት ይኖራቸዋል? ወይስ እያንዳንዱ ሰነድ የእጅ ፊርማና ማኅተም ያስፈልገዋል?</w:t>
+      </w:r>
+    </w:p>
+    <w:p>
+      <w:pPr>
+        <w:spacing w:after="100" w:line="300"/>
+        <w:ind w:left="567" w:hanging="567"/>
       </w:pPr>
       <w:r>
         <w:rPr>
@@ -10883,172 +10656,7 @@
           <w:b/>
           <w:bCs/>
         </w:rPr>
-        <w:t xml:space="preserve">ቅድሚያ፦ </w:t>
-      </w:r>
-      <w:r>
-        <w:rPr>
-          <w:rFonts w:ascii="Nyala" w:cs="Nyala" w:eastAsia="Nyala" w:hAnsi="Nyala"/>
-        </w:rPr>
-        <w:t xml:space="preserve">መካከለኛ</w:t>
-      </w:r>
-    </w:p>
-    <w:p>
-      <w:pPr>
-        <w:keepNext/>
-        <w:pBdr>
-          <w:left w:val="single" w:color="1F3864" w:sz="18" w:space="6"/>
-        </w:pBdr>
-        <w:shd w:fill="EAF1FB" w:color="auto" w:val="clear"/>
-        <w:spacing w:after="160"/>
-      </w:pPr>
-      <w:r>
-        <w:rPr>
-          <w:rFonts w:ascii="Nyala" w:cs="Nyala" w:eastAsia="Nyala" w:hAnsi="Nyala"/>
-          <w:b/>
-          <w:bCs/>
-        </w:rPr>
-        <w:t xml:space="preserve">ምላሽ የሚሰጠው፦ </w:t>
-      </w:r>
-      <w:r>
-        <w:rPr>
-          <w:rFonts w:ascii="Nyala" w:cs="Nyala" w:eastAsia="Nyala" w:hAnsi="Nyala"/>
-        </w:rPr>
-        <w:t xml:space="preserve">የመምሪያው ኃላፊ (ከክልሉ ቢሮ ጋር)</w:t>
-      </w:r>
-    </w:p>
-    <w:p>
-      <w:pPr>
-        <w:keepNext/>
-        <w:spacing w:before="120" w:after="60"/>
-      </w:pPr>
-      <w:r>
-        <w:rPr>
-          <w:rFonts w:ascii="Nyala" w:cs="Nyala" w:eastAsia="Nyala" w:hAnsi="Nyala"/>
-          <w:b/>
-          <w:bCs/>
-          <w:color w:val="1F3864"/>
-        </w:rPr>
-        <w:t xml:space="preserve">ዳራ</w:t>
-      </w:r>
-    </w:p>
-    <w:p>
-      <w:pPr>
-        <w:spacing w:after="120" w:line="300"/>
-      </w:pPr>
-      <w:r>
-        <w:rPr>
-          <w:rFonts w:ascii="Nyala" w:cs="Nyala" w:eastAsia="Nyala" w:hAnsi="Nyala"/>
-        </w:rPr>
-        <w:t xml:space="preserve">የግል መረጃ ጥበቃ አዋጅ ቁጥር 1321/2024 (እ.ኤ.አ.) የግል መረጃን በአግባቡ መያዝን ይጠይቃል፤ በኢትዮጵያ ውስጥ የተሰበሰበ የግል መረጃ በአገር ውስጥ እንዲቀመጥም ይጠበቃል። የወሳኝ መሠረተ ልማቶች የሳይበር ደህንነት አዋጅ ቁጥር 1426/2026 (እ.ኤ.አ.) የደህንነት ግዴታዎችን ያስቀምጣል። የኤሌክትሮኒክ ፊርማ አዋጅ ቁጥር 1072/2018 እና የኤሌክትሮኒክ ግብይት አዋጅ ቁጥር 1205/2020 ለኤሌክትሮኒክ ሰነዶች ሕጋዊ ዕውቅና ይሰጣሉ። ሥርዓቱ የሚያትማቸው ሰነዶች (መንጃ ፈቃድ ማመልከቻ፣ ደረሰኝ፣ ምስክር ወረቀት) በQR ኮድ ትክክለኛነታቸው ሊረጋገጥ ይችላል።</w:t>
-      </w:r>
-    </w:p>
-    <w:p>
-      <w:pPr>
-        <w:keepNext/>
-        <w:spacing w:before="120" w:after="60"/>
-      </w:pPr>
-      <w:r>
-        <w:rPr>
-          <w:rFonts w:ascii="Nyala" w:cs="Nyala" w:eastAsia="Nyala" w:hAnsi="Nyala"/>
-          <w:b/>
-          <w:bCs/>
-          <w:color w:val="1F3864"/>
-        </w:rPr>
-        <w:t xml:space="preserve">ጥያቄዎች</w:t>
-      </w:r>
-    </w:p>
-    <w:p>
-      <w:pPr>
-        <w:spacing w:after="100" w:line="300"/>
-        <w:ind w:left="567" w:hanging="567"/>
-      </w:pPr>
-      <w:r>
-        <w:rPr>
-          <w:rFonts w:ascii="Nyala" w:cs="Nyala" w:eastAsia="Nyala" w:hAnsi="Nyala"/>
-          <w:b/>
-          <w:bCs/>
-        </w:rPr>
-        <w:t xml:space="preserve">24.1  </w:t>
-      </w:r>
-      <w:r>
-        <w:rPr>
-          <w:rFonts w:ascii="Nyala" w:cs="Nyala" w:eastAsia="Nyala" w:hAnsi="Nyala"/>
-        </w:rPr>
-        <w:t xml:space="preserve">አዲስ የመንግሥት ሥርዓት ሥራ ላይ ከመዋሉ በፊት ከክልሉ ቢሮ፣ ከክልሉ የኢኖቬሽንና ቴክኖሎጂ ቢሮ ወይም ከኢንፎርሜሽን መረብ ደህንነት አስተዳደር (INSA) የሚያስፈልግ ፈቃድ ወይም የደህንነት ኦዲት አለ?</w:t>
-      </w:r>
-    </w:p>
-    <w:p>
-      <w:pPr>
-        <w:spacing w:after="100" w:line="300"/>
-        <w:ind w:left="567" w:hanging="567"/>
-      </w:pPr>
-      <w:r>
-        <w:rPr>
-          <w:rFonts w:ascii="Nyala" w:cs="Nyala" w:eastAsia="Nyala" w:hAnsi="Nyala"/>
-          <w:b/>
-          <w:bCs/>
-        </w:rPr>
-        <w:t xml:space="preserve">24.2  </w:t>
-      </w:r>
-      <w:r>
-        <w:rPr>
-          <w:rFonts w:ascii="Nyala" w:cs="Nyala" w:eastAsia="Nyala" w:hAnsi="Nyala"/>
-        </w:rPr>
-        <w:t xml:space="preserve">የሥርዓቱ አገልጋይ የት ቢቀመጥ ይመረጣል? (በዞኑ፣ በክልሉ የመረጃ ማዕከል፣ በአገር ውስጥ የመንግሥት ክላውድ)</w:t>
-      </w:r>
-    </w:p>
-    <w:p>
-      <w:pPr>
-        <w:spacing w:after="100" w:line="300"/>
-        <w:ind w:left="567" w:hanging="567"/>
-      </w:pPr>
-      <w:r>
-        <w:rPr>
-          <w:rFonts w:ascii="Nyala" w:cs="Nyala" w:eastAsia="Nyala" w:hAnsi="Nyala"/>
-          <w:b/>
-          <w:bCs/>
-        </w:rPr>
-        <w:t xml:space="preserve">24.3  </w:t>
-      </w:r>
-      <w:r>
-        <w:rPr>
-          <w:rFonts w:ascii="Nyala" w:cs="Nyala" w:eastAsia="Nyala" w:hAnsi="Nyala"/>
-        </w:rPr>
-        <w:t xml:space="preserve">የመረጃው ባለቤትነትና ምስጢራዊነትን በተመለከተ ስምምነት (ለምሳሌ የመግባቢያ ሰነድ) ያስፈልጋል?</w:t>
-      </w:r>
-    </w:p>
-    <w:p>
-      <w:pPr>
-        <w:spacing w:after="100" w:line="300"/>
-        <w:ind w:left="567" w:hanging="567"/>
-      </w:pPr>
-      <w:r>
-        <w:rPr>
-          <w:rFonts w:ascii="Nyala" w:cs="Nyala" w:eastAsia="Nyala" w:hAnsi="Nyala"/>
-          <w:b/>
-          <w:bCs/>
-        </w:rPr>
-        <w:t xml:space="preserve">24.4  </w:t>
-      </w:r>
-      <w:r>
-        <w:rPr>
-          <w:rFonts w:ascii="Nyala" w:cs="Nyala" w:eastAsia="Nyala" w:hAnsi="Nyala"/>
-        </w:rPr>
-        <w:t xml:space="preserve">በሥርዓቱ የሚታተሙ፣ በQR ኮድና በኤሌክትሮኒክ ፊርማ የሚረጋገጡ ሰነዶች ተቀባይነት ይኖራቸዋል? ወይስ እያንዳንዱ ሰነድ የእጅ ፊርማና ማኅተም ያስፈልገዋል?</w:t>
-      </w:r>
-    </w:p>
-    <w:p>
-      <w:pPr>
-        <w:spacing w:after="100" w:line="300"/>
-        <w:ind w:left="567" w:hanging="567"/>
-      </w:pPr>
-      <w:r>
-        <w:rPr>
-          <w:rFonts w:ascii="Nyala" w:cs="Nyala" w:eastAsia="Nyala" w:hAnsi="Nyala"/>
-          <w:b/>
-          <w:bCs/>
-        </w:rPr>
-        <w:t xml:space="preserve">24.5  </w:t>
+        <w:t xml:space="preserve">23.5  </w:t>
       </w:r>
       <w:r>
         <w:rPr>
@@ -27454,7 +27062,7 @@
         <w:sz w:val="16"/>
         <w:szCs w:val="16"/>
       </w:rPr>
-      <w:t xml:space="preserve">   ITRMS — ለወላይታ ዞን የቀረቡ የሥራ ጥያቄዎች (እትም 2.0) · ABANEXUS SOFTWARE DEVELOPMENT PLC</w:t>
+      <w:t xml:space="preserve">   ITRMS — ለወላይታ ዞን የቀረቡ የሥራ ጥያቄዎች (እትም 1.0) · ABANEXUS SOFTWARE DEVELOPMENT PLC</w:t>
     </w:r>
   </w:p>
 </w:hdr>

</xml_diff>